<commit_message>
added side bar to flyer
</commit_message>
<xml_diff>
--- a/flyers/Flyer.docx
+++ b/flyers/Flyer.docx
@@ -4,7 +4,7 @@
   <w:body>
     <w:tbl>
       <w:tblPr>
-        <w:tblStyle w:val="698"/>
+        <w:tblStyle w:val="749"/>
         <w:tblW w:w="0" w:type="auto"/>
         <w:tblBorders/>
         <w:tblLook w:val="04A0" w:firstRow="1" w:lastRow="0" w:firstColumn="1" w:lastColumn="0" w:noHBand="0" w:noVBand="1"/>
@@ -32,7 +32,7 @@
           </w:tcPr>
           <w:p>
             <w:pPr>
-              <w:pStyle w:val="668"/>
+              <w:pStyle w:val="719"/>
               <w:pBdr/>
               <w:spacing/>
               <w:ind/>
@@ -41,6 +41,10 @@
                 <w14:ligatures w14:val="none"/>
               </w:rPr>
             </w:pPr>
+            <w:r/>
+            <w:r/>
+            <w:r/>
+            <w:r/>
             <w:r>
               <w:t xml:space="preserve">Interaktive Karte</w:t>
             </w:r>
@@ -82,7 +86,7 @@
           </w:tcPr>
           <w:p>
             <w:pPr>
-              <w:pStyle w:val="668"/>
+              <w:pStyle w:val="719"/>
               <w:pBdr/>
               <w:spacing/>
               <w:ind/>
@@ -120,7 +124,7 @@
           </w:tcPr>
           <w:p>
             <w:pPr>
-              <w:pStyle w:val="668"/>
+              <w:pStyle w:val="719"/>
               <w:pBdr/>
               <w:spacing/>
               <w:ind/>
@@ -163,7 +167,7 @@
           </w:tcPr>
           <w:p>
             <w:pPr>
-              <w:pStyle w:val="668"/>
+              <w:pStyle w:val="719"/>
               <w:pBdr/>
               <w:spacing/>
               <w:ind/>
@@ -185,12 +189,6 @@
             </w:pPr>
             <w:r>
               <w:t xml:space="preserve">Der News-Feed listet alle Neuigkeiten und Events, die relevant für dich sind! Sei es Veranstaltungen in der Mühle, in den naheliegenden Orten oder Informationen bezüglich dem Mühlenmarkt, falls er mal außerhalb der normalen Zeiten zu hat.</w:t>
-            </w:r>
-            <w:r/>
-            <w:r>
-              <w:rPr>
-                <w:highlight w:val="none"/>
-              </w:rPr>
             </w:r>
             <w:r>
               <w:rPr>
@@ -234,6 +232,7 @@
                 <w:highlight w:val="none"/>
               </w:rPr>
             </w:r>
+            <w:r/>
           </w:p>
           <w:p>
             <w:pPr>
@@ -252,7 +251,7 @@
                     <wp:inline xmlns:wp="http://schemas.openxmlformats.org/drawingml/2006/wordprocessingDrawing" distT="0" distB="0" distL="0" distR="0">
                       <wp:extent cx="1831494" cy="1831494"/>
                       <wp:effectExtent l="0" t="0" r="0" b="0"/>
-                      <wp:docPr id="2" name=""/>
+                      <wp:docPr id="3" name=""/>
                       <wp:cNvGraphicFramePr>
                         <a:graphicFrameLocks xmlns:a="http://schemas.openxmlformats.org/drawingml/2006/main" noChangeAspect="1"/>
                       </wp:cNvGraphicFramePr>
@@ -306,7 +305,7 @@
                       <v:path o:extrusionok="f" gradientshapeok="t" o:connecttype="rect"/>
                       <o:lock v:ext="edit" aspectratio="t"/>
                     </v:shapetype>
-                    <v:shape id="_x0000_i1" o:spid="_x0000_s1" type="#_x0000_t75" style="width:144.21pt;height:144.21pt;mso-wrap-distance-left:0.00pt;mso-wrap-distance-top:0.00pt;mso-wrap-distance-right:0.00pt;mso-wrap-distance-bottom:0.00pt;z-index:1;" stroked="false">
+                    <v:shape id="_x0000_i2" o:spid="_x0000_s2" type="#_x0000_t75" style="width:144.21pt;height:144.21pt;mso-wrap-distance-left:0.00pt;mso-wrap-distance-top:0.00pt;mso-wrap-distance-right:0.00pt;mso-wrap-distance-bottom:0.00pt;z-index:1;" stroked="false">
                       <v:imagedata r:id="rId11" o:title=""/>
                       <o:lock v:ext="edit" rotation="t"/>
                     </v:shape>
@@ -314,7 +313,11 @@
                 </mc:Fallback>
               </mc:AlternateContent>
             </w:r>
-            <w:r/>
+            <w:r>
+              <w:rPr>
+                <w:highlight w:val="none"/>
+              </w:rPr>
+            </w:r>
           </w:p>
         </w:tc>
         <w:tc>
@@ -331,7 +334,7 @@
           </w:tcPr>
           <w:p>
             <w:pPr>
-              <w:pStyle w:val="668"/>
+              <w:pStyle w:val="719"/>
               <w:pBdr/>
               <w:spacing/>
               <w:ind/>
@@ -359,7 +362,7 @@
     </w:tbl>
     <w:tbl>
       <w:tblPr>
-        <w:tblStyle w:val="698"/>
+        <w:tblStyle w:val="749"/>
         <w:tblW w:w="0" w:type="auto"/>
         <w:tblBorders/>
         <w:tblLook w:val="04A0" w:firstRow="1" w:lastRow="0" w:firstColumn="1" w:lastColumn="0" w:noHBand="0" w:noVBand="1"/>
@@ -385,7 +388,7 @@
           </w:tcPr>
           <w:p>
             <w:pPr>
-              <w:pStyle w:val="845"/>
+              <w:pStyle w:val="896"/>
               <w:pBdr/>
               <w:spacing/>
               <w:ind/>
@@ -395,6 +398,12 @@
                 <w:highlight w:val="black"/>
               </w:rPr>
             </w:pPr>
+            <w:r>
+              <w:rPr>
+                <w:color w:val="ffffff" w:themeColor="background1"/>
+                <w:highlight w:val="black"/>
+              </w:rPr>
+            </w:r>
             <w:r>
               <w:rPr>
                 <w:color w:val="ffffff" w:themeColor="background1"/>
@@ -423,7 +432,7 @@
           </w:tcPr>
           <w:p>
             <w:pPr>
-              <w:pStyle w:val="845"/>
+              <w:pStyle w:val="896"/>
               <w:pBdr/>
               <w:shd w:val="clear" w:color="000000" w:themeColor="text1" w:fill="000000" w:themeFill="text1"/>
               <w:spacing/>
@@ -480,7 +489,7 @@
           </w:tcPr>
           <w:p>
             <w:pPr>
-              <w:pStyle w:val="845"/>
+              <w:pStyle w:val="896"/>
               <w:pBdr/>
               <w:spacing/>
               <w:ind/>
@@ -502,13 +511,19 @@
                 <w:highlight w:val="black"/>
               </w:rPr>
             </w:r>
+            <w:r>
+              <w:rPr>
+                <w:color w:val="ffffff" w:themeColor="background1"/>
+                <w:highlight w:val="black"/>
+              </w:rPr>
+            </w:r>
           </w:p>
         </w:tc>
       </w:tr>
     </w:tbl>
     <w:p>
       <w:pPr>
-        <w:pStyle w:val="845"/>
+        <w:pStyle w:val="896"/>
         <w:pBdr/>
         <w:shd w:val="clear" w:color="auto" w:fill="auto"/>
         <w:spacing/>
@@ -524,13 +539,6 @@
           <w:highlight w:val="black"/>
         </w:rPr>
       </w:pPr>
-      <w:r>
-        <w:rPr>
-          <w:color w:val="ffffff" w:themeColor="background1"/>
-          <w:highlight w:val="black"/>
-        </w:rPr>
-      </w:r>
-      <w:r/>
       <w:r>
         <w:rPr>
           <w:color w:val="ffffff" w:themeColor="background1"/>
@@ -548,10 +556,21 @@
           <w:highlight w:val="black"/>
         </w:rPr>
       </w:r>
+      <w:r>
+        <w:rPr>
+          <w:rFonts w:ascii="Fira Code" w:hAnsi="Fira Code" w:cs="Fira Code"/>
+          <w:b/>
+          <w:bCs/>
+          <w:color w:val="ffffff" w:themeColor="background1"/>
+          <w:sz w:val="40"/>
+          <w:szCs w:val="40"/>
+          <w:highlight w:val="black"/>
+        </w:rPr>
+      </w:r>
     </w:p>
     <w:tbl>
       <w:tblPr>
-        <w:tblStyle w:val="698"/>
+        <w:tblStyle w:val="749"/>
         <w:tblW w:w="0" w:type="auto"/>
         <w:tblBorders/>
         <w:tblLook w:val="04A0" w:firstRow="1" w:lastRow="0" w:firstColumn="1" w:lastColumn="0" w:noHBand="0" w:noVBand="1"/>
@@ -576,7 +595,7 @@
           </w:tcPr>
           <w:p>
             <w:pPr>
-              <w:pStyle w:val="668"/>
+              <w:pStyle w:val="719"/>
               <w:pBdr/>
               <w:spacing/>
               <w:ind/>
@@ -598,12 +617,6 @@
             </w:pPr>
             <w:r>
               <w:t xml:space="preserve">Diese Website soll eine Ergänzung oder Alternative der offiziellen herzogsägmühler Website für Rehabilitanden sein.</w:t>
-            </w:r>
-            <w:r/>
-            <w:r>
-              <w:rPr>
-                <w:highlight w:val="none"/>
-              </w:rPr>
             </w:r>
             <w:r>
               <w:rPr>
@@ -635,6 +648,11 @@
                 <w:highlight w:val="none"/>
               </w:rPr>
             </w:r>
+            <w:r>
+              <w:rPr>
+                <w:highlight w:val="none"/>
+              </w:rPr>
+            </w:r>
           </w:p>
           <w:p>
             <w:pPr>
@@ -650,6 +668,11 @@
                 <w:highlight w:val="none"/>
               </w:rPr>
               <w:t xml:space="preserve">Ebenfalls ist die Geschwindigkeit und „Leichtigkeit“ der Seite ein primärer Faktor. Da die offizielle Seite mit sehr viel JavaScript beladen ist, lädt sie langsamer auf älteren Geräten und auf Geräten mit schlechter Internetverbindung.</w:t>
+            </w:r>
+            <w:r>
+              <w:rPr>
+                <w:highlight w:val="none"/>
+              </w:rPr>
             </w:r>
             <w:r>
               <w:rPr>
@@ -672,7 +695,7 @@
           </w:tcPr>
           <w:p>
             <w:pPr>
-              <w:pStyle w:val="668"/>
+              <w:pStyle w:val="719"/>
               <w:pBdr/>
               <w:spacing/>
               <w:ind/>
@@ -695,12 +718,6 @@
             <w:r>
               <w:t xml:space="preserve">Dieses Projekt ist von Rehabilitanden geleitet und daher ist jede Hilfeleistung erwünscht! Sei es Feedback, Ergänzung von Infos, Neuigkeiten für den News-Feed, selbst-geschossene Bilder, Programmierung, etc.</w:t>
             </w:r>
-            <w:r/>
-            <w:r>
-              <w:rPr>
-                <w:highlight w:val="none"/>
-              </w:rPr>
-            </w:r>
             <w:r>
               <w:rPr>
                 <w:highlight w:val="none"/>
@@ -721,6 +738,11 @@
                 <w:highlight w:val="none"/>
               </w:rPr>
             </w:pPr>
+            <w:r>
+              <w:rPr>
+                <w:highlight w:val="none"/>
+              </w:rPr>
+            </w:r>
             <w:r>
               <w:rPr>
                 <w:highlight w:val="none"/>
@@ -766,10 +788,19 @@
                 <w:u w:val="none"/>
               </w:rPr>
             </w:r>
+            <w:r>
+              <w:rPr>
+                <w:b w:val="0"/>
+                <w:bCs w:val="0"/>
+                <w:i w:val="0"/>
+                <w:highlight w:val="none"/>
+                <w:u w:val="none"/>
+              </w:rPr>
+            </w:r>
           </w:p>
           <w:p>
             <w:pPr>
-              <w:pStyle w:val="846"/>
+              <w:pStyle w:val="897"/>
               <w:numPr>
                 <w:ilvl w:val="0"/>
                 <w:numId w:val="1"/>
@@ -807,10 +838,20 @@
                 <w:highlight w:val="none"/>
               </w:rPr>
             </w:r>
+            <w:r>
+              <w:rPr>
+                <w:rFonts w:ascii="Fira Code" w:hAnsi="Fira Code" w:cs="Fira Code"/>
+                <w:b/>
+                <w:bCs/>
+                <w:sz w:val="16"/>
+                <w:szCs w:val="16"/>
+                <w:highlight w:val="none"/>
+              </w:rPr>
+            </w:r>
           </w:p>
           <w:p>
             <w:pPr>
-              <w:pStyle w:val="846"/>
+              <w:pStyle w:val="897"/>
               <w:numPr>
                 <w:ilvl w:val="0"/>
                 <w:numId w:val="2"/>
@@ -850,7 +891,7 @@
             </w:r>
             <w:r>
               <w:rPr>
-                <w:rFonts w:ascii="Fira Code" w:hAnsi="Fira Code" w:eastAsia="Fira Code" w:cs="Fira Code"/>
+                <w:rFonts w:ascii="Fira Code" w:hAnsi="Fira Code" w:cs="Fira Code"/>
                 <w:b/>
                 <w:bCs/>
                 <w:sz w:val="16"/>
@@ -868,6 +909,11 @@
                 <w:highlight w:val="none"/>
               </w:rPr>
             </w:pPr>
+            <w:r>
+              <w:rPr>
+                <w:highlight w:val="none"/>
+              </w:rPr>
+            </w:r>
             <w:r>
               <w:rPr>
                 <w:highlight w:val="none"/>
@@ -896,11 +942,6 @@
             </w:r>
             <w:r>
               <w:rPr>
-                <w:rFonts w:ascii="Fira Code" w:hAnsi="Fira Code" w:eastAsia="Fira Code" w:cs="Fira Code"/>
-                <w:b/>
-                <w:bCs/>
-                <w:sz w:val="16"/>
-                <w:szCs w:val="16"/>
                 <w:highlight w:val="none"/>
               </w:rPr>
             </w:r>
@@ -915,7 +956,7 @@
     </w:tbl>
     <w:p>
       <w:pPr>
-        <w:pStyle w:val="668"/>
+        <w:pStyle w:val="719"/>
         <w:pBdr/>
         <w:spacing/>
         <w:ind/>
@@ -926,6 +967,13 @@
           <w14:ligatures w14:val="none"/>
         </w:rPr>
       </w:pPr>
+      <w:r>
+        <w:rPr>
+          <w:sz w:val="22"/>
+          <w:szCs w:val="22"/>
+          <w14:ligatures w14:val="none"/>
+        </w:rPr>
+      </w:r>
       <w:r>
         <w:rPr>
           <w:sz w:val="22"/>
@@ -992,7 +1040,7 @@
 <w:ftr xmlns:wpc="http://schemas.microsoft.com/office/word/2010/wordprocessingCanvas" xmlns:mc="http://schemas.openxmlformats.org/markup-compatibility/2006" xmlns:o="urn:schemas-microsoft-com:office:office" xmlns:r="http://schemas.openxmlformats.org/officeDocument/2006/relationships" xmlns:m="http://schemas.openxmlformats.org/officeDocument/2006/math" xmlns:v="urn:schemas-microsoft-com:vml" xmlns:wp14="http://schemas.microsoft.com/office/word/2010/wordprocessingDrawing" xmlns:wp="http://schemas.openxmlformats.org/drawingml/2006/wordprocessingDrawing" xmlns:w10="urn:schemas-microsoft-com:office:word" xmlns:w="http://schemas.openxmlformats.org/wordprocessingml/2006/main" xmlns:w14="http://schemas.microsoft.com/office/word/2010/wordml" xmlns:w15="http://schemas.microsoft.com/office/word/2012/wordml" xmlns:wpg="http://schemas.microsoft.com/office/word/2010/wordprocessingGroup" xmlns:wpi="http://schemas.microsoft.com/office/word/2010/wordprocessingInk" xmlns:wne="http://schemas.microsoft.com/office/word/2006/wordml" xmlns:a="http://schemas.openxmlformats.org/drawingml/2006/main" xmlns:wps="http://schemas.microsoft.com/office/word/2010/wordprocessingShape" mc:Ignorable="w14 w15 wp14">
   <w:tbl>
     <w:tblPr>
-      <w:tblStyle w:val="698"/>
+      <w:tblStyle w:val="749"/>
       <w:tblW w:w="0" w:type="auto"/>
       <w:tblBorders/>
       <w:tblLayout w:type="fixed"/>
@@ -1018,7 +1066,7 @@
         </w:tcPr>
         <w:p>
           <w:pPr>
-            <w:pStyle w:val="694"/>
+            <w:pStyle w:val="745"/>
             <w:pBdr/>
             <w:tabs>
               <w:tab w:val="left" w:leader="none" w:pos="1887"/>
@@ -1037,7 +1085,20 @@
               <w:sz w:val="16"/>
               <w:szCs w:val="16"/>
             </w:rPr>
-            <w:t xml:space="preserve">HzgShowAround</w:t>
+          </w:r>
+          <w:r/>
+          <w:r>
+            <w:rPr>
+              <w:sz w:val="16"/>
+              <w:szCs w:val="16"/>
+            </w:rPr>
+          </w:r>
+          <w:r/>
+          <w:r>
+            <w:rPr>
+              <w:sz w:val="16"/>
+              <w:szCs w:val="16"/>
+            </w:rPr>
           </w:r>
           <w:r>
             <w:rPr>
@@ -1045,6 +1106,12 @@
               <w:szCs w:val="16"/>
             </w:rPr>
             <w:tab/>
+          </w:r>
+          <w:r>
+            <w:rPr>
+              <w:sz w:val="16"/>
+              <w:szCs w:val="16"/>
+            </w:rPr>
           </w:r>
           <w:r>
             <w:rPr>
@@ -1068,7 +1135,7 @@
         </w:tcPr>
         <w:p>
           <w:pPr>
-            <w:pStyle w:val="694"/>
+            <w:pStyle w:val="745"/>
             <w:pBdr/>
             <w:spacing/>
             <w:ind/>
@@ -1091,13 +1158,19 @@
               <w:szCs w:val="16"/>
             </w:rPr>
           </w:r>
+          <w:r>
+            <w:rPr>
+              <w:sz w:val="16"/>
+              <w:szCs w:val="16"/>
+            </w:rPr>
+          </w:r>
         </w:p>
       </w:tc>
     </w:tr>
   </w:tbl>
   <w:p>
     <w:pPr>
-      <w:pStyle w:val="694"/>
+      <w:pStyle w:val="745"/>
       <w:pBdr/>
       <w:spacing/>
       <w:ind/>
@@ -1146,11 +1219,12 @@
 <w:hdr xmlns:wpc="http://schemas.microsoft.com/office/word/2010/wordprocessingCanvas" xmlns:mc="http://schemas.openxmlformats.org/markup-compatibility/2006" xmlns:o="urn:schemas-microsoft-com:office:office" xmlns:r="http://schemas.openxmlformats.org/officeDocument/2006/relationships" xmlns:m="http://schemas.openxmlformats.org/officeDocument/2006/math" xmlns:v="urn:schemas-microsoft-com:vml" xmlns:wp14="http://schemas.microsoft.com/office/word/2010/wordprocessingDrawing" xmlns:wp="http://schemas.openxmlformats.org/drawingml/2006/wordprocessingDrawing" xmlns:w10="urn:schemas-microsoft-com:office:word" xmlns:w="http://schemas.openxmlformats.org/wordprocessingml/2006/main" xmlns:w14="http://schemas.microsoft.com/office/word/2010/wordml" xmlns:w15="http://schemas.microsoft.com/office/word/2012/wordml" xmlns:wpg="http://schemas.microsoft.com/office/word/2010/wordprocessingGroup" xmlns:wpi="http://schemas.microsoft.com/office/word/2010/wordprocessingInk" xmlns:wne="http://schemas.microsoft.com/office/word/2006/wordml" xmlns:a="http://schemas.openxmlformats.org/drawingml/2006/main" xmlns:wps="http://schemas.microsoft.com/office/word/2010/wordprocessingShape" mc:Ignorable="w14 w15 wp14">
   <w:p>
     <w:pPr>
-      <w:pStyle w:val="666"/>
+      <w:pStyle w:val="717"/>
       <w:pBdr/>
       <w:spacing/>
       <w:ind/>
       <w:rPr>
+        <w:rFonts w:ascii="Source Han Sans KR Heavy" w:hAnsi="Source Han Sans KR Heavy" w:cs="Source Han Sans KR Heavy"/>
         <w:b w:val="0"/>
         <w:bCs w:val="0"/>
         <w:sz w:val="72"/>
@@ -1165,22 +1239,291 @@
         <w:sz w:val="72"/>
         <w:szCs w:val="72"/>
       </w:rPr>
+    </w:r>
+    <w:r>
+      <mc:AlternateContent>
+        <mc:Choice Requires="wpg">
+          <w:drawing>
+            <wp:anchor xmlns:wp="http://schemas.openxmlformats.org/drawingml/2006/wordprocessingDrawing" xmlns:wp14="http://schemas.microsoft.com/office/word/2010/wordprocessingDrawing" distT="0" distB="0" distL="115200" distR="115200" simplePos="0" relativeHeight="8192" behindDoc="0" locked="0" layoutInCell="1" allowOverlap="1">
+              <wp:simplePos x="0" y="0"/>
+              <wp:positionH relativeFrom="column">
+                <wp:posOffset>-6430775</wp:posOffset>
+              </wp:positionH>
+              <wp:positionV relativeFrom="paragraph">
+                <wp:posOffset>4371975</wp:posOffset>
+              </wp:positionV>
+              <wp:extent cx="10941844" cy="1047750"/>
+              <wp:effectExtent l="6350" t="6350" r="6350" b="6350"/>
+              <wp:wrapNone/>
+              <wp:docPr id="1" name=""/>
+              <wp:cNvGraphicFramePr/>
+              <a:graphic xmlns:a="http://schemas.openxmlformats.org/drawingml/2006/main">
+                <a:graphicData uri="http://schemas.microsoft.com/office/word/2010/wordprocessingShape">
+                  <wps:wsp>
+                    <wps:cNvPr id="0" name=""/>
+                    <wps:cNvSpPr/>
+                    <wps:spPr bwMode="auto">
+                      <a:xfrm rot="16199969" flipH="0" flipV="0">
+                        <a:off x="0" y="0"/>
+                        <a:ext cx="10941843" cy="1047749"/>
+                      </a:xfrm>
+                      <a:prstGeom prst="rect">
+                        <a:avLst/>
+                      </a:prstGeom>
+                      <a:solidFill>
+                        <a:srgbClr val="9662A1"/>
+                      </a:solidFill>
+                      <a:ln w="12700" cap="flat" cmpd="sng" algn="ctr">
+                        <a:noFill/>
+                      </a:ln>
+                    </wps:spPr>
+                    <wps:style>
+                      <a:lnRef idx="2">
+                        <a:schemeClr val="accent1">
+                          <a:shade val="50000"/>
+                        </a:schemeClr>
+                      </a:lnRef>
+                      <a:fillRef idx="1">
+                        <a:schemeClr val="accent1"/>
+                      </a:fillRef>
+                      <a:effectRef idx="0">
+                        <a:schemeClr val="accent1"/>
+                      </a:effectRef>
+                      <a:fontRef idx="minor">
+                        <a:schemeClr val="lt1"/>
+                      </a:fontRef>
+                    </wps:style>
+                    <wps:txbx>
+                      <w:txbxContent>
+                        <w:p>
+                          <w:pPr>
+                            <w:pBdr/>
+                            <w:spacing/>
+                            <w:ind/>
+                            <w:jc w:val="center"/>
+                            <w:rPr>
+                              <w:rFonts w:ascii="Source Han Sans KR Heavy" w:hAnsi="Source Han Sans KR Heavy" w:cs="Source Han Sans KR Heavy"/>
+                              <w:b/>
+                              <w:bCs/>
+                              <w:sz w:val="16"/>
+                              <w:szCs w:val="16"/>
+                              <w:highlight w:val="none"/>
+                            </w:rPr>
+                          </w:pPr>
+                          <w:r>
+                            <w:rPr>
+                              <w:rFonts w:ascii="Source Han Sans KR Heavy" w:hAnsi="Source Han Sans KR Heavy" w:eastAsia="Source Han Sans KR Heavy" w:cs="Source Han Sans KR Heavy"/>
+                              <w:b/>
+                              <w:bCs/>
+                              <w:sz w:val="16"/>
+                              <w:szCs w:val="16"/>
+                              <w:highlight w:val="none"/>
+                            </w:rPr>
+                          </w:r>
+                          <w:r>
+                            <w:rPr>
+                              <w:rFonts w:ascii="Source Han Sans KR Heavy" w:hAnsi="Source Han Sans KR Heavy" w:cs="Source Han Sans KR Heavy"/>
+                              <w:b/>
+                              <w:bCs/>
+                              <w:sz w:val="16"/>
+                              <w:szCs w:val="16"/>
+                              <w:highlight w:val="none"/>
+                            </w:rPr>
+                          </w:r>
+                        </w:p>
+                        <w:p>
+                          <w:pPr>
+                            <w:pBdr/>
+                            <w:spacing/>
+                            <w:ind w:left="2835"/>
+                            <w:jc w:val="left"/>
+                            <w:rPr>
+                              <w:rFonts w:ascii="Source Han Sans KR Heavy" w:hAnsi="Source Han Sans KR Heavy" w:eastAsia="Source Han Sans KR Heavy" w:cs="Source Han Sans KR Heavy"/>
+                              <w:b w:val="0"/>
+                              <w:bCs w:val="0"/>
+                              <w:i w:val="0"/>
+                              <w:strike w:val="0"/>
+                              <w:sz w:val="48"/>
+                              <w:szCs w:val="48"/>
+                              <w:highlight w:val="none"/>
+                            </w:rPr>
+                          </w:pPr>
+                          <w:r>
+                            <w:rPr>
+                              <w:rFonts w:ascii="Source Han Sans KR Heavy" w:hAnsi="Source Han Sans KR Heavy" w:eastAsia="Source Han Sans KR Heavy" w:cs="Source Han Sans KR Heavy"/>
+                              <w:b w:val="0"/>
+                              <w:bCs w:val="0"/>
+                              <w:i w:val="0"/>
+                              <w:iCs w:val="0"/>
+                              <w:strike w:val="0"/>
+                              <w:sz w:val="48"/>
+                              <w:szCs w:val="48"/>
+                            </w:rPr>
+                            <w:t xml:space="preserve">HzgShowAround</w:t>
+                          </w:r>
+                          <w:r>
+                            <w:rPr>
+                              <w:rFonts w:ascii="Source Han Sans KR Heavy" w:hAnsi="Source Han Sans KR Heavy" w:eastAsia="Source Han Sans KR Heavy" w:cs="Source Han Sans KR Heavy"/>
+                              <w:b w:val="0"/>
+                              <w:bCs w:val="0"/>
+                              <w:i w:val="0"/>
+                              <w:iCs w:val="0"/>
+                              <w:strike w:val="0"/>
+                              <w:sz w:val="48"/>
+                              <w:szCs w:val="48"/>
+                            </w:rPr>
+                          </w:r>
+                          <w:r>
+                            <w:rPr>
+                              <w:rFonts w:ascii="Source Han Sans KR Heavy" w:hAnsi="Source Han Sans KR Heavy" w:eastAsia="Source Han Sans KR Heavy" w:cs="Source Han Sans KR Heavy"/>
+                              <w:b w:val="0"/>
+                              <w:bCs w:val="0"/>
+                              <w:i w:val="0"/>
+                              <w:iCs w:val="0"/>
+                              <w:strike w:val="0"/>
+                              <w:sz w:val="48"/>
+                              <w:szCs w:val="48"/>
+                              <w:highlight w:val="none"/>
+                            </w:rPr>
+                          </w:r>
+                        </w:p>
+                      </w:txbxContent>
+                    </wps:txbx>
+                    <wps:bodyPr anchor="ctr"/>
+                  </wps:wsp>
+                </a:graphicData>
+              </a:graphic>
+            </wp:anchor>
+          </w:drawing>
+        </mc:Choice>
+        <mc:Fallback>
+          <w:pict>
+            <v:shape id="shape 0" o:spid="_x0000_s0" o:spt="1" type="#_x0000_t1" style="position:absolute;z-index:8192;o:allowoverlap:true;o:allowincell:true;mso-position-horizontal-relative:text;margin-left:-506.36pt;mso-position-horizontal:absolute;mso-position-vertical-relative:text;margin-top:344.25pt;mso-position-vertical:absolute;width:861.56pt;height:82.50pt;mso-wrap-distance-left:9.07pt;mso-wrap-distance-top:0.00pt;mso-wrap-distance-right:9.07pt;mso-wrap-distance-bottom:0.00pt;rotation:269;v-text-anchor:middle;visibility:visible;" fillcolor="#9662A1" stroked="f" strokeweight="1.00pt">
+              <v:textbox inset="0,0,0,0">
+                <w:txbxContent>
+                  <w:p>
+                    <w:pPr>
+                      <w:pBdr/>
+                      <w:spacing/>
+                      <w:ind/>
+                      <w:jc w:val="center"/>
+                      <w:rPr>
+                        <w:rFonts w:ascii="Source Han Sans KR Heavy" w:hAnsi="Source Han Sans KR Heavy" w:cs="Source Han Sans KR Heavy"/>
+                        <w:b/>
+                        <w:bCs/>
+                        <w:sz w:val="16"/>
+                        <w:szCs w:val="16"/>
+                        <w:highlight w:val="none"/>
+                      </w:rPr>
+                    </w:pPr>
+                    <w:r>
+                      <w:rPr>
+                        <w:rFonts w:ascii="Source Han Sans KR Heavy" w:hAnsi="Source Han Sans KR Heavy" w:eastAsia="Source Han Sans KR Heavy" w:cs="Source Han Sans KR Heavy"/>
+                        <w:b/>
+                        <w:bCs/>
+                        <w:sz w:val="16"/>
+                        <w:szCs w:val="16"/>
+                        <w:highlight w:val="none"/>
+                      </w:rPr>
+                    </w:r>
+                    <w:r>
+                      <w:rPr>
+                        <w:rFonts w:ascii="Source Han Sans KR Heavy" w:hAnsi="Source Han Sans KR Heavy" w:cs="Source Han Sans KR Heavy"/>
+                        <w:b/>
+                        <w:bCs/>
+                        <w:sz w:val="16"/>
+                        <w:szCs w:val="16"/>
+                        <w:highlight w:val="none"/>
+                      </w:rPr>
+                    </w:r>
+                  </w:p>
+                  <w:p>
+                    <w:pPr>
+                      <w:pBdr/>
+                      <w:spacing/>
+                      <w:ind w:left="2835"/>
+                      <w:jc w:val="left"/>
+                      <w:rPr>
+                        <w:rFonts w:ascii="Source Han Sans KR Heavy" w:hAnsi="Source Han Sans KR Heavy" w:eastAsia="Source Han Sans KR Heavy" w:cs="Source Han Sans KR Heavy"/>
+                        <w:b w:val="0"/>
+                        <w:bCs w:val="0"/>
+                        <w:i w:val="0"/>
+                        <w:strike w:val="0"/>
+                        <w:sz w:val="48"/>
+                        <w:szCs w:val="48"/>
+                        <w:highlight w:val="none"/>
+                      </w:rPr>
+                    </w:pPr>
+                    <w:r>
+                      <w:rPr>
+                        <w:rFonts w:ascii="Source Han Sans KR Heavy" w:hAnsi="Source Han Sans KR Heavy" w:eastAsia="Source Han Sans KR Heavy" w:cs="Source Han Sans KR Heavy"/>
+                        <w:b w:val="0"/>
+                        <w:bCs w:val="0"/>
+                        <w:i w:val="0"/>
+                        <w:iCs w:val="0"/>
+                        <w:strike w:val="0"/>
+                        <w:sz w:val="48"/>
+                        <w:szCs w:val="48"/>
+                      </w:rPr>
+                      <w:t xml:space="preserve">HzgShowAround</w:t>
+                    </w:r>
+                    <w:r>
+                      <w:rPr>
+                        <w:rFonts w:ascii="Source Han Sans KR Heavy" w:hAnsi="Source Han Sans KR Heavy" w:eastAsia="Source Han Sans KR Heavy" w:cs="Source Han Sans KR Heavy"/>
+                        <w:b w:val="0"/>
+                        <w:bCs w:val="0"/>
+                        <w:i w:val="0"/>
+                        <w:iCs w:val="0"/>
+                        <w:strike w:val="0"/>
+                        <w:sz w:val="48"/>
+                        <w:szCs w:val="48"/>
+                      </w:rPr>
+                    </w:r>
+                    <w:r>
+                      <w:rPr>
+                        <w:rFonts w:ascii="Source Han Sans KR Heavy" w:hAnsi="Source Han Sans KR Heavy" w:eastAsia="Source Han Sans KR Heavy" w:cs="Source Han Sans KR Heavy"/>
+                        <w:b w:val="0"/>
+                        <w:bCs w:val="0"/>
+                        <w:i w:val="0"/>
+                        <w:iCs w:val="0"/>
+                        <w:strike w:val="0"/>
+                        <w:sz w:val="48"/>
+                        <w:szCs w:val="48"/>
+                        <w:highlight w:val="none"/>
+                      </w:rPr>
+                    </w:r>
+                  </w:p>
+                </w:txbxContent>
+              </v:textbox>
+            </v:shape>
+          </w:pict>
+        </mc:Fallback>
+      </mc:AlternateContent>
+    </w:r>
+    <w:r>
+      <w:rPr>
+        <w:rFonts w:ascii="Source Han Sans KR Heavy" w:hAnsi="Source Han Sans KR Heavy" w:eastAsia="Source Han Sans KR Heavy" w:cs="Source Han Sans KR Heavy"/>
+        <w:b/>
+        <w:bCs/>
+        <w:sz w:val="72"/>
+        <w:szCs w:val="72"/>
+      </w:rPr>
       <w:t xml:space="preserve">HzgShowAround</w:t>
       <mc:AlternateContent>
         <mc:Choice Requires="wpg">
           <w:drawing>
-            <wp:anchor xmlns:wp="http://schemas.openxmlformats.org/drawingml/2006/wordprocessingDrawing" xmlns:wp14="http://schemas.microsoft.com/office/word/2010/wordprocessingDrawing" distT="0" distB="0" distL="115200" distR="115200" simplePos="0" relativeHeight="3072" behindDoc="1" locked="0" layoutInCell="1" allowOverlap="1">
+            <wp:anchor xmlns:wp="http://schemas.openxmlformats.org/drawingml/2006/wordprocessingDrawing" xmlns:wp14="http://schemas.microsoft.com/office/word/2010/wordprocessingDrawing" distT="0" distB="0" distL="115200" distR="115200" simplePos="0" relativeHeight="2047" behindDoc="1" locked="0" layoutInCell="1" allowOverlap="1">
               <wp:simplePos x="0" y="0"/>
               <wp:positionH relativeFrom="column">
-                <wp:posOffset>-1081780</wp:posOffset>
+                <wp:posOffset>-1136806</wp:posOffset>
               </wp:positionH>
               <wp:positionV relativeFrom="paragraph">
-                <wp:posOffset>-451950</wp:posOffset>
+                <wp:posOffset>-529761</wp:posOffset>
               </wp:positionV>
-              <wp:extent cx="7563600" cy="10695600"/>
+              <wp:extent cx="7673652" cy="10851223"/>
               <wp:effectExtent l="0" t="0" r="0" b="0"/>
               <wp:wrapNone/>
-              <wp:docPr id="1" name="" title=""/>
+              <wp:docPr id="2" name=""/>
               <wp:cNvGraphicFramePr>
                 <a:graphicFrameLocks xmlns:a="http://schemas.openxmlformats.org/drawingml/2006/main" noChangeAspect="1"/>
               </wp:cNvGraphicFramePr>
@@ -1188,7 +1531,7 @@
                 <a:graphicData uri="http://schemas.openxmlformats.org/drawingml/2006/picture">
                   <pic:pic xmlns:pic="http://schemas.openxmlformats.org/drawingml/2006/picture">
                     <pic:nvPicPr>
-                      <pic:cNvPr id="1492931204" name=""/>
+                      <pic:cNvPr id="1007330952" name=""/>
                       <pic:cNvPicPr>
                         <a:picLocks noChangeAspect="1"/>
                       </pic:cNvPicPr>
@@ -1201,7 +1544,7 @@
                     <pic:spPr bwMode="auto">
                       <a:xfrm rot="0" flipH="0" flipV="0">
                         <a:off x="0" y="0"/>
-                        <a:ext cx="7563600" cy="10695600"/>
+                        <a:ext cx="7673651" cy="10851222"/>
                       </a:xfrm>
                       <a:prstGeom prst="rect">
                         <a:avLst/>
@@ -1210,12 +1553,6 @@
                   </pic:pic>
                 </a:graphicData>
               </a:graphic>
-              <wp14:sizeRelH relativeFrom="page">
-                <wp14:pctWidth>0</wp14:pctWidth>
-              </wp14:sizeRelH>
-              <wp14:sizeRelV relativeFrom="page">
-                <wp14:pctHeight>0</wp14:pctHeight>
-              </wp14:sizeRelV>
             </wp:anchor>
           </w:drawing>
         </mc:Choice>
@@ -1240,7 +1577,7 @@
               <v:path o:extrusionok="f" gradientshapeok="t" o:connecttype="rect"/>
               <o:lock v:ext="edit" aspectratio="t"/>
             </v:shapetype>
-            <v:shape id="_x0000_i0" o:spid="_x0000_s0" type="#_x0000_t75" style="position:absolute;z-index:-3072;o:allowoverlap:true;o:allowincell:true;mso-position-horizontal-relative:text;margin-left:-85.18pt;mso-position-horizontal:absolute;mso-position-vertical-relative:text;margin-top:-35.59pt;mso-position-vertical:absolute;width:595.56pt;height:842.17pt;mso-wrap-distance-left:9.07pt;mso-wrap-distance-top:0.00pt;mso-wrap-distance-right:9.07pt;mso-wrap-distance-bottom:0.00pt;rotation:0;z-index:1;" stroked="false">
+            <v:shape id="_x0000_i1" o:spid="_x0000_s1" type="#_x0000_t75" style="position:absolute;z-index:-2047;o:allowoverlap:true;o:allowincell:true;mso-position-horizontal-relative:text;margin-left:-89.51pt;mso-position-horizontal:absolute;mso-position-vertical-relative:text;margin-top:-41.71pt;mso-position-vertical:absolute;width:604.22pt;height:854.43pt;mso-wrap-distance-left:9.07pt;mso-wrap-distance-top:0.00pt;mso-wrap-distance-right:9.07pt;mso-wrap-distance-bottom:0.00pt;rotation:0;z-index:1;" stroked="false">
               <v:imagedata r:id="rId1" o:title=""/>
               <o:lock v:ext="edit" rotation="t"/>
             </v:shape>
@@ -1250,6 +1587,15 @@
     </w:r>
     <w:r>
       <w:rPr>
+        <w:rFonts w:ascii="Source Han Sans KR Heavy" w:hAnsi="Source Han Sans KR Heavy" w:eastAsia="Source Han Sans KR Heavy" w:cs="Source Han Sans KR Heavy"/>
+        <w:b/>
+        <w:bCs/>
+        <w:sz w:val="72"/>
+        <w:szCs w:val="72"/>
+      </w:rPr>
+    </w:r>
+    <w:r>
+      <w:rPr>
         <w:b w:val="0"/>
         <w:bCs w:val="0"/>
         <w:sz w:val="72"/>
@@ -1258,16 +1604,7 @@
     </w:r>
     <w:r>
       <w:rPr>
-        <w:b w:val="0"/>
-        <w:bCs w:val="0"/>
-        <w:sz w:val="72"/>
-        <w:szCs w:val="72"/>
-      </w:rPr>
-    </w:r>
-    <w:r/>
-    <w:r/>
-    <w:r>
-      <w:rPr>
+        <w:rFonts w:ascii="Source Han Sans KR Heavy" w:hAnsi="Source Han Sans KR Heavy" w:cs="Source Han Sans KR Heavy"/>
         <w:b w:val="0"/>
         <w:bCs w:val="0"/>
         <w:sz w:val="72"/>
@@ -1739,11 +2076,11 @@
     <w:lsdException w:name="Bibliography" w:uiPriority="37"/>
     <w:lsdException w:name="TOC Heading" w:uiPriority="39" w:qFormat="1"/>
   </w:latentStyles>
-  <w:style w:type="paragraph" w:styleId="666">
+  <w:style w:type="paragraph" w:styleId="717">
     <w:name w:val="Heading 1"/>
-    <w:basedOn w:val="684"/>
-    <w:next w:val="842"/>
-    <w:link w:val="667"/>
+    <w:basedOn w:val="735"/>
+    <w:next w:val="893"/>
+    <w:link w:val="718"/>
     <w:uiPriority w:val="9"/>
     <w:qFormat/>
     <w:pPr>
@@ -1759,9 +2096,9 @@
       <w:szCs w:val="72"/>
     </w:rPr>
   </w:style>
-  <w:style w:type="character" w:styleId="667">
+  <w:style w:type="character" w:styleId="718">
     <w:name w:val="Heading 1 Char"/>
-    <w:link w:val="666"/>
+    <w:link w:val="717"/>
     <w:uiPriority w:val="9"/>
     <w:pPr>
       <w:pBdr/>
@@ -1775,11 +2112,11 @@
       <w:szCs w:val="72"/>
     </w:rPr>
   </w:style>
-  <w:style w:type="paragraph" w:styleId="668">
+  <w:style w:type="paragraph" w:styleId="719">
     <w:name w:val="Heading 2"/>
-    <w:basedOn w:val="842"/>
-    <w:next w:val="842"/>
-    <w:link w:val="669"/>
+    <w:basedOn w:val="893"/>
+    <w:next w:val="893"/>
+    <w:link w:val="720"/>
     <w:uiPriority w:val="9"/>
     <w:unhideWhenUsed/>
     <w:qFormat/>
@@ -1800,9 +2137,9 @@
       <w:u w:val="single"/>
     </w:rPr>
   </w:style>
-  <w:style w:type="character" w:styleId="669">
+  <w:style w:type="character" w:styleId="720">
     <w:name w:val="Heading 2 Char"/>
-    <w:link w:val="668"/>
+    <w:link w:val="719"/>
     <w:uiPriority w:val="9"/>
     <w:pPr>
       <w:pBdr/>
@@ -1815,11 +2152,11 @@
       <w:u w:val="single"/>
     </w:rPr>
   </w:style>
-  <w:style w:type="paragraph" w:styleId="670">
+  <w:style w:type="paragraph" w:styleId="721">
     <w:name w:val="Heading 3"/>
-    <w:basedOn w:val="842"/>
-    <w:next w:val="842"/>
-    <w:link w:val="671"/>
+    <w:basedOn w:val="893"/>
+    <w:next w:val="893"/>
+    <w:link w:val="722"/>
     <w:uiPriority w:val="9"/>
     <w:unhideWhenUsed/>
     <w:qFormat/>
@@ -1837,9 +2174,9 @@
       <w:szCs w:val="30"/>
     </w:rPr>
   </w:style>
-  <w:style w:type="character" w:styleId="671">
+  <w:style w:type="character" w:styleId="722">
     <w:name w:val="Heading 3 Char"/>
-    <w:link w:val="670"/>
+    <w:link w:val="721"/>
     <w:uiPriority w:val="9"/>
     <w:pPr>
       <w:pBdr/>
@@ -1852,11 +2189,11 @@
       <w:szCs w:val="30"/>
     </w:rPr>
   </w:style>
-  <w:style w:type="paragraph" w:styleId="672">
+  <w:style w:type="paragraph" w:styleId="723">
     <w:name w:val="Heading 4"/>
-    <w:basedOn w:val="842"/>
-    <w:next w:val="842"/>
-    <w:link w:val="673"/>
+    <w:basedOn w:val="893"/>
+    <w:next w:val="893"/>
+    <w:link w:val="724"/>
     <w:uiPriority w:val="9"/>
     <w:unhideWhenUsed/>
     <w:qFormat/>
@@ -1876,9 +2213,9 @@
       <w:szCs w:val="26"/>
     </w:rPr>
   </w:style>
-  <w:style w:type="character" w:styleId="673">
+  <w:style w:type="character" w:styleId="724">
     <w:name w:val="Heading 4 Char"/>
-    <w:link w:val="672"/>
+    <w:link w:val="723"/>
     <w:uiPriority w:val="9"/>
     <w:pPr>
       <w:pBdr/>
@@ -1893,11 +2230,11 @@
       <w:szCs w:val="26"/>
     </w:rPr>
   </w:style>
-  <w:style w:type="paragraph" w:styleId="674">
+  <w:style w:type="paragraph" w:styleId="725">
     <w:name w:val="Heading 5"/>
-    <w:basedOn w:val="842"/>
-    <w:next w:val="842"/>
-    <w:link w:val="675"/>
+    <w:basedOn w:val="893"/>
+    <w:next w:val="893"/>
+    <w:link w:val="726"/>
     <w:uiPriority w:val="9"/>
     <w:unhideWhenUsed/>
     <w:qFormat/>
@@ -1917,9 +2254,9 @@
       <w:szCs w:val="24"/>
     </w:rPr>
   </w:style>
-  <w:style w:type="character" w:styleId="675">
+  <w:style w:type="character" w:styleId="726">
     <w:name w:val="Heading 5 Char"/>
-    <w:link w:val="674"/>
+    <w:link w:val="725"/>
     <w:uiPriority w:val="9"/>
     <w:pPr>
       <w:pBdr/>
@@ -1934,11 +2271,11 @@
       <w:szCs w:val="24"/>
     </w:rPr>
   </w:style>
-  <w:style w:type="paragraph" w:styleId="676">
+  <w:style w:type="paragraph" w:styleId="727">
     <w:name w:val="Heading 6"/>
-    <w:basedOn w:val="842"/>
-    <w:next w:val="842"/>
-    <w:link w:val="677"/>
+    <w:basedOn w:val="893"/>
+    <w:next w:val="893"/>
+    <w:link w:val="728"/>
     <w:uiPriority w:val="9"/>
     <w:unhideWhenUsed/>
     <w:qFormat/>
@@ -1958,9 +2295,9 @@
       <w:szCs w:val="22"/>
     </w:rPr>
   </w:style>
-  <w:style w:type="character" w:styleId="677">
+  <w:style w:type="character" w:styleId="728">
     <w:name w:val="Heading 6 Char"/>
-    <w:link w:val="676"/>
+    <w:link w:val="727"/>
     <w:uiPriority w:val="9"/>
     <w:pPr>
       <w:pBdr/>
@@ -1975,11 +2312,11 @@
       <w:szCs w:val="22"/>
     </w:rPr>
   </w:style>
-  <w:style w:type="paragraph" w:styleId="678">
+  <w:style w:type="paragraph" w:styleId="729">
     <w:name w:val="Heading 7"/>
-    <w:basedOn w:val="842"/>
-    <w:next w:val="842"/>
-    <w:link w:val="679"/>
+    <w:basedOn w:val="893"/>
+    <w:next w:val="893"/>
+    <w:link w:val="730"/>
     <w:uiPriority w:val="9"/>
     <w:unhideWhenUsed/>
     <w:qFormat/>
@@ -2001,9 +2338,9 @@
       <w:szCs w:val="22"/>
     </w:rPr>
   </w:style>
-  <w:style w:type="character" w:styleId="679">
+  <w:style w:type="character" w:styleId="730">
     <w:name w:val="Heading 7 Char"/>
-    <w:link w:val="678"/>
+    <w:link w:val="729"/>
     <w:uiPriority w:val="9"/>
     <w:pPr>
       <w:pBdr/>
@@ -2020,11 +2357,11 @@
       <w:szCs w:val="22"/>
     </w:rPr>
   </w:style>
-  <w:style w:type="paragraph" w:styleId="680">
+  <w:style w:type="paragraph" w:styleId="731">
     <w:name w:val="Heading 8"/>
-    <w:basedOn w:val="842"/>
-    <w:next w:val="842"/>
-    <w:link w:val="681"/>
+    <w:basedOn w:val="893"/>
+    <w:next w:val="893"/>
+    <w:link w:val="732"/>
     <w:uiPriority w:val="9"/>
     <w:unhideWhenUsed/>
     <w:qFormat/>
@@ -2044,9 +2381,9 @@
       <w:szCs w:val="22"/>
     </w:rPr>
   </w:style>
-  <w:style w:type="character" w:styleId="681">
+  <w:style w:type="character" w:styleId="732">
     <w:name w:val="Heading 8 Char"/>
-    <w:link w:val="680"/>
+    <w:link w:val="731"/>
     <w:uiPriority w:val="9"/>
     <w:pPr>
       <w:pBdr/>
@@ -2061,11 +2398,11 @@
       <w:szCs w:val="22"/>
     </w:rPr>
   </w:style>
-  <w:style w:type="paragraph" w:styleId="682">
+  <w:style w:type="paragraph" w:styleId="733">
     <w:name w:val="Heading 9"/>
-    <w:basedOn w:val="842"/>
-    <w:next w:val="842"/>
-    <w:link w:val="683"/>
+    <w:basedOn w:val="893"/>
+    <w:next w:val="893"/>
+    <w:link w:val="734"/>
     <w:uiPriority w:val="9"/>
     <w:unhideWhenUsed/>
     <w:qFormat/>
@@ -2085,9 +2422,9 @@
       <w:szCs w:val="21"/>
     </w:rPr>
   </w:style>
-  <w:style w:type="character" w:styleId="683">
+  <w:style w:type="character" w:styleId="734">
     <w:name w:val="Heading 9 Char"/>
-    <w:link w:val="682"/>
+    <w:link w:val="733"/>
     <w:uiPriority w:val="9"/>
     <w:pPr>
       <w:pBdr/>
@@ -2102,11 +2439,11 @@
       <w:szCs w:val="21"/>
     </w:rPr>
   </w:style>
-  <w:style w:type="paragraph" w:styleId="684">
+  <w:style w:type="paragraph" w:styleId="735">
     <w:name w:val="Title"/>
-    <w:basedOn w:val="842"/>
-    <w:next w:val="842"/>
-    <w:link w:val="685"/>
+    <w:basedOn w:val="893"/>
+    <w:next w:val="893"/>
+    <w:link w:val="736"/>
     <w:uiPriority w:val="10"/>
     <w:qFormat/>
     <w:pPr>
@@ -2120,9 +2457,9 @@
       <w:szCs w:val="48"/>
     </w:rPr>
   </w:style>
-  <w:style w:type="character" w:styleId="685">
+  <w:style w:type="character" w:styleId="736">
     <w:name w:val="Title Char"/>
-    <w:link w:val="684"/>
+    <w:link w:val="735"/>
     <w:uiPriority w:val="10"/>
     <w:pPr>
       <w:pBdr/>
@@ -2134,11 +2471,11 @@
       <w:szCs w:val="48"/>
     </w:rPr>
   </w:style>
-  <w:style w:type="paragraph" w:styleId="686">
+  <w:style w:type="paragraph" w:styleId="737">
     <w:name w:val="Subtitle"/>
-    <w:basedOn w:val="842"/>
-    <w:next w:val="842"/>
-    <w:link w:val="687"/>
+    <w:basedOn w:val="893"/>
+    <w:next w:val="893"/>
+    <w:link w:val="738"/>
     <w:uiPriority w:val="11"/>
     <w:qFormat/>
     <w:pPr>
@@ -2151,9 +2488,9 @@
       <w:szCs w:val="24"/>
     </w:rPr>
   </w:style>
-  <w:style w:type="character" w:styleId="687">
+  <w:style w:type="character" w:styleId="738">
     <w:name w:val="Subtitle Char"/>
-    <w:link w:val="686"/>
+    <w:link w:val="737"/>
     <w:uiPriority w:val="11"/>
     <w:pPr>
       <w:pBdr/>
@@ -2165,11 +2502,11 @@
       <w:szCs w:val="24"/>
     </w:rPr>
   </w:style>
-  <w:style w:type="paragraph" w:styleId="688">
+  <w:style w:type="paragraph" w:styleId="739">
     <w:name w:val="Quote"/>
-    <w:basedOn w:val="842"/>
-    <w:next w:val="842"/>
-    <w:link w:val="689"/>
+    <w:basedOn w:val="893"/>
+    <w:next w:val="893"/>
+    <w:link w:val="740"/>
     <w:uiPriority w:val="29"/>
     <w:qFormat/>
     <w:pPr>
@@ -2181,9 +2518,9 @@
       <w:i/>
     </w:rPr>
   </w:style>
-  <w:style w:type="character" w:styleId="689">
+  <w:style w:type="character" w:styleId="740">
     <w:name w:val="Quote Char"/>
-    <w:link w:val="688"/>
+    <w:link w:val="739"/>
     <w:uiPriority w:val="29"/>
     <w:pPr>
       <w:pBdr/>
@@ -2194,11 +2531,11 @@
       <w:i/>
     </w:rPr>
   </w:style>
-  <w:style w:type="paragraph" w:styleId="690">
+  <w:style w:type="paragraph" w:styleId="741">
     <w:name w:val="Intense Quote"/>
-    <w:basedOn w:val="842"/>
-    <w:next w:val="842"/>
-    <w:link w:val="691"/>
+    <w:basedOn w:val="893"/>
+    <w:next w:val="893"/>
+    <w:link w:val="742"/>
     <w:uiPriority w:val="30"/>
     <w:qFormat/>
     <w:pPr>
@@ -2217,9 +2554,9 @@
       <w:i/>
     </w:rPr>
   </w:style>
-  <w:style w:type="character" w:styleId="691">
+  <w:style w:type="character" w:styleId="742">
     <w:name w:val="Intense Quote Char"/>
-    <w:link w:val="690"/>
+    <w:link w:val="741"/>
     <w:uiPriority w:val="30"/>
     <w:pPr>
       <w:pBdr/>
@@ -2230,10 +2567,10 @@
       <w:i/>
     </w:rPr>
   </w:style>
-  <w:style w:type="paragraph" w:styleId="692">
+  <w:style w:type="paragraph" w:styleId="743">
     <w:name w:val="Header"/>
-    <w:basedOn w:val="842"/>
-    <w:link w:val="693"/>
+    <w:basedOn w:val="893"/>
+    <w:link w:val="744"/>
     <w:uiPriority w:val="99"/>
     <w:unhideWhenUsed/>
     <w:pPr>
@@ -2246,9 +2583,9 @@
       <w:ind/>
     </w:pPr>
   </w:style>
-  <w:style w:type="character" w:styleId="693">
+  <w:style w:type="character" w:styleId="744">
     <w:name w:val="Header Char"/>
-    <w:link w:val="692"/>
+    <w:link w:val="743"/>
     <w:uiPriority w:val="99"/>
     <w:pPr>
       <w:pBdr/>
@@ -2256,10 +2593,10 @@
       <w:ind/>
     </w:pPr>
   </w:style>
-  <w:style w:type="paragraph" w:styleId="694">
+  <w:style w:type="paragraph" w:styleId="745">
     <w:name w:val="Footer"/>
-    <w:basedOn w:val="842"/>
-    <w:link w:val="697"/>
+    <w:basedOn w:val="893"/>
+    <w:link w:val="748"/>
     <w:uiPriority w:val="99"/>
     <w:unhideWhenUsed/>
     <w:pPr>
@@ -2272,9 +2609,9 @@
       <w:ind/>
     </w:pPr>
   </w:style>
-  <w:style w:type="character" w:styleId="695">
+  <w:style w:type="character" w:styleId="746">
     <w:name w:val="Footer Char"/>
-    <w:link w:val="694"/>
+    <w:link w:val="745"/>
     <w:uiPriority w:val="99"/>
     <w:pPr>
       <w:pBdr/>
@@ -2282,10 +2619,10 @@
       <w:ind/>
     </w:pPr>
   </w:style>
-  <w:style w:type="paragraph" w:styleId="696">
+  <w:style w:type="paragraph" w:styleId="747">
     <w:name w:val="Caption"/>
-    <w:basedOn w:val="842"/>
-    <w:next w:val="842"/>
+    <w:basedOn w:val="893"/>
+    <w:next w:val="893"/>
     <w:uiPriority w:val="35"/>
     <w:semiHidden/>
     <w:unhideWhenUsed/>
@@ -2303,10 +2640,10 @@
       <w:szCs w:val="18"/>
     </w:rPr>
   </w:style>
-  <w:style w:type="character" w:styleId="697">
+  <w:style w:type="character" w:styleId="748">
     <w:name w:val="Caption Char"/>
-    <w:basedOn w:val="696"/>
-    <w:link w:val="694"/>
+    <w:basedOn w:val="747"/>
+    <w:link w:val="745"/>
     <w:uiPriority w:val="99"/>
     <w:pPr>
       <w:pBdr/>
@@ -2314,9 +2651,9 @@
       <w:ind/>
     </w:pPr>
   </w:style>
-  <w:style w:type="table" w:styleId="698">
+  <w:style w:type="table" w:styleId="749">
     <w:name w:val="Table Grid"/>
-    <w:basedOn w:val="843"/>
+    <w:basedOn w:val="894"/>
     <w:uiPriority w:val="59"/>
     <w:pPr>
       <w:pBdr/>
@@ -2513,9 +2850,9 @@
       </w:tcPr>
     </w:tblStylePr>
   </w:style>
-  <w:style w:type="table" w:styleId="699">
+  <w:style w:type="table" w:styleId="750">
     <w:name w:val="Table Grid Light"/>
-    <w:basedOn w:val="843"/>
+    <w:basedOn w:val="894"/>
     <w:uiPriority w:val="59"/>
     <w:pPr>
       <w:pBdr/>
@@ -2712,9 +3049,9 @@
       </w:tcPr>
     </w:tblStylePr>
   </w:style>
-  <w:style w:type="table" w:styleId="700">
+  <w:style w:type="table" w:styleId="751">
     <w:name w:val="Plain Table 1"/>
-    <w:basedOn w:val="843"/>
+    <w:basedOn w:val="894"/>
     <w:uiPriority w:val="59"/>
     <w:pPr>
       <w:pBdr/>
@@ -2937,9 +3274,9 @@
       </w:tcPr>
     </w:tblStylePr>
   </w:style>
-  <w:style w:type="table" w:styleId="701">
+  <w:style w:type="table" w:styleId="752">
     <w:name w:val="Plain Table 2"/>
-    <w:basedOn w:val="843"/>
+    <w:basedOn w:val="894"/>
     <w:uiPriority w:val="59"/>
     <w:pPr>
       <w:pBdr/>
@@ -3170,9 +3507,9 @@
       </w:tcPr>
     </w:tblStylePr>
   </w:style>
-  <w:style w:type="table" w:styleId="702">
+  <w:style w:type="table" w:styleId="753">
     <w:name w:val="Plain Table 3"/>
-    <w:basedOn w:val="843"/>
+    <w:basedOn w:val="894"/>
     <w:uiPriority w:val="99"/>
     <w:pPr>
       <w:pBdr/>
@@ -3400,9 +3737,9 @@
       </w:tcPr>
     </w:tblStylePr>
   </w:style>
-  <w:style w:type="table" w:styleId="703">
+  <w:style w:type="table" w:styleId="754">
     <w:name w:val="Plain Table 4"/>
-    <w:basedOn w:val="843"/>
+    <w:basedOn w:val="894"/>
     <w:uiPriority w:val="99"/>
     <w:pPr>
       <w:pBdr/>
@@ -3616,9 +3953,9 @@
       </w:tcPr>
     </w:tblStylePr>
   </w:style>
-  <w:style w:type="table" w:styleId="704">
+  <w:style w:type="table" w:styleId="755">
     <w:name w:val="Plain Table 5"/>
-    <w:basedOn w:val="843"/>
+    <w:basedOn w:val="894"/>
     <w:uiPriority w:val="99"/>
     <w:pPr>
       <w:pBdr/>
@@ -3849,9 +4186,9 @@
       </w:tcPr>
     </w:tblStylePr>
   </w:style>
-  <w:style w:type="table" w:styleId="705">
+  <w:style w:type="table" w:styleId="756">
     <w:name w:val="Grid Table 1 Light"/>
-    <w:basedOn w:val="843"/>
+    <w:basedOn w:val="894"/>
     <w:uiPriority w:val="99"/>
     <w:pPr>
       <w:pBdr/>
@@ -4072,9 +4409,9 @@
       </w:tcPr>
     </w:tblStylePr>
   </w:style>
-  <w:style w:type="table" w:styleId="706">
+  <w:style w:type="table" w:styleId="757">
     <w:name w:val="Grid Table 1 Light - Accent 1"/>
-    <w:basedOn w:val="843"/>
+    <w:basedOn w:val="894"/>
     <w:uiPriority w:val="99"/>
     <w:pPr>
       <w:pBdr/>
@@ -4295,9 +4632,9 @@
       </w:tcPr>
     </w:tblStylePr>
   </w:style>
-  <w:style w:type="table" w:styleId="707">
+  <w:style w:type="table" w:styleId="758">
     <w:name w:val="Grid Table 1 Light - Accent 2"/>
-    <w:basedOn w:val="843"/>
+    <w:basedOn w:val="894"/>
     <w:uiPriority w:val="99"/>
     <w:pPr>
       <w:pBdr/>
@@ -4518,9 +4855,9 @@
       </w:tcPr>
     </w:tblStylePr>
   </w:style>
-  <w:style w:type="table" w:styleId="708">
+  <w:style w:type="table" w:styleId="759">
     <w:name w:val="Grid Table 1 Light - Accent 3"/>
-    <w:basedOn w:val="843"/>
+    <w:basedOn w:val="894"/>
     <w:uiPriority w:val="99"/>
     <w:pPr>
       <w:pBdr/>
@@ -4741,9 +5078,9 @@
       </w:tcPr>
     </w:tblStylePr>
   </w:style>
-  <w:style w:type="table" w:styleId="709">
+  <w:style w:type="table" w:styleId="760">
     <w:name w:val="Grid Table 1 Light - Accent 4"/>
-    <w:basedOn w:val="843"/>
+    <w:basedOn w:val="894"/>
     <w:uiPriority w:val="99"/>
     <w:pPr>
       <w:pBdr/>
@@ -4964,9 +5301,9 @@
       </w:tcPr>
     </w:tblStylePr>
   </w:style>
-  <w:style w:type="table" w:styleId="710">
+  <w:style w:type="table" w:styleId="761">
     <w:name w:val="Grid Table 1 Light - Accent 5"/>
-    <w:basedOn w:val="843"/>
+    <w:basedOn w:val="894"/>
     <w:uiPriority w:val="99"/>
     <w:pPr>
       <w:pBdr/>
@@ -5187,9 +5524,9 @@
       </w:tcPr>
     </w:tblStylePr>
   </w:style>
-  <w:style w:type="table" w:styleId="711">
+  <w:style w:type="table" w:styleId="762">
     <w:name w:val="Grid Table 1 Light - Accent 6"/>
-    <w:basedOn w:val="843"/>
+    <w:basedOn w:val="894"/>
     <w:uiPriority w:val="99"/>
     <w:pPr>
       <w:pBdr/>
@@ -5410,9 +5747,9 @@
       </w:tcPr>
     </w:tblStylePr>
   </w:style>
-  <w:style w:type="table" w:styleId="712">
+  <w:style w:type="table" w:styleId="763">
     <w:name w:val="Grid Table 2"/>
-    <w:basedOn w:val="843"/>
+    <w:basedOn w:val="894"/>
     <w:uiPriority w:val="99"/>
     <w:pPr>
       <w:pBdr/>
@@ -5642,9 +5979,9 @@
       </w:tcPr>
     </w:tblStylePr>
   </w:style>
-  <w:style w:type="table" w:styleId="713">
+  <w:style w:type="table" w:styleId="764">
     <w:name w:val="Grid Table 2 - Accent 1"/>
-    <w:basedOn w:val="843"/>
+    <w:basedOn w:val="894"/>
     <w:uiPriority w:val="99"/>
     <w:pPr>
       <w:pBdr/>
@@ -5874,9 +6211,9 @@
       </w:tcPr>
     </w:tblStylePr>
   </w:style>
-  <w:style w:type="table" w:styleId="714">
+  <w:style w:type="table" w:styleId="765">
     <w:name w:val="Grid Table 2 - Accent 2"/>
-    <w:basedOn w:val="843"/>
+    <w:basedOn w:val="894"/>
     <w:uiPriority w:val="99"/>
     <w:pPr>
       <w:pBdr/>
@@ -6106,9 +6443,9 @@
       </w:tcPr>
     </w:tblStylePr>
   </w:style>
-  <w:style w:type="table" w:styleId="715">
+  <w:style w:type="table" w:styleId="766">
     <w:name w:val="Grid Table 2 - Accent 3"/>
-    <w:basedOn w:val="843"/>
+    <w:basedOn w:val="894"/>
     <w:uiPriority w:val="99"/>
     <w:pPr>
       <w:pBdr/>
@@ -6338,9 +6675,9 @@
       </w:tcPr>
     </w:tblStylePr>
   </w:style>
-  <w:style w:type="table" w:styleId="716">
+  <w:style w:type="table" w:styleId="767">
     <w:name w:val="Grid Table 2 - Accent 4"/>
-    <w:basedOn w:val="843"/>
+    <w:basedOn w:val="894"/>
     <w:uiPriority w:val="99"/>
     <w:pPr>
       <w:pBdr/>
@@ -6570,9 +6907,9 @@
       </w:tcPr>
     </w:tblStylePr>
   </w:style>
-  <w:style w:type="table" w:styleId="717">
+  <w:style w:type="table" w:styleId="768">
     <w:name w:val="Grid Table 2 - Accent 5"/>
-    <w:basedOn w:val="843"/>
+    <w:basedOn w:val="894"/>
     <w:uiPriority w:val="99"/>
     <w:pPr>
       <w:pBdr/>
@@ -6802,9 +7139,9 @@
       </w:tcPr>
     </w:tblStylePr>
   </w:style>
-  <w:style w:type="table" w:styleId="718">
+  <w:style w:type="table" w:styleId="769">
     <w:name w:val="Grid Table 2 - Accent 6"/>
-    <w:basedOn w:val="843"/>
+    <w:basedOn w:val="894"/>
     <w:uiPriority w:val="99"/>
     <w:pPr>
       <w:pBdr/>
@@ -7034,9 +7371,9 @@
       </w:tcPr>
     </w:tblStylePr>
   </w:style>
-  <w:style w:type="table" w:styleId="719">
+  <w:style w:type="table" w:styleId="770">
     <w:name w:val="Grid Table 3"/>
-    <w:basedOn w:val="843"/>
+    <w:basedOn w:val="894"/>
     <w:uiPriority w:val="99"/>
     <w:pPr>
       <w:pBdr/>
@@ -7279,9 +7616,9 @@
       </w:tcPr>
     </w:tblStylePr>
   </w:style>
-  <w:style w:type="table" w:styleId="720">
+  <w:style w:type="table" w:styleId="771">
     <w:name w:val="Grid Table 3 - Accent 1"/>
-    <w:basedOn w:val="843"/>
+    <w:basedOn w:val="894"/>
     <w:uiPriority w:val="99"/>
     <w:pPr>
       <w:pBdr/>
@@ -7524,9 +7861,9 @@
       </w:tcPr>
     </w:tblStylePr>
   </w:style>
-  <w:style w:type="table" w:styleId="721">
+  <w:style w:type="table" w:styleId="772">
     <w:name w:val="Grid Table 3 - Accent 2"/>
-    <w:basedOn w:val="843"/>
+    <w:basedOn w:val="894"/>
     <w:uiPriority w:val="99"/>
     <w:pPr>
       <w:pBdr/>
@@ -7769,9 +8106,9 @@
       </w:tcPr>
     </w:tblStylePr>
   </w:style>
-  <w:style w:type="table" w:styleId="722">
+  <w:style w:type="table" w:styleId="773">
     <w:name w:val="Grid Table 3 - Accent 3"/>
-    <w:basedOn w:val="843"/>
+    <w:basedOn w:val="894"/>
     <w:uiPriority w:val="99"/>
     <w:pPr>
       <w:pBdr/>
@@ -8014,9 +8351,9 @@
       </w:tcPr>
     </w:tblStylePr>
   </w:style>
-  <w:style w:type="table" w:styleId="723">
+  <w:style w:type="table" w:styleId="774">
     <w:name w:val="Grid Table 3 - Accent 4"/>
-    <w:basedOn w:val="843"/>
+    <w:basedOn w:val="894"/>
     <w:uiPriority w:val="99"/>
     <w:pPr>
       <w:pBdr/>
@@ -8259,9 +8596,9 @@
       </w:tcPr>
     </w:tblStylePr>
   </w:style>
-  <w:style w:type="table" w:styleId="724">
+  <w:style w:type="table" w:styleId="775">
     <w:name w:val="Grid Table 3 - Accent 5"/>
-    <w:basedOn w:val="843"/>
+    <w:basedOn w:val="894"/>
     <w:uiPriority w:val="99"/>
     <w:pPr>
       <w:pBdr/>
@@ -8504,9 +8841,9 @@
       </w:tcPr>
     </w:tblStylePr>
   </w:style>
-  <w:style w:type="table" w:styleId="725">
+  <w:style w:type="table" w:styleId="776">
     <w:name w:val="Grid Table 3 - Accent 6"/>
-    <w:basedOn w:val="843"/>
+    <w:basedOn w:val="894"/>
     <w:uiPriority w:val="99"/>
     <w:pPr>
       <w:pBdr/>
@@ -8749,9 +9086,9 @@
       </w:tcPr>
     </w:tblStylePr>
   </w:style>
-  <w:style w:type="table" w:styleId="726">
+  <w:style w:type="table" w:styleId="777">
     <w:name w:val="Grid Table 4"/>
-    <w:basedOn w:val="843"/>
+    <w:basedOn w:val="894"/>
     <w:uiPriority w:val="59"/>
     <w:pPr>
       <w:pBdr/>
@@ -8982,9 +9319,9 @@
       </w:tcPr>
     </w:tblStylePr>
   </w:style>
-  <w:style w:type="table" w:styleId="727">
+  <w:style w:type="table" w:styleId="778">
     <w:name w:val="Grid Table 4 - Accent 1"/>
-    <w:basedOn w:val="843"/>
+    <w:basedOn w:val="894"/>
     <w:uiPriority w:val="59"/>
     <w:pPr>
       <w:pBdr/>
@@ -9215,9 +9552,9 @@
       </w:tcPr>
     </w:tblStylePr>
   </w:style>
-  <w:style w:type="table" w:styleId="728">
+  <w:style w:type="table" w:styleId="779">
     <w:name w:val="Grid Table 4 - Accent 2"/>
-    <w:basedOn w:val="843"/>
+    <w:basedOn w:val="894"/>
     <w:uiPriority w:val="59"/>
     <w:pPr>
       <w:pBdr/>
@@ -9448,9 +9785,9 @@
       </w:tcPr>
     </w:tblStylePr>
   </w:style>
-  <w:style w:type="table" w:styleId="729">
+  <w:style w:type="table" w:styleId="780">
     <w:name w:val="Grid Table 4 - Accent 3"/>
-    <w:basedOn w:val="843"/>
+    <w:basedOn w:val="894"/>
     <w:uiPriority w:val="59"/>
     <w:pPr>
       <w:pBdr/>
@@ -9681,9 +10018,9 @@
       </w:tcPr>
     </w:tblStylePr>
   </w:style>
-  <w:style w:type="table" w:styleId="730">
+  <w:style w:type="table" w:styleId="781">
     <w:name w:val="Grid Table 4 - Accent 4"/>
-    <w:basedOn w:val="843"/>
+    <w:basedOn w:val="894"/>
     <w:uiPriority w:val="59"/>
     <w:pPr>
       <w:pBdr/>
@@ -9914,9 +10251,9 @@
       </w:tcPr>
     </w:tblStylePr>
   </w:style>
-  <w:style w:type="table" w:styleId="731">
+  <w:style w:type="table" w:styleId="782">
     <w:name w:val="Grid Table 4 - Accent 5"/>
-    <w:basedOn w:val="843"/>
+    <w:basedOn w:val="894"/>
     <w:uiPriority w:val="59"/>
     <w:pPr>
       <w:pBdr/>
@@ -10147,9 +10484,9 @@
       </w:tcPr>
     </w:tblStylePr>
   </w:style>
-  <w:style w:type="table" w:styleId="732">
+  <w:style w:type="table" w:styleId="783">
     <w:name w:val="Grid Table 4 - Accent 6"/>
-    <w:basedOn w:val="843"/>
+    <w:basedOn w:val="894"/>
     <w:uiPriority w:val="59"/>
     <w:pPr>
       <w:pBdr/>
@@ -10380,9 +10717,9 @@
       </w:tcPr>
     </w:tblStylePr>
   </w:style>
-  <w:style w:type="table" w:styleId="733">
+  <w:style w:type="table" w:styleId="784">
     <w:name w:val="Grid Table 5 Dark"/>
-    <w:basedOn w:val="843"/>
+    <w:basedOn w:val="894"/>
     <w:uiPriority w:val="99"/>
     <w:pPr>
       <w:pBdr/>
@@ -10608,9 +10945,9 @@
       </w:tcPr>
     </w:tblStylePr>
   </w:style>
-  <w:style w:type="table" w:styleId="734">
+  <w:style w:type="table" w:styleId="785">
     <w:name w:val="Grid Table 5 Dark- Accent 1"/>
-    <w:basedOn w:val="843"/>
+    <w:basedOn w:val="894"/>
     <w:uiPriority w:val="99"/>
     <w:pPr>
       <w:pBdr/>
@@ -10836,9 +11173,9 @@
       </w:tcPr>
     </w:tblStylePr>
   </w:style>
-  <w:style w:type="table" w:styleId="735">
+  <w:style w:type="table" w:styleId="786">
     <w:name w:val="Grid Table 5 Dark - Accent 2"/>
-    <w:basedOn w:val="843"/>
+    <w:basedOn w:val="894"/>
     <w:uiPriority w:val="99"/>
     <w:pPr>
       <w:pBdr/>
@@ -11064,9 +11401,9 @@
       </w:tcPr>
     </w:tblStylePr>
   </w:style>
-  <w:style w:type="table" w:styleId="736">
+  <w:style w:type="table" w:styleId="787">
     <w:name w:val="Grid Table 5 Dark - Accent 3"/>
-    <w:basedOn w:val="843"/>
+    <w:basedOn w:val="894"/>
     <w:uiPriority w:val="99"/>
     <w:pPr>
       <w:pBdr/>
@@ -11292,9 +11629,9 @@
       </w:tcPr>
     </w:tblStylePr>
   </w:style>
-  <w:style w:type="table" w:styleId="737">
+  <w:style w:type="table" w:styleId="788">
     <w:name w:val="Grid Table 5 Dark- Accent 4"/>
-    <w:basedOn w:val="843"/>
+    <w:basedOn w:val="894"/>
     <w:uiPriority w:val="99"/>
     <w:pPr>
       <w:pBdr/>
@@ -11520,9 +11857,9 @@
       </w:tcPr>
     </w:tblStylePr>
   </w:style>
-  <w:style w:type="table" w:styleId="738">
+  <w:style w:type="table" w:styleId="789">
     <w:name w:val="Grid Table 5 Dark - Accent 5"/>
-    <w:basedOn w:val="843"/>
+    <w:basedOn w:val="894"/>
     <w:uiPriority w:val="99"/>
     <w:pPr>
       <w:pBdr/>
@@ -11748,9 +12085,9 @@
       </w:tcPr>
     </w:tblStylePr>
   </w:style>
-  <w:style w:type="table" w:styleId="739">
+  <w:style w:type="table" w:styleId="790">
     <w:name w:val="Grid Table 5 Dark - Accent 6"/>
-    <w:basedOn w:val="843"/>
+    <w:basedOn w:val="894"/>
     <w:uiPriority w:val="99"/>
     <w:pPr>
       <w:pBdr/>
@@ -11976,9 +12313,9 @@
       </w:tcPr>
     </w:tblStylePr>
   </w:style>
-  <w:style w:type="table" w:styleId="740">
+  <w:style w:type="table" w:styleId="791">
     <w:name w:val="Grid Table 6 Colorful"/>
-    <w:basedOn w:val="843"/>
+    <w:basedOn w:val="894"/>
     <w:uiPriority w:val="99"/>
     <w:pPr>
       <w:pBdr/>
@@ -12206,9 +12543,9 @@
       </w:tcPr>
     </w:tblStylePr>
   </w:style>
-  <w:style w:type="table" w:styleId="741">
+  <w:style w:type="table" w:styleId="792">
     <w:name w:val="Grid Table 6 Colorful - Accent 1"/>
-    <w:basedOn w:val="843"/>
+    <w:basedOn w:val="894"/>
     <w:uiPriority w:val="99"/>
     <w:pPr>
       <w:pBdr/>
@@ -12436,9 +12773,9 @@
       </w:tcPr>
     </w:tblStylePr>
   </w:style>
-  <w:style w:type="table" w:styleId="742">
+  <w:style w:type="table" w:styleId="793">
     <w:name w:val="Grid Table 6 Colorful - Accent 2"/>
-    <w:basedOn w:val="843"/>
+    <w:basedOn w:val="894"/>
     <w:uiPriority w:val="99"/>
     <w:pPr>
       <w:pBdr/>
@@ -12666,9 +13003,9 @@
       </w:tcPr>
     </w:tblStylePr>
   </w:style>
-  <w:style w:type="table" w:styleId="743">
+  <w:style w:type="table" w:styleId="794">
     <w:name w:val="Grid Table 6 Colorful - Accent 3"/>
-    <w:basedOn w:val="843"/>
+    <w:basedOn w:val="894"/>
     <w:uiPriority w:val="99"/>
     <w:pPr>
       <w:pBdr/>
@@ -12896,9 +13233,9 @@
       </w:tcPr>
     </w:tblStylePr>
   </w:style>
-  <w:style w:type="table" w:styleId="744">
+  <w:style w:type="table" w:styleId="795">
     <w:name w:val="Grid Table 6 Colorful - Accent 4"/>
-    <w:basedOn w:val="843"/>
+    <w:basedOn w:val="894"/>
     <w:uiPriority w:val="99"/>
     <w:pPr>
       <w:pBdr/>
@@ -13126,9 +13463,9 @@
       </w:tcPr>
     </w:tblStylePr>
   </w:style>
-  <w:style w:type="table" w:styleId="745">
+  <w:style w:type="table" w:styleId="796">
     <w:name w:val="Grid Table 6 Colorful - Accent 5"/>
-    <w:basedOn w:val="843"/>
+    <w:basedOn w:val="894"/>
     <w:uiPriority w:val="99"/>
     <w:pPr>
       <w:pBdr/>
@@ -13356,9 +13693,9 @@
       </w:tcPr>
     </w:tblStylePr>
   </w:style>
-  <w:style w:type="table" w:styleId="746">
+  <w:style w:type="table" w:styleId="797">
     <w:name w:val="Grid Table 6 Colorful - Accent 6"/>
-    <w:basedOn w:val="843"/>
+    <w:basedOn w:val="894"/>
     <w:uiPriority w:val="99"/>
     <w:pPr>
       <w:pBdr/>
@@ -13586,9 +13923,9 @@
       </w:tcPr>
     </w:tblStylePr>
   </w:style>
-  <w:style w:type="table" w:styleId="747">
+  <w:style w:type="table" w:styleId="798">
     <w:name w:val="Grid Table 7 Colorful"/>
-    <w:basedOn w:val="843"/>
+    <w:basedOn w:val="894"/>
     <w:uiPriority w:val="99"/>
     <w:pPr>
       <w:pBdr/>
@@ -13840,9 +14177,9 @@
       </w:tcPr>
     </w:tblStylePr>
   </w:style>
-  <w:style w:type="table" w:styleId="748">
+  <w:style w:type="table" w:styleId="799">
     <w:name w:val="Grid Table 7 Colorful - Accent 1"/>
-    <w:basedOn w:val="843"/>
+    <w:basedOn w:val="894"/>
     <w:uiPriority w:val="99"/>
     <w:pPr>
       <w:pBdr/>
@@ -14094,9 +14431,9 @@
       </w:tcPr>
     </w:tblStylePr>
   </w:style>
-  <w:style w:type="table" w:styleId="749">
+  <w:style w:type="table" w:styleId="800">
     <w:name w:val="Grid Table 7 Colorful - Accent 2"/>
-    <w:basedOn w:val="843"/>
+    <w:basedOn w:val="894"/>
     <w:uiPriority w:val="99"/>
     <w:pPr>
       <w:pBdr/>
@@ -14348,9 +14685,9 @@
       </w:tcPr>
     </w:tblStylePr>
   </w:style>
-  <w:style w:type="table" w:styleId="750">
+  <w:style w:type="table" w:styleId="801">
     <w:name w:val="Grid Table 7 Colorful - Accent 3"/>
-    <w:basedOn w:val="843"/>
+    <w:basedOn w:val="894"/>
     <w:uiPriority w:val="99"/>
     <w:pPr>
       <w:pBdr/>
@@ -14602,9 +14939,9 @@
       </w:tcPr>
     </w:tblStylePr>
   </w:style>
-  <w:style w:type="table" w:styleId="751">
+  <w:style w:type="table" w:styleId="802">
     <w:name w:val="Grid Table 7 Colorful - Accent 4"/>
-    <w:basedOn w:val="843"/>
+    <w:basedOn w:val="894"/>
     <w:uiPriority w:val="99"/>
     <w:pPr>
       <w:pBdr/>
@@ -14856,9 +15193,9 @@
       </w:tcPr>
     </w:tblStylePr>
   </w:style>
-  <w:style w:type="table" w:styleId="752">
+  <w:style w:type="table" w:styleId="803">
     <w:name w:val="Grid Table 7 Colorful - Accent 5"/>
-    <w:basedOn w:val="843"/>
+    <w:basedOn w:val="894"/>
     <w:uiPriority w:val="99"/>
     <w:pPr>
       <w:pBdr/>
@@ -15110,9 +15447,9 @@
       </w:tcPr>
     </w:tblStylePr>
   </w:style>
-  <w:style w:type="table" w:styleId="753">
+  <w:style w:type="table" w:styleId="804">
     <w:name w:val="Grid Table 7 Colorful - Accent 6"/>
-    <w:basedOn w:val="843"/>
+    <w:basedOn w:val="894"/>
     <w:uiPriority w:val="99"/>
     <w:pPr>
       <w:pBdr/>
@@ -15364,9 +15701,9 @@
       </w:tcPr>
     </w:tblStylePr>
   </w:style>
-  <w:style w:type="table" w:styleId="754">
+  <w:style w:type="table" w:styleId="805">
     <w:name w:val="List Table 1 Light"/>
-    <w:basedOn w:val="843"/>
+    <w:basedOn w:val="894"/>
     <w:uiPriority w:val="99"/>
     <w:pPr>
       <w:pBdr/>
@@ -15580,9 +15917,9 @@
       </w:tcPr>
     </w:tblStylePr>
   </w:style>
-  <w:style w:type="table" w:styleId="755">
+  <w:style w:type="table" w:styleId="806">
     <w:name w:val="List Table 1 Light - Accent 1"/>
-    <w:basedOn w:val="843"/>
+    <w:basedOn w:val="894"/>
     <w:uiPriority w:val="99"/>
     <w:pPr>
       <w:pBdr/>
@@ -15796,9 +16133,9 @@
       </w:tcPr>
     </w:tblStylePr>
   </w:style>
-  <w:style w:type="table" w:styleId="756">
+  <w:style w:type="table" w:styleId="807">
     <w:name w:val="List Table 1 Light - Accent 2"/>
-    <w:basedOn w:val="843"/>
+    <w:basedOn w:val="894"/>
     <w:uiPriority w:val="99"/>
     <w:pPr>
       <w:pBdr/>
@@ -16012,9 +16349,9 @@
       </w:tcPr>
     </w:tblStylePr>
   </w:style>
-  <w:style w:type="table" w:styleId="757">
+  <w:style w:type="table" w:styleId="808">
     <w:name w:val="List Table 1 Light - Accent 3"/>
-    <w:basedOn w:val="843"/>
+    <w:basedOn w:val="894"/>
     <w:uiPriority w:val="99"/>
     <w:pPr>
       <w:pBdr/>
@@ -16228,9 +16565,9 @@
       </w:tcPr>
     </w:tblStylePr>
   </w:style>
-  <w:style w:type="table" w:styleId="758">
+  <w:style w:type="table" w:styleId="809">
     <w:name w:val="List Table 1 Light - Accent 4"/>
-    <w:basedOn w:val="843"/>
+    <w:basedOn w:val="894"/>
     <w:uiPriority w:val="99"/>
     <w:pPr>
       <w:pBdr/>
@@ -16444,9 +16781,9 @@
       </w:tcPr>
     </w:tblStylePr>
   </w:style>
-  <w:style w:type="table" w:styleId="759">
+  <w:style w:type="table" w:styleId="810">
     <w:name w:val="List Table 1 Light - Accent 5"/>
-    <w:basedOn w:val="843"/>
+    <w:basedOn w:val="894"/>
     <w:uiPriority w:val="99"/>
     <w:pPr>
       <w:pBdr/>
@@ -16660,9 +16997,9 @@
       </w:tcPr>
     </w:tblStylePr>
   </w:style>
-  <w:style w:type="table" w:styleId="760">
+  <w:style w:type="table" w:styleId="811">
     <w:name w:val="List Table 1 Light - Accent 6"/>
-    <w:basedOn w:val="843"/>
+    <w:basedOn w:val="894"/>
     <w:uiPriority w:val="99"/>
     <w:pPr>
       <w:pBdr/>
@@ -16876,9 +17213,9 @@
       </w:tcPr>
     </w:tblStylePr>
   </w:style>
-  <w:style w:type="table" w:styleId="761">
+  <w:style w:type="table" w:styleId="812">
     <w:name w:val="List Table 2"/>
-    <w:basedOn w:val="843"/>
+    <w:basedOn w:val="894"/>
     <w:uiPriority w:val="99"/>
     <w:pPr>
       <w:pBdr/>
@@ -17114,9 +17451,9 @@
       </w:tcPr>
     </w:tblStylePr>
   </w:style>
-  <w:style w:type="table" w:styleId="762">
+  <w:style w:type="table" w:styleId="813">
     <w:name w:val="List Table 2 - Accent 1"/>
-    <w:basedOn w:val="843"/>
+    <w:basedOn w:val="894"/>
     <w:uiPriority w:val="99"/>
     <w:pPr>
       <w:pBdr/>
@@ -17352,9 +17689,9 @@
       </w:tcPr>
     </w:tblStylePr>
   </w:style>
-  <w:style w:type="table" w:styleId="763">
+  <w:style w:type="table" w:styleId="814">
     <w:name w:val="List Table 2 - Accent 2"/>
-    <w:basedOn w:val="843"/>
+    <w:basedOn w:val="894"/>
     <w:uiPriority w:val="99"/>
     <w:pPr>
       <w:pBdr/>
@@ -17590,9 +17927,9 @@
       </w:tcPr>
     </w:tblStylePr>
   </w:style>
-  <w:style w:type="table" w:styleId="764">
+  <w:style w:type="table" w:styleId="815">
     <w:name w:val="List Table 2 - Accent 3"/>
-    <w:basedOn w:val="843"/>
+    <w:basedOn w:val="894"/>
     <w:uiPriority w:val="99"/>
     <w:pPr>
       <w:pBdr/>
@@ -17828,9 +18165,9 @@
       </w:tcPr>
     </w:tblStylePr>
   </w:style>
-  <w:style w:type="table" w:styleId="765">
+  <w:style w:type="table" w:styleId="816">
     <w:name w:val="List Table 2 - Accent 4"/>
-    <w:basedOn w:val="843"/>
+    <w:basedOn w:val="894"/>
     <w:uiPriority w:val="99"/>
     <w:pPr>
       <w:pBdr/>
@@ -18066,9 +18403,9 @@
       </w:tcPr>
     </w:tblStylePr>
   </w:style>
-  <w:style w:type="table" w:styleId="766">
+  <w:style w:type="table" w:styleId="817">
     <w:name w:val="List Table 2 - Accent 5"/>
-    <w:basedOn w:val="843"/>
+    <w:basedOn w:val="894"/>
     <w:uiPriority w:val="99"/>
     <w:pPr>
       <w:pBdr/>
@@ -18304,9 +18641,9 @@
       </w:tcPr>
     </w:tblStylePr>
   </w:style>
-  <w:style w:type="table" w:styleId="767">
+  <w:style w:type="table" w:styleId="818">
     <w:name w:val="List Table 2 - Accent 6"/>
-    <w:basedOn w:val="843"/>
+    <w:basedOn w:val="894"/>
     <w:uiPriority w:val="99"/>
     <w:pPr>
       <w:pBdr/>
@@ -18542,9 +18879,9 @@
       </w:tcPr>
     </w:tblStylePr>
   </w:style>
-  <w:style w:type="table" w:styleId="768">
+  <w:style w:type="table" w:styleId="819">
     <w:name w:val="List Table 3"/>
-    <w:basedOn w:val="843"/>
+    <w:basedOn w:val="894"/>
     <w:uiPriority w:val="99"/>
     <w:pPr>
       <w:pBdr/>
@@ -18770,9 +19107,9 @@
       </w:tcPr>
     </w:tblStylePr>
   </w:style>
-  <w:style w:type="table" w:styleId="769">
+  <w:style w:type="table" w:styleId="820">
     <w:name w:val="List Table 3 - Accent 1"/>
-    <w:basedOn w:val="843"/>
+    <w:basedOn w:val="894"/>
     <w:uiPriority w:val="99"/>
     <w:pPr>
       <w:pBdr/>
@@ -18998,9 +19335,9 @@
       </w:tcPr>
     </w:tblStylePr>
   </w:style>
-  <w:style w:type="table" w:styleId="770">
+  <w:style w:type="table" w:styleId="821">
     <w:name w:val="List Table 3 - Accent 2"/>
-    <w:basedOn w:val="843"/>
+    <w:basedOn w:val="894"/>
     <w:uiPriority w:val="99"/>
     <w:pPr>
       <w:pBdr/>
@@ -19226,9 +19563,9 @@
       </w:tcPr>
     </w:tblStylePr>
   </w:style>
-  <w:style w:type="table" w:styleId="771">
+  <w:style w:type="table" w:styleId="822">
     <w:name w:val="List Table 3 - Accent 3"/>
-    <w:basedOn w:val="843"/>
+    <w:basedOn w:val="894"/>
     <w:uiPriority w:val="99"/>
     <w:pPr>
       <w:pBdr/>
@@ -19454,9 +19791,9 @@
       </w:tcPr>
     </w:tblStylePr>
   </w:style>
-  <w:style w:type="table" w:styleId="772">
+  <w:style w:type="table" w:styleId="823">
     <w:name w:val="List Table 3 - Accent 4"/>
-    <w:basedOn w:val="843"/>
+    <w:basedOn w:val="894"/>
     <w:uiPriority w:val="99"/>
     <w:pPr>
       <w:pBdr/>
@@ -19682,9 +20019,9 @@
       </w:tcPr>
     </w:tblStylePr>
   </w:style>
-  <w:style w:type="table" w:styleId="773">
+  <w:style w:type="table" w:styleId="824">
     <w:name w:val="List Table 3 - Accent 5"/>
-    <w:basedOn w:val="843"/>
+    <w:basedOn w:val="894"/>
     <w:uiPriority w:val="99"/>
     <w:pPr>
       <w:pBdr/>
@@ -19910,9 +20247,9 @@
       </w:tcPr>
     </w:tblStylePr>
   </w:style>
-  <w:style w:type="table" w:styleId="774">
+  <w:style w:type="table" w:styleId="825">
     <w:name w:val="List Table 3 - Accent 6"/>
-    <w:basedOn w:val="843"/>
+    <w:basedOn w:val="894"/>
     <w:uiPriority w:val="99"/>
     <w:pPr>
       <w:pBdr/>
@@ -20138,9 +20475,9 @@
       </w:tcPr>
     </w:tblStylePr>
   </w:style>
-  <w:style w:type="table" w:styleId="775">
+  <w:style w:type="table" w:styleId="826">
     <w:name w:val="List Table 4"/>
-    <w:basedOn w:val="843"/>
+    <w:basedOn w:val="894"/>
     <w:uiPriority w:val="99"/>
     <w:pPr>
       <w:pBdr/>
@@ -20363,9 +20700,9 @@
       </w:tcPr>
     </w:tblStylePr>
   </w:style>
-  <w:style w:type="table" w:styleId="776">
+  <w:style w:type="table" w:styleId="827">
     <w:name w:val="List Table 4 - Accent 1"/>
-    <w:basedOn w:val="843"/>
+    <w:basedOn w:val="894"/>
     <w:uiPriority w:val="99"/>
     <w:pPr>
       <w:pBdr/>
@@ -20588,9 +20925,9 @@
       </w:tcPr>
     </w:tblStylePr>
   </w:style>
-  <w:style w:type="table" w:styleId="777">
+  <w:style w:type="table" w:styleId="828">
     <w:name w:val="List Table 4 - Accent 2"/>
-    <w:basedOn w:val="843"/>
+    <w:basedOn w:val="894"/>
     <w:uiPriority w:val="99"/>
     <w:pPr>
       <w:pBdr/>
@@ -20813,9 +21150,9 @@
       </w:tcPr>
     </w:tblStylePr>
   </w:style>
-  <w:style w:type="table" w:styleId="778">
+  <w:style w:type="table" w:styleId="829">
     <w:name w:val="List Table 4 - Accent 3"/>
-    <w:basedOn w:val="843"/>
+    <w:basedOn w:val="894"/>
     <w:uiPriority w:val="99"/>
     <w:pPr>
       <w:pBdr/>
@@ -21038,9 +21375,9 @@
       </w:tcPr>
     </w:tblStylePr>
   </w:style>
-  <w:style w:type="table" w:styleId="779">
+  <w:style w:type="table" w:styleId="830">
     <w:name w:val="List Table 4 - Accent 4"/>
-    <w:basedOn w:val="843"/>
+    <w:basedOn w:val="894"/>
     <w:uiPriority w:val="99"/>
     <w:pPr>
       <w:pBdr/>
@@ -21263,9 +21600,9 @@
       </w:tcPr>
     </w:tblStylePr>
   </w:style>
-  <w:style w:type="table" w:styleId="780">
+  <w:style w:type="table" w:styleId="831">
     <w:name w:val="List Table 4 - Accent 5"/>
-    <w:basedOn w:val="843"/>
+    <w:basedOn w:val="894"/>
     <w:uiPriority w:val="99"/>
     <w:pPr>
       <w:pBdr/>
@@ -21488,9 +21825,9 @@
       </w:tcPr>
     </w:tblStylePr>
   </w:style>
-  <w:style w:type="table" w:styleId="781">
+  <w:style w:type="table" w:styleId="832">
     <w:name w:val="List Table 4 - Accent 6"/>
-    <w:basedOn w:val="843"/>
+    <w:basedOn w:val="894"/>
     <w:uiPriority w:val="99"/>
     <w:pPr>
       <w:pBdr/>
@@ -21713,9 +22050,9 @@
       </w:tcPr>
     </w:tblStylePr>
   </w:style>
-  <w:style w:type="table" w:styleId="782">
+  <w:style w:type="table" w:styleId="833">
     <w:name w:val="List Table 5 Dark"/>
-    <w:basedOn w:val="843"/>
+    <w:basedOn w:val="894"/>
     <w:uiPriority w:val="99"/>
     <w:pPr>
       <w:pBdr/>
@@ -21955,9 +22292,9 @@
       </w:tcPr>
     </w:tblStylePr>
   </w:style>
-  <w:style w:type="table" w:styleId="783">
+  <w:style w:type="table" w:styleId="834">
     <w:name w:val="List Table 5 Dark - Accent 1"/>
-    <w:basedOn w:val="843"/>
+    <w:basedOn w:val="894"/>
     <w:uiPriority w:val="99"/>
     <w:pPr>
       <w:pBdr/>
@@ -22197,9 +22534,9 @@
       </w:tcPr>
     </w:tblStylePr>
   </w:style>
-  <w:style w:type="table" w:styleId="784">
+  <w:style w:type="table" w:styleId="835">
     <w:name w:val="List Table 5 Dark - Accent 2"/>
-    <w:basedOn w:val="843"/>
+    <w:basedOn w:val="894"/>
     <w:uiPriority w:val="99"/>
     <w:pPr>
       <w:pBdr/>
@@ -22439,9 +22776,9 @@
       </w:tcPr>
     </w:tblStylePr>
   </w:style>
-  <w:style w:type="table" w:styleId="785">
+  <w:style w:type="table" w:styleId="836">
     <w:name w:val="List Table 5 Dark - Accent 3"/>
-    <w:basedOn w:val="843"/>
+    <w:basedOn w:val="894"/>
     <w:uiPriority w:val="99"/>
     <w:pPr>
       <w:pBdr/>
@@ -22681,9 +23018,9 @@
       </w:tcPr>
     </w:tblStylePr>
   </w:style>
-  <w:style w:type="table" w:styleId="786">
+  <w:style w:type="table" w:styleId="837">
     <w:name w:val="List Table 5 Dark - Accent 4"/>
-    <w:basedOn w:val="843"/>
+    <w:basedOn w:val="894"/>
     <w:uiPriority w:val="99"/>
     <w:pPr>
       <w:pBdr/>
@@ -22923,9 +23260,9 @@
       </w:tcPr>
     </w:tblStylePr>
   </w:style>
-  <w:style w:type="table" w:styleId="787">
+  <w:style w:type="table" w:styleId="838">
     <w:name w:val="List Table 5 Dark - Accent 5"/>
-    <w:basedOn w:val="843"/>
+    <w:basedOn w:val="894"/>
     <w:uiPriority w:val="99"/>
     <w:pPr>
       <w:pBdr/>
@@ -23165,9 +23502,9 @@
       </w:tcPr>
     </w:tblStylePr>
   </w:style>
-  <w:style w:type="table" w:styleId="788">
+  <w:style w:type="table" w:styleId="839">
     <w:name w:val="List Table 5 Dark - Accent 6"/>
-    <w:basedOn w:val="843"/>
+    <w:basedOn w:val="894"/>
     <w:uiPriority w:val="99"/>
     <w:pPr>
       <w:pBdr/>
@@ -23407,9 +23744,9 @@
       </w:tcPr>
     </w:tblStylePr>
   </w:style>
-  <w:style w:type="table" w:styleId="789">
+  <w:style w:type="table" w:styleId="840">
     <w:name w:val="List Table 6 Colorful"/>
-    <w:basedOn w:val="843"/>
+    <w:basedOn w:val="894"/>
     <w:uiPriority w:val="99"/>
     <w:pPr>
       <w:pBdr/>
@@ -23630,9 +23967,9 @@
       </w:tcPr>
     </w:tblStylePr>
   </w:style>
-  <w:style w:type="table" w:styleId="790">
+  <w:style w:type="table" w:styleId="841">
     <w:name w:val="List Table 6 Colorful - Accent 1"/>
-    <w:basedOn w:val="843"/>
+    <w:basedOn w:val="894"/>
     <w:uiPriority w:val="99"/>
     <w:pPr>
       <w:pBdr/>
@@ -23853,9 +24190,9 @@
       </w:tcPr>
     </w:tblStylePr>
   </w:style>
-  <w:style w:type="table" w:styleId="791">
+  <w:style w:type="table" w:styleId="842">
     <w:name w:val="List Table 6 Colorful - Accent 2"/>
-    <w:basedOn w:val="843"/>
+    <w:basedOn w:val="894"/>
     <w:uiPriority w:val="99"/>
     <w:pPr>
       <w:pBdr/>
@@ -24076,9 +24413,9 @@
       </w:tcPr>
     </w:tblStylePr>
   </w:style>
-  <w:style w:type="table" w:styleId="792">
+  <w:style w:type="table" w:styleId="843">
     <w:name w:val="List Table 6 Colorful - Accent 3"/>
-    <w:basedOn w:val="843"/>
+    <w:basedOn w:val="894"/>
     <w:uiPriority w:val="99"/>
     <w:pPr>
       <w:pBdr/>
@@ -24299,9 +24636,9 @@
       </w:tcPr>
     </w:tblStylePr>
   </w:style>
-  <w:style w:type="table" w:styleId="793">
+  <w:style w:type="table" w:styleId="844">
     <w:name w:val="List Table 6 Colorful - Accent 4"/>
-    <w:basedOn w:val="843"/>
+    <w:basedOn w:val="894"/>
     <w:uiPriority w:val="99"/>
     <w:pPr>
       <w:pBdr/>
@@ -24522,9 +24859,9 @@
       </w:tcPr>
     </w:tblStylePr>
   </w:style>
-  <w:style w:type="table" w:styleId="794">
+  <w:style w:type="table" w:styleId="845">
     <w:name w:val="List Table 6 Colorful - Accent 5"/>
-    <w:basedOn w:val="843"/>
+    <w:basedOn w:val="894"/>
     <w:uiPriority w:val="99"/>
     <w:pPr>
       <w:pBdr/>
@@ -24745,9 +25082,9 @@
       </w:tcPr>
     </w:tblStylePr>
   </w:style>
-  <w:style w:type="table" w:styleId="795">
+  <w:style w:type="table" w:styleId="846">
     <w:name w:val="List Table 6 Colorful - Accent 6"/>
-    <w:basedOn w:val="843"/>
+    <w:basedOn w:val="894"/>
     <w:uiPriority w:val="99"/>
     <w:pPr>
       <w:pBdr/>
@@ -24968,9 +25305,9 @@
       </w:tcPr>
     </w:tblStylePr>
   </w:style>
-  <w:style w:type="table" w:styleId="796">
+  <w:style w:type="table" w:styleId="847">
     <w:name w:val="List Table 7 Colorful"/>
-    <w:basedOn w:val="843"/>
+    <w:basedOn w:val="894"/>
     <w:uiPriority w:val="99"/>
     <w:pPr>
       <w:pBdr/>
@@ -25224,9 +25561,9 @@
       </w:tcPr>
     </w:tblStylePr>
   </w:style>
-  <w:style w:type="table" w:styleId="797">
+  <w:style w:type="table" w:styleId="848">
     <w:name w:val="List Table 7 Colorful - Accent 1"/>
-    <w:basedOn w:val="843"/>
+    <w:basedOn w:val="894"/>
     <w:uiPriority w:val="99"/>
     <w:pPr>
       <w:pBdr/>
@@ -25480,9 +25817,9 @@
       </w:tcPr>
     </w:tblStylePr>
   </w:style>
-  <w:style w:type="table" w:styleId="798">
+  <w:style w:type="table" w:styleId="849">
     <w:name w:val="List Table 7 Colorful - Accent 2"/>
-    <w:basedOn w:val="843"/>
+    <w:basedOn w:val="894"/>
     <w:uiPriority w:val="99"/>
     <w:pPr>
       <w:pBdr/>
@@ -25736,9 +26073,9 @@
       </w:tcPr>
     </w:tblStylePr>
   </w:style>
-  <w:style w:type="table" w:styleId="799">
+  <w:style w:type="table" w:styleId="850">
     <w:name w:val="List Table 7 Colorful - Accent 3"/>
-    <w:basedOn w:val="843"/>
+    <w:basedOn w:val="894"/>
     <w:uiPriority w:val="99"/>
     <w:pPr>
       <w:pBdr/>
@@ -25992,9 +26329,9 @@
       </w:tcPr>
     </w:tblStylePr>
   </w:style>
-  <w:style w:type="table" w:styleId="800">
+  <w:style w:type="table" w:styleId="851">
     <w:name w:val="List Table 7 Colorful - Accent 4"/>
-    <w:basedOn w:val="843"/>
+    <w:basedOn w:val="894"/>
     <w:uiPriority w:val="99"/>
     <w:pPr>
       <w:pBdr/>
@@ -26248,9 +26585,9 @@
       </w:tcPr>
     </w:tblStylePr>
   </w:style>
-  <w:style w:type="table" w:styleId="801">
+  <w:style w:type="table" w:styleId="852">
     <w:name w:val="List Table 7 Colorful - Accent 5"/>
-    <w:basedOn w:val="843"/>
+    <w:basedOn w:val="894"/>
     <w:uiPriority w:val="99"/>
     <w:pPr>
       <w:pBdr/>
@@ -26504,9 +26841,9 @@
       </w:tcPr>
     </w:tblStylePr>
   </w:style>
-  <w:style w:type="table" w:styleId="802">
+  <w:style w:type="table" w:styleId="853">
     <w:name w:val="List Table 7 Colorful - Accent 6"/>
-    <w:basedOn w:val="843"/>
+    <w:basedOn w:val="894"/>
     <w:uiPriority w:val="99"/>
     <w:pPr>
       <w:pBdr/>
@@ -26760,9 +27097,9 @@
       </w:tcPr>
     </w:tblStylePr>
   </w:style>
-  <w:style w:type="table" w:styleId="803">
+  <w:style w:type="table" w:styleId="854">
     <w:name w:val="Lined - Accent"/>
-    <w:basedOn w:val="843"/>
+    <w:basedOn w:val="894"/>
     <w:uiPriority w:val="99"/>
     <w:pPr>
       <w:pBdr/>
@@ -26997,9 +27334,9 @@
       </w:tcPr>
     </w:tblStylePr>
   </w:style>
-  <w:style w:type="table" w:styleId="804">
+  <w:style w:type="table" w:styleId="855">
     <w:name w:val="Lined - Accent 1"/>
-    <w:basedOn w:val="843"/>
+    <w:basedOn w:val="894"/>
     <w:uiPriority w:val="99"/>
     <w:pPr>
       <w:pBdr/>
@@ -27234,9 +27571,9 @@
       </w:tcPr>
     </w:tblStylePr>
   </w:style>
-  <w:style w:type="table" w:styleId="805">
+  <w:style w:type="table" w:styleId="856">
     <w:name w:val="Lined - Accent 2"/>
-    <w:basedOn w:val="843"/>
+    <w:basedOn w:val="894"/>
     <w:uiPriority w:val="99"/>
     <w:pPr>
       <w:pBdr/>
@@ -27471,9 +27808,9 @@
       </w:tcPr>
     </w:tblStylePr>
   </w:style>
-  <w:style w:type="table" w:styleId="806">
+  <w:style w:type="table" w:styleId="857">
     <w:name w:val="Lined - Accent 3"/>
-    <w:basedOn w:val="843"/>
+    <w:basedOn w:val="894"/>
     <w:uiPriority w:val="99"/>
     <w:pPr>
       <w:pBdr/>
@@ -27708,9 +28045,9 @@
       </w:tcPr>
     </w:tblStylePr>
   </w:style>
-  <w:style w:type="table" w:styleId="807">
+  <w:style w:type="table" w:styleId="858">
     <w:name w:val="Lined - Accent 4"/>
-    <w:basedOn w:val="843"/>
+    <w:basedOn w:val="894"/>
     <w:uiPriority w:val="99"/>
     <w:pPr>
       <w:pBdr/>
@@ -27945,9 +28282,9 @@
       </w:tcPr>
     </w:tblStylePr>
   </w:style>
-  <w:style w:type="table" w:styleId="808">
+  <w:style w:type="table" w:styleId="859">
     <w:name w:val="Lined - Accent 5"/>
-    <w:basedOn w:val="843"/>
+    <w:basedOn w:val="894"/>
     <w:uiPriority w:val="99"/>
     <w:pPr>
       <w:pBdr/>
@@ -28182,9 +28519,9 @@
       </w:tcPr>
     </w:tblStylePr>
   </w:style>
-  <w:style w:type="table" w:styleId="809">
+  <w:style w:type="table" w:styleId="860">
     <w:name w:val="Lined - Accent 6"/>
-    <w:basedOn w:val="843"/>
+    <w:basedOn w:val="894"/>
     <w:uiPriority w:val="99"/>
     <w:pPr>
       <w:pBdr/>
@@ -28419,9 +28756,9 @@
       </w:tcPr>
     </w:tblStylePr>
   </w:style>
-  <w:style w:type="table" w:styleId="810">
+  <w:style w:type="table" w:styleId="861">
     <w:name w:val="Bordered &amp; Lined - Accent"/>
-    <w:basedOn w:val="843"/>
+    <w:basedOn w:val="894"/>
     <w:uiPriority w:val="99"/>
     <w:pPr>
       <w:pBdr/>
@@ -28663,9 +29000,9 @@
       </w:tcPr>
     </w:tblStylePr>
   </w:style>
-  <w:style w:type="table" w:styleId="811">
+  <w:style w:type="table" w:styleId="862">
     <w:name w:val="Bordered &amp; Lined - Accent 1"/>
-    <w:basedOn w:val="843"/>
+    <w:basedOn w:val="894"/>
     <w:uiPriority w:val="99"/>
     <w:pPr>
       <w:pBdr/>
@@ -28907,9 +29244,9 @@
       </w:tcPr>
     </w:tblStylePr>
   </w:style>
-  <w:style w:type="table" w:styleId="812">
+  <w:style w:type="table" w:styleId="863">
     <w:name w:val="Bordered &amp; Lined - Accent 2"/>
-    <w:basedOn w:val="843"/>
+    <w:basedOn w:val="894"/>
     <w:uiPriority w:val="99"/>
     <w:pPr>
       <w:pBdr/>
@@ -29151,9 +29488,9 @@
       </w:tcPr>
     </w:tblStylePr>
   </w:style>
-  <w:style w:type="table" w:styleId="813">
+  <w:style w:type="table" w:styleId="864">
     <w:name w:val="Bordered &amp; Lined - Accent 3"/>
-    <w:basedOn w:val="843"/>
+    <w:basedOn w:val="894"/>
     <w:uiPriority w:val="99"/>
     <w:pPr>
       <w:pBdr/>
@@ -29395,9 +29732,9 @@
       </w:tcPr>
     </w:tblStylePr>
   </w:style>
-  <w:style w:type="table" w:styleId="814">
+  <w:style w:type="table" w:styleId="865">
     <w:name w:val="Bordered &amp; Lined - Accent 4"/>
-    <w:basedOn w:val="843"/>
+    <w:basedOn w:val="894"/>
     <w:uiPriority w:val="99"/>
     <w:pPr>
       <w:pBdr/>
@@ -29639,9 +29976,9 @@
       </w:tcPr>
     </w:tblStylePr>
   </w:style>
-  <w:style w:type="table" w:styleId="815">
+  <w:style w:type="table" w:styleId="866">
     <w:name w:val="Bordered &amp; Lined - Accent 5"/>
-    <w:basedOn w:val="843"/>
+    <w:basedOn w:val="894"/>
     <w:uiPriority w:val="99"/>
     <w:pPr>
       <w:pBdr/>
@@ -29883,9 +30220,9 @@
       </w:tcPr>
     </w:tblStylePr>
   </w:style>
-  <w:style w:type="table" w:styleId="816">
+  <w:style w:type="table" w:styleId="867">
     <w:name w:val="Bordered &amp; Lined - Accent 6"/>
-    <w:basedOn w:val="843"/>
+    <w:basedOn w:val="894"/>
     <w:uiPriority w:val="99"/>
     <w:pPr>
       <w:pBdr/>
@@ -30127,9 +30464,9 @@
       </w:tcPr>
     </w:tblStylePr>
   </w:style>
-  <w:style w:type="table" w:styleId="817">
+  <w:style w:type="table" w:styleId="868">
     <w:name w:val="Bordered"/>
-    <w:basedOn w:val="843"/>
+    <w:basedOn w:val="894"/>
     <w:uiPriority w:val="99"/>
     <w:pPr>
       <w:pBdr/>
@@ -30358,9 +30695,9 @@
       </w:tcPr>
     </w:tblStylePr>
   </w:style>
-  <w:style w:type="table" w:styleId="818">
+  <w:style w:type="table" w:styleId="869">
     <w:name w:val="Bordered - Accent 1"/>
-    <w:basedOn w:val="843"/>
+    <w:basedOn w:val="894"/>
     <w:uiPriority w:val="99"/>
     <w:pPr>
       <w:pBdr/>
@@ -30589,9 +30926,9 @@
       </w:tcPr>
     </w:tblStylePr>
   </w:style>
-  <w:style w:type="table" w:styleId="819">
+  <w:style w:type="table" w:styleId="870">
     <w:name w:val="Bordered - Accent 2"/>
-    <w:basedOn w:val="843"/>
+    <w:basedOn w:val="894"/>
     <w:uiPriority w:val="99"/>
     <w:pPr>
       <w:pBdr/>
@@ -30820,9 +31157,9 @@
       </w:tcPr>
     </w:tblStylePr>
   </w:style>
-  <w:style w:type="table" w:styleId="820">
+  <w:style w:type="table" w:styleId="871">
     <w:name w:val="Bordered - Accent 3"/>
-    <w:basedOn w:val="843"/>
+    <w:basedOn w:val="894"/>
     <w:uiPriority w:val="99"/>
     <w:pPr>
       <w:pBdr/>
@@ -31051,9 +31388,9 @@
       </w:tcPr>
     </w:tblStylePr>
   </w:style>
-  <w:style w:type="table" w:styleId="821">
+  <w:style w:type="table" w:styleId="872">
     <w:name w:val="Bordered - Accent 4"/>
-    <w:basedOn w:val="843"/>
+    <w:basedOn w:val="894"/>
     <w:uiPriority w:val="99"/>
     <w:pPr>
       <w:pBdr/>
@@ -31282,9 +31619,9 @@
       </w:tcPr>
     </w:tblStylePr>
   </w:style>
-  <w:style w:type="table" w:styleId="822">
+  <w:style w:type="table" w:styleId="873">
     <w:name w:val="Bordered - Accent 5"/>
-    <w:basedOn w:val="843"/>
+    <w:basedOn w:val="894"/>
     <w:uiPriority w:val="99"/>
     <w:pPr>
       <w:pBdr/>
@@ -31513,9 +31850,9 @@
       </w:tcPr>
     </w:tblStylePr>
   </w:style>
-  <w:style w:type="table" w:styleId="823">
+  <w:style w:type="table" w:styleId="874">
     <w:name w:val="Bordered - Accent 6"/>
-    <w:basedOn w:val="843"/>
+    <w:basedOn w:val="894"/>
     <w:uiPriority w:val="99"/>
     <w:pPr>
       <w:pBdr/>
@@ -31744,7 +32081,7 @@
       </w:tcPr>
     </w:tblStylePr>
   </w:style>
-  <w:style w:type="character" w:styleId="824">
+  <w:style w:type="character" w:styleId="875">
     <w:name w:val="Hyperlink"/>
     <w:uiPriority w:val="99"/>
     <w:unhideWhenUsed/>
@@ -31758,10 +32095,10 @@
       <w:u w:val="single"/>
     </w:rPr>
   </w:style>
-  <w:style w:type="paragraph" w:styleId="825">
+  <w:style w:type="paragraph" w:styleId="876">
     <w:name w:val="footnote text"/>
-    <w:basedOn w:val="842"/>
-    <w:link w:val="826"/>
+    <w:basedOn w:val="893"/>
+    <w:link w:val="877"/>
     <w:uiPriority w:val="99"/>
     <w:semiHidden/>
     <w:unhideWhenUsed/>
@@ -31774,9 +32111,9 @@
       <w:sz w:val="18"/>
     </w:rPr>
   </w:style>
-  <w:style w:type="character" w:styleId="826">
+  <w:style w:type="character" w:styleId="877">
     <w:name w:val="Footnote Text Char"/>
-    <w:link w:val="825"/>
+    <w:link w:val="876"/>
     <w:uiPriority w:val="99"/>
     <w:pPr>
       <w:pBdr/>
@@ -31787,7 +32124,7 @@
       <w:sz w:val="18"/>
     </w:rPr>
   </w:style>
-  <w:style w:type="character" w:styleId="827">
+  <w:style w:type="character" w:styleId="878">
     <w:name w:val="footnote reference"/>
     <w:uiPriority w:val="99"/>
     <w:unhideWhenUsed/>
@@ -31800,10 +32137,10 @@
       <w:vertAlign w:val="superscript"/>
     </w:rPr>
   </w:style>
-  <w:style w:type="paragraph" w:styleId="828">
+  <w:style w:type="paragraph" w:styleId="879">
     <w:name w:val="endnote text"/>
-    <w:basedOn w:val="842"/>
-    <w:link w:val="829"/>
+    <w:basedOn w:val="893"/>
+    <w:link w:val="880"/>
     <w:uiPriority w:val="99"/>
     <w:semiHidden/>
     <w:unhideWhenUsed/>
@@ -31816,9 +32153,9 @@
       <w:sz w:val="20"/>
     </w:rPr>
   </w:style>
-  <w:style w:type="character" w:styleId="829">
+  <w:style w:type="character" w:styleId="880">
     <w:name w:val="Endnote Text Char"/>
-    <w:link w:val="828"/>
+    <w:link w:val="879"/>
     <w:uiPriority w:val="99"/>
     <w:pPr>
       <w:pBdr/>
@@ -31829,7 +32166,7 @@
       <w:sz w:val="20"/>
     </w:rPr>
   </w:style>
-  <w:style w:type="character" w:styleId="830">
+  <w:style w:type="character" w:styleId="881">
     <w:name w:val="endnote reference"/>
     <w:uiPriority w:val="99"/>
     <w:semiHidden/>
@@ -31843,10 +32180,10 @@
       <w:vertAlign w:val="superscript"/>
     </w:rPr>
   </w:style>
-  <w:style w:type="paragraph" w:styleId="831">
+  <w:style w:type="paragraph" w:styleId="882">
     <w:name w:val="toc 1"/>
-    <w:basedOn w:val="842"/>
-    <w:next w:val="842"/>
+    <w:basedOn w:val="893"/>
+    <w:next w:val="893"/>
     <w:uiPriority w:val="39"/>
     <w:unhideWhenUsed/>
     <w:pPr>
@@ -31855,10 +32192,10 @@
       <w:ind w:right="0" w:firstLine="0" w:left="0"/>
     </w:pPr>
   </w:style>
-  <w:style w:type="paragraph" w:styleId="832">
+  <w:style w:type="paragraph" w:styleId="883">
     <w:name w:val="toc 2"/>
-    <w:basedOn w:val="842"/>
-    <w:next w:val="842"/>
+    <w:basedOn w:val="893"/>
+    <w:next w:val="893"/>
     <w:uiPriority w:val="39"/>
     <w:unhideWhenUsed/>
     <w:pPr>
@@ -31867,10 +32204,10 @@
       <w:ind w:right="0" w:firstLine="0" w:left="283"/>
     </w:pPr>
   </w:style>
-  <w:style w:type="paragraph" w:styleId="833">
+  <w:style w:type="paragraph" w:styleId="884">
     <w:name w:val="toc 3"/>
-    <w:basedOn w:val="842"/>
-    <w:next w:val="842"/>
+    <w:basedOn w:val="893"/>
+    <w:next w:val="893"/>
     <w:uiPriority w:val="39"/>
     <w:unhideWhenUsed/>
     <w:pPr>
@@ -31879,10 +32216,10 @@
       <w:ind w:right="0" w:firstLine="0" w:left="567"/>
     </w:pPr>
   </w:style>
-  <w:style w:type="paragraph" w:styleId="834">
+  <w:style w:type="paragraph" w:styleId="885">
     <w:name w:val="toc 4"/>
-    <w:basedOn w:val="842"/>
-    <w:next w:val="842"/>
+    <w:basedOn w:val="893"/>
+    <w:next w:val="893"/>
     <w:uiPriority w:val="39"/>
     <w:unhideWhenUsed/>
     <w:pPr>
@@ -31891,10 +32228,10 @@
       <w:ind w:right="0" w:firstLine="0" w:left="850"/>
     </w:pPr>
   </w:style>
-  <w:style w:type="paragraph" w:styleId="835">
+  <w:style w:type="paragraph" w:styleId="886">
     <w:name w:val="toc 5"/>
-    <w:basedOn w:val="842"/>
-    <w:next w:val="842"/>
+    <w:basedOn w:val="893"/>
+    <w:next w:val="893"/>
     <w:uiPriority w:val="39"/>
     <w:unhideWhenUsed/>
     <w:pPr>
@@ -31903,10 +32240,10 @@
       <w:ind w:right="0" w:firstLine="0" w:left="1134"/>
     </w:pPr>
   </w:style>
-  <w:style w:type="paragraph" w:styleId="836">
+  <w:style w:type="paragraph" w:styleId="887">
     <w:name w:val="toc 6"/>
-    <w:basedOn w:val="842"/>
-    <w:next w:val="842"/>
+    <w:basedOn w:val="893"/>
+    <w:next w:val="893"/>
     <w:uiPriority w:val="39"/>
     <w:unhideWhenUsed/>
     <w:pPr>
@@ -31915,10 +32252,10 @@
       <w:ind w:right="0" w:firstLine="0" w:left="1417"/>
     </w:pPr>
   </w:style>
-  <w:style w:type="paragraph" w:styleId="837">
+  <w:style w:type="paragraph" w:styleId="888">
     <w:name w:val="toc 7"/>
-    <w:basedOn w:val="842"/>
-    <w:next w:val="842"/>
+    <w:basedOn w:val="893"/>
+    <w:next w:val="893"/>
     <w:uiPriority w:val="39"/>
     <w:unhideWhenUsed/>
     <w:pPr>
@@ -31927,10 +32264,10 @@
       <w:ind w:right="0" w:firstLine="0" w:left="1701"/>
     </w:pPr>
   </w:style>
-  <w:style w:type="paragraph" w:styleId="838">
+  <w:style w:type="paragraph" w:styleId="889">
     <w:name w:val="toc 8"/>
-    <w:basedOn w:val="842"/>
-    <w:next w:val="842"/>
+    <w:basedOn w:val="893"/>
+    <w:next w:val="893"/>
     <w:uiPriority w:val="39"/>
     <w:unhideWhenUsed/>
     <w:pPr>
@@ -31939,10 +32276,10 @@
       <w:ind w:right="0" w:firstLine="0" w:left="1984"/>
     </w:pPr>
   </w:style>
-  <w:style w:type="paragraph" w:styleId="839">
+  <w:style w:type="paragraph" w:styleId="890">
     <w:name w:val="toc 9"/>
-    <w:basedOn w:val="842"/>
-    <w:next w:val="842"/>
+    <w:basedOn w:val="893"/>
+    <w:next w:val="893"/>
     <w:uiPriority w:val="39"/>
     <w:unhideWhenUsed/>
     <w:pPr>
@@ -31951,7 +32288,7 @@
       <w:ind w:right="0" w:firstLine="0" w:left="2268"/>
     </w:pPr>
   </w:style>
-  <w:style w:type="paragraph" w:styleId="840">
+  <w:style w:type="paragraph" w:styleId="891">
     <w:name w:val="TOC Heading"/>
     <w:uiPriority w:val="39"/>
     <w:unhideWhenUsed/>
@@ -31961,10 +32298,10 @@
       <w:ind/>
     </w:pPr>
   </w:style>
-  <w:style w:type="paragraph" w:styleId="841">
+  <w:style w:type="paragraph" w:styleId="892">
     <w:name w:val="table of figures"/>
-    <w:basedOn w:val="842"/>
-    <w:next w:val="842"/>
+    <w:basedOn w:val="893"/>
+    <w:next w:val="893"/>
     <w:uiPriority w:val="99"/>
     <w:unhideWhenUsed/>
     <w:pPr>
@@ -31973,7 +32310,7 @@
       <w:ind/>
     </w:pPr>
   </w:style>
-  <w:style w:type="paragraph" w:styleId="842" w:default="1">
+  <w:style w:type="paragraph" w:styleId="893" w:default="1">
     <w:name w:val="Normal"/>
     <w:qFormat/>
     <w:pPr>
@@ -31982,7 +32319,7 @@
       <w:ind/>
     </w:pPr>
   </w:style>
-  <w:style w:type="table" w:styleId="843" w:default="1">
+  <w:style w:type="table" w:styleId="894" w:default="1">
     <w:name w:val="Normal Table"/>
     <w:uiPriority w:val="99"/>
     <w:semiHidden/>
@@ -32175,7 +32512,7 @@
       </w:tcPr>
     </w:tblStylePr>
   </w:style>
-  <w:style w:type="numbering" w:styleId="844" w:default="1">
+  <w:style w:type="numbering" w:styleId="895" w:default="1">
     <w:name w:val="No List"/>
     <w:uiPriority w:val="99"/>
     <w:semiHidden/>
@@ -32186,9 +32523,9 @@
       <w:ind/>
     </w:pPr>
   </w:style>
-  <w:style w:type="paragraph" w:styleId="845">
+  <w:style w:type="paragraph" w:styleId="896">
     <w:name w:val="No Spacing"/>
-    <w:basedOn w:val="842"/>
+    <w:basedOn w:val="893"/>
     <w:uiPriority w:val="1"/>
     <w:qFormat/>
     <w:pPr>
@@ -32197,9 +32534,9 @@
       <w:ind/>
     </w:pPr>
   </w:style>
-  <w:style w:type="paragraph" w:styleId="846">
+  <w:style w:type="paragraph" w:styleId="897">
     <w:name w:val="List Paragraph"/>
-    <w:basedOn w:val="842"/>
+    <w:basedOn w:val="893"/>
     <w:uiPriority w:val="34"/>
     <w:qFormat/>
     <w:pPr>
@@ -32209,7 +32546,7 @@
       <w:contextualSpacing w:val="true"/>
     </w:pPr>
   </w:style>
-  <w:style w:type="character" w:styleId="847" w:default="1">
+  <w:style w:type="character" w:styleId="898" w:default="1">
     <w:name w:val="Default Paragraph Font"/>
     <w:uiPriority w:val="1"/>
     <w:semiHidden/>
@@ -32226,42 +32563,42 @@
 <file path=word/theme/theme1.xml><?xml version="1.0" encoding="utf-8"?>
 <a:theme xmlns:a="http://schemas.openxmlformats.org/drawingml/2006/main" xmlns:r="http://schemas.openxmlformats.org/officeDocument/2006/relationships" xmlns:p="http://schemas.openxmlformats.org/presentationml/2006/main" name="Office Theme">
   <a:themeElements>
-    <a:clrScheme name="New Office">
+    <a:clrScheme name="Opulent">
       <a:dk1>
-        <a:sysClr val="windowText" lastClr="000000"/>
+        <a:srgbClr val="000000"/>
       </a:dk1>
       <a:lt1>
-        <a:sysClr val="window" lastClr="FFFFFF"/>
+        <a:srgbClr val="FFFFFF"/>
       </a:lt1>
       <a:dk2>
-        <a:srgbClr val="44546A"/>
+        <a:srgbClr val="B13F9A"/>
       </a:dk2>
       <a:lt2>
-        <a:srgbClr val="E7E6E6"/>
+        <a:srgbClr val="F4E7ED"/>
       </a:lt2>
       <a:accent1>
-        <a:srgbClr val="5B9BD5"/>
+        <a:srgbClr val="B83D68"/>
       </a:accent1>
       <a:accent2>
-        <a:srgbClr val="ED7D31"/>
+        <a:srgbClr val="AC66BB"/>
       </a:accent2>
       <a:accent3>
-        <a:srgbClr val="A5A5A5"/>
+        <a:srgbClr val="DE6C36"/>
       </a:accent3>
       <a:accent4>
-        <a:srgbClr val="FFC000"/>
+        <a:srgbClr val="F9B639"/>
       </a:accent4>
       <a:accent5>
-        <a:srgbClr val="4472C4"/>
+        <a:srgbClr val="CF6DA4"/>
       </a:accent5>
       <a:accent6>
-        <a:srgbClr val="70AD47"/>
+        <a:srgbClr val="FA8D3D"/>
       </a:accent6>
       <a:hlink>
-        <a:srgbClr val="0563C1"/>
+        <a:srgbClr val="FFDE66"/>
       </a:hlink>
       <a:folHlink>
-        <a:srgbClr val="954F72"/>
+        <a:srgbClr val="D490C5"/>
       </a:folHlink>
     </a:clrScheme>
     <a:fontScheme name="Office Classic 2">

</xml_diff>

<commit_message>
updated ad stuff (flyers)
</commit_message>
<xml_diff>
--- a/flyers/Flyer.docx
+++ b/flyers/Flyer.docx
@@ -4,7 +4,7 @@
   <w:body>
     <w:tbl>
       <w:tblPr>
-        <w:tblStyle w:val="749"/>
+        <w:tblStyle w:val="826"/>
         <w:tblW w:w="0" w:type="auto"/>
         <w:tblBorders/>
         <w:tblLook w:val="04A0" w:firstRow="1" w:lastRow="0" w:firstColumn="1" w:lastColumn="0" w:noHBand="0" w:noVBand="1"/>
@@ -32,7 +32,7 @@
           </w:tcPr>
           <w:p>
             <w:pPr>
-              <w:pStyle w:val="719"/>
+              <w:pStyle w:val="796"/>
               <w:pBdr/>
               <w:spacing/>
               <w:ind/>
@@ -41,10 +41,6 @@
                 <w14:ligatures w14:val="none"/>
               </w:rPr>
             </w:pPr>
-            <w:r/>
-            <w:r/>
-            <w:r/>
-            <w:r/>
             <w:r>
               <w:t xml:space="preserve">Interaktive Karte</w:t>
             </w:r>
@@ -86,7 +82,7 @@
           </w:tcPr>
           <w:p>
             <w:pPr>
-              <w:pStyle w:val="719"/>
+              <w:pStyle w:val="796"/>
               <w:pBdr/>
               <w:spacing/>
               <w:ind/>
@@ -124,7 +120,7 @@
           </w:tcPr>
           <w:p>
             <w:pPr>
-              <w:pStyle w:val="719"/>
+              <w:pStyle w:val="796"/>
               <w:pBdr/>
               <w:spacing/>
               <w:ind/>
@@ -167,7 +163,7 @@
           </w:tcPr>
           <w:p>
             <w:pPr>
-              <w:pStyle w:val="719"/>
+              <w:pStyle w:val="796"/>
               <w:pBdr/>
               <w:spacing/>
               <w:ind/>
@@ -318,6 +314,11 @@
                 <w:highlight w:val="none"/>
               </w:rPr>
             </w:r>
+            <w:r>
+              <w:rPr>
+                <w:highlight w:val="none"/>
+              </w:rPr>
+            </w:r>
           </w:p>
         </w:tc>
         <w:tc>
@@ -334,7 +335,7 @@
           </w:tcPr>
           <w:p>
             <w:pPr>
-              <w:pStyle w:val="719"/>
+              <w:pStyle w:val="796"/>
               <w:pBdr/>
               <w:spacing/>
               <w:ind/>
@@ -362,7 +363,7 @@
     </w:tbl>
     <w:tbl>
       <w:tblPr>
-        <w:tblStyle w:val="749"/>
+        <w:tblStyle w:val="826"/>
         <w:tblW w:w="0" w:type="auto"/>
         <w:tblBorders/>
         <w:tblLook w:val="04A0" w:firstRow="1" w:lastRow="0" w:firstColumn="1" w:lastColumn="0" w:noHBand="0" w:noVBand="1"/>
@@ -388,7 +389,7 @@
           </w:tcPr>
           <w:p>
             <w:pPr>
-              <w:pStyle w:val="896"/>
+              <w:pStyle w:val="973"/>
               <w:pBdr/>
               <w:spacing/>
               <w:ind/>
@@ -432,7 +433,7 @@
           </w:tcPr>
           <w:p>
             <w:pPr>
-              <w:pStyle w:val="896"/>
+              <w:pStyle w:val="973"/>
               <w:pBdr/>
               <w:shd w:val="clear" w:color="000000" w:themeColor="text1" w:fill="000000" w:themeFill="text1"/>
               <w:spacing/>
@@ -459,8 +460,29 @@
                 <w:szCs w:val="40"/>
                 <w:highlight w:val="none"/>
               </w:rPr>
-              <w:t xml:space="preserve">nirokay.github.io/HzgShowAround</w:t>
             </w:r>
+            <w:hyperlink r:id="rId12" w:tooltip="http://www.nirokay.com/HzgShowAround/" w:history="1">
+              <w:r>
+                <w:rPr>
+                  <w:rStyle w:val="952"/>
+                  <w:rFonts w:ascii="Fira Code" w:hAnsi="Fira Code" w:eastAsia="Fira Code" w:cs="Fira Code"/>
+                  <w:b/>
+                  <w:bCs/>
+                  <w:color w:val="ffffff" w:themeColor="background1"/>
+                  <w:sz w:val="40"/>
+                  <w:szCs w:val="40"/>
+                  <w:highlight w:val="none"/>
+                </w:rPr>
+                <w:t xml:space="preserve">www.nirokay.com/HzgShowAround/</w:t>
+              </w:r>
+              <w:r>
+                <w:rPr>
+                  <w:rStyle w:val="952"/>
+                  <w:color w:val="ffffff" w:themeColor="background1"/>
+                  <w:highlight w:val="none"/>
+                </w:rPr>
+              </w:r>
+            </w:hyperlink>
             <w:r>
               <w:rPr>
                 <w:color w:val="ffffff" w:themeColor="background1"/>
@@ -489,7 +511,7 @@
           </w:tcPr>
           <w:p>
             <w:pPr>
-              <w:pStyle w:val="896"/>
+              <w:pStyle w:val="973"/>
               <w:pBdr/>
               <w:spacing/>
               <w:ind/>
@@ -523,7 +545,7 @@
     </w:tbl>
     <w:p>
       <w:pPr>
-        <w:pStyle w:val="896"/>
+        <w:pStyle w:val="973"/>
         <w:pBdr/>
         <w:shd w:val="clear" w:color="auto" w:fill="auto"/>
         <w:spacing/>
@@ -570,7 +592,7 @@
     </w:p>
     <w:tbl>
       <w:tblPr>
-        <w:tblStyle w:val="749"/>
+        <w:tblStyle w:val="826"/>
         <w:tblW w:w="0" w:type="auto"/>
         <w:tblBorders/>
         <w:tblLook w:val="04A0" w:firstRow="1" w:lastRow="0" w:firstColumn="1" w:lastColumn="0" w:noHBand="0" w:noVBand="1"/>
@@ -595,7 +617,7 @@
           </w:tcPr>
           <w:p>
             <w:pPr>
-              <w:pStyle w:val="719"/>
+              <w:pStyle w:val="796"/>
               <w:pBdr/>
               <w:spacing/>
               <w:ind/>
@@ -695,7 +717,7 @@
           </w:tcPr>
           <w:p>
             <w:pPr>
-              <w:pStyle w:val="719"/>
+              <w:pStyle w:val="796"/>
               <w:pBdr/>
               <w:spacing/>
               <w:ind/>
@@ -783,7 +805,6 @@
                 <w:b w:val="0"/>
                 <w:bCs w:val="0"/>
                 <w:i w:val="0"/>
-                <w:iCs w:val="0"/>
                 <w:highlight w:val="none"/>
                 <w:u w:val="none"/>
               </w:rPr>
@@ -800,7 +821,7 @@
           </w:p>
           <w:p>
             <w:pPr>
-              <w:pStyle w:val="897"/>
+              <w:pStyle w:val="974"/>
               <w:numPr>
                 <w:ilvl w:val="0"/>
                 <w:numId w:val="1"/>
@@ -830,7 +851,7 @@
             </w:r>
             <w:r>
               <w:rPr>
-                <w:rFonts w:ascii="Fira Code" w:hAnsi="Fira Code" w:eastAsia="Fira Code" w:cs="Fira Code"/>
+                <w:rFonts w:ascii="Fira Code" w:hAnsi="Fira Code" w:cs="Fira Code"/>
                 <w:b/>
                 <w:bCs/>
                 <w:sz w:val="16"/>
@@ -851,7 +872,7 @@
           </w:p>
           <w:p>
             <w:pPr>
-              <w:pStyle w:val="897"/>
+              <w:pStyle w:val="974"/>
               <w:numPr>
                 <w:ilvl w:val="0"/>
                 <w:numId w:val="2"/>
@@ -881,7 +902,7 @@
             </w:r>
             <w:r>
               <w:rPr>
-                <w:rFonts w:ascii="Fira Code" w:hAnsi="Fira Code" w:eastAsia="Fira Code" w:cs="Fira Code"/>
+                <w:rFonts w:ascii="Fira Code" w:hAnsi="Fira Code" w:cs="Fira Code"/>
                 <w:b/>
                 <w:bCs/>
                 <w:sz w:val="16"/>
@@ -956,7 +977,7 @@
     </w:tbl>
     <w:p>
       <w:pPr>
-        <w:pStyle w:val="719"/>
+        <w:pStyle w:val="796"/>
         <w:pBdr/>
         <w:spacing/>
         <w:ind/>
@@ -967,13 +988,6 @@
           <w14:ligatures w14:val="none"/>
         </w:rPr>
       </w:pPr>
-      <w:r>
-        <w:rPr>
-          <w:sz w:val="22"/>
-          <w:szCs w:val="22"/>
-          <w14:ligatures w14:val="none"/>
-        </w:rPr>
-      </w:r>
       <w:r>
         <w:rPr>
           <w:sz w:val="22"/>
@@ -1040,7 +1054,7 @@
 <w:ftr xmlns:wpc="http://schemas.microsoft.com/office/word/2010/wordprocessingCanvas" xmlns:mc="http://schemas.openxmlformats.org/markup-compatibility/2006" xmlns:o="urn:schemas-microsoft-com:office:office" xmlns:r="http://schemas.openxmlformats.org/officeDocument/2006/relationships" xmlns:m="http://schemas.openxmlformats.org/officeDocument/2006/math" xmlns:v="urn:schemas-microsoft-com:vml" xmlns:wp14="http://schemas.microsoft.com/office/word/2010/wordprocessingDrawing" xmlns:wp="http://schemas.openxmlformats.org/drawingml/2006/wordprocessingDrawing" xmlns:w10="urn:schemas-microsoft-com:office:word" xmlns:w="http://schemas.openxmlformats.org/wordprocessingml/2006/main" xmlns:w14="http://schemas.microsoft.com/office/word/2010/wordml" xmlns:w15="http://schemas.microsoft.com/office/word/2012/wordml" xmlns:wpg="http://schemas.microsoft.com/office/word/2010/wordprocessingGroup" xmlns:wpi="http://schemas.microsoft.com/office/word/2010/wordprocessingInk" xmlns:wne="http://schemas.microsoft.com/office/word/2006/wordml" xmlns:a="http://schemas.openxmlformats.org/drawingml/2006/main" xmlns:wps="http://schemas.microsoft.com/office/word/2010/wordprocessingShape" mc:Ignorable="w14 w15 wp14">
   <w:tbl>
     <w:tblPr>
-      <w:tblStyle w:val="749"/>
+      <w:tblStyle w:val="826"/>
       <w:tblW w:w="0" w:type="auto"/>
       <w:tblBorders/>
       <w:tblLayout w:type="fixed"/>
@@ -1066,7 +1080,7 @@
         </w:tcPr>
         <w:p>
           <w:pPr>
-            <w:pStyle w:val="745"/>
+            <w:pStyle w:val="822"/>
             <w:pBdr/>
             <w:tabs>
               <w:tab w:val="left" w:leader="none" w:pos="1887"/>
@@ -1080,20 +1094,6 @@
               <w:szCs w:val="16"/>
             </w:rPr>
           </w:pPr>
-          <w:r>
-            <w:rPr>
-              <w:sz w:val="16"/>
-              <w:szCs w:val="16"/>
-            </w:rPr>
-          </w:r>
-          <w:r/>
-          <w:r>
-            <w:rPr>
-              <w:sz w:val="16"/>
-              <w:szCs w:val="16"/>
-            </w:rPr>
-          </w:r>
-          <w:r/>
           <w:r>
             <w:rPr>
               <w:sz w:val="16"/>
@@ -1135,7 +1135,7 @@
         </w:tcPr>
         <w:p>
           <w:pPr>
-            <w:pStyle w:val="745"/>
+            <w:pStyle w:val="822"/>
             <w:pBdr/>
             <w:spacing/>
             <w:ind/>
@@ -1150,7 +1150,7 @@
               <w:sz w:val="16"/>
               <w:szCs w:val="16"/>
             </w:rPr>
-            <w:t xml:space="preserve">Stand: 28.05.2024</w:t>
+            <w:t xml:space="preserve">Stand: 22.05.2025</w:t>
           </w:r>
           <w:r>
             <w:rPr>
@@ -1170,7 +1170,7 @@
   </w:tbl>
   <w:p>
     <w:pPr>
-      <w:pStyle w:val="745"/>
+      <w:pStyle w:val="822"/>
       <w:pBdr/>
       <w:spacing/>
       <w:ind/>
@@ -1219,7 +1219,7 @@
 <w:hdr xmlns:wpc="http://schemas.microsoft.com/office/word/2010/wordprocessingCanvas" xmlns:mc="http://schemas.openxmlformats.org/markup-compatibility/2006" xmlns:o="urn:schemas-microsoft-com:office:office" xmlns:r="http://schemas.openxmlformats.org/officeDocument/2006/relationships" xmlns:m="http://schemas.openxmlformats.org/officeDocument/2006/math" xmlns:v="urn:schemas-microsoft-com:vml" xmlns:wp14="http://schemas.microsoft.com/office/word/2010/wordprocessingDrawing" xmlns:wp="http://schemas.openxmlformats.org/drawingml/2006/wordprocessingDrawing" xmlns:w10="urn:schemas-microsoft-com:office:word" xmlns:w="http://schemas.openxmlformats.org/wordprocessingml/2006/main" xmlns:w14="http://schemas.microsoft.com/office/word/2010/wordml" xmlns:w15="http://schemas.microsoft.com/office/word/2012/wordml" xmlns:wpg="http://schemas.microsoft.com/office/word/2010/wordprocessingGroup" xmlns:wpi="http://schemas.microsoft.com/office/word/2010/wordprocessingInk" xmlns:wne="http://schemas.microsoft.com/office/word/2006/wordml" xmlns:a="http://schemas.openxmlformats.org/drawingml/2006/main" xmlns:wps="http://schemas.microsoft.com/office/word/2010/wordprocessingShape" mc:Ignorable="w14 w15 wp14">
   <w:p>
     <w:pPr>
-      <w:pStyle w:val="717"/>
+      <w:pStyle w:val="794"/>
       <w:pBdr/>
       <w:spacing/>
       <w:ind/>
@@ -1330,6 +1330,16 @@
                               <w:highlight w:val="none"/>
                             </w:rPr>
                           </w:r>
+                          <w:r>
+                            <w:rPr>
+                              <w:rFonts w:ascii="Source Han Sans KR Heavy" w:hAnsi="Source Han Sans KR Heavy" w:cs="Source Han Sans KR Heavy"/>
+                              <w:b/>
+                              <w:bCs/>
+                              <w:sz w:val="16"/>
+                              <w:szCs w:val="16"/>
+                              <w:highlight w:val="none"/>
+                            </w:rPr>
+                          </w:r>
                         </w:p>
                         <w:p>
                           <w:pPr>
@@ -1371,6 +1381,7 @@
                               <w:strike w:val="0"/>
                               <w:sz w:val="48"/>
                               <w:szCs w:val="48"/>
+                              <w:highlight w:val="none"/>
                             </w:rPr>
                           </w:r>
                           <w:r>
@@ -1379,7 +1390,6 @@
                               <w:b w:val="0"/>
                               <w:bCs w:val="0"/>
                               <w:i w:val="0"/>
-                              <w:iCs w:val="0"/>
                               <w:strike w:val="0"/>
                               <w:sz w:val="48"/>
                               <w:szCs w:val="48"/>
@@ -1419,6 +1429,16 @@
                     <w:r>
                       <w:rPr>
                         <w:rFonts w:ascii="Source Han Sans KR Heavy" w:hAnsi="Source Han Sans KR Heavy" w:eastAsia="Source Han Sans KR Heavy" w:cs="Source Han Sans KR Heavy"/>
+                        <w:b/>
+                        <w:bCs/>
+                        <w:sz w:val="16"/>
+                        <w:szCs w:val="16"/>
+                        <w:highlight w:val="none"/>
+                      </w:rPr>
+                    </w:r>
+                    <w:r>
+                      <w:rPr>
+                        <w:rFonts w:ascii="Source Han Sans KR Heavy" w:hAnsi="Source Han Sans KR Heavy" w:cs="Source Han Sans KR Heavy"/>
                         <w:b/>
                         <w:bCs/>
                         <w:sz w:val="16"/>
@@ -1477,6 +1497,7 @@
                         <w:strike w:val="0"/>
                         <w:sz w:val="48"/>
                         <w:szCs w:val="48"/>
+                        <w:highlight w:val="none"/>
                       </w:rPr>
                     </w:r>
                     <w:r>
@@ -1485,7 +1506,6 @@
                         <w:b w:val="0"/>
                         <w:bCs w:val="0"/>
                         <w:i w:val="0"/>
-                        <w:iCs w:val="0"/>
                         <w:strike w:val="0"/>
                         <w:sz w:val="48"/>
                         <w:szCs w:val="48"/>
@@ -1544,7 +1564,7 @@
                     <pic:spPr bwMode="auto">
                       <a:xfrm rot="0" flipH="0" flipV="0">
                         <a:off x="0" y="0"/>
-                        <a:ext cx="7673651" cy="10851222"/>
+                        <a:ext cx="7673650" cy="10851222"/>
                       </a:xfrm>
                       <a:prstGeom prst="rect">
                         <a:avLst/>
@@ -1587,15 +1607,7 @@
     </w:r>
     <w:r>
       <w:rPr>
-        <w:rFonts w:ascii="Source Han Sans KR Heavy" w:hAnsi="Source Han Sans KR Heavy" w:eastAsia="Source Han Sans KR Heavy" w:cs="Source Han Sans KR Heavy"/>
-        <w:b/>
-        <w:bCs/>
-        <w:sz w:val="72"/>
-        <w:szCs w:val="72"/>
-      </w:rPr>
-    </w:r>
-    <w:r>
-      <w:rPr>
+        <w:rFonts w:ascii="Source Han Sans KR Heavy" w:hAnsi="Source Han Sans KR Heavy" w:cs="Source Han Sans KR Heavy"/>
         <w:b w:val="0"/>
         <w:bCs w:val="0"/>
         <w:sz w:val="72"/>
@@ -2076,11 +2088,140 @@
     <w:lsdException w:name="Bibliography" w:uiPriority="37"/>
     <w:lsdException w:name="TOC Heading" w:uiPriority="39" w:qFormat="1"/>
   </w:latentStyles>
-  <w:style w:type="paragraph" w:styleId="717">
+  <w:style w:type="character" w:styleId="165">
+    <w:name w:val="Intense Emphasis"/>
+    <w:basedOn w:val="975"/>
+    <w:uiPriority w:val="21"/>
+    <w:qFormat/>
+    <w:pPr>
+      <w:pBdr/>
+      <w:spacing/>
+      <w:ind/>
+    </w:pPr>
+    <w:rPr>
+      <w:i/>
+      <w:iCs/>
+      <w:color w:val="0f4761" w:themeColor="accent1" w:themeShade="BF"/>
+    </w:rPr>
+  </w:style>
+  <w:style w:type="character" w:styleId="168">
+    <w:name w:val="Intense Reference"/>
+    <w:basedOn w:val="975"/>
+    <w:uiPriority w:val="32"/>
+    <w:qFormat/>
+    <w:pPr>
+      <w:pBdr/>
+      <w:spacing/>
+      <w:ind/>
+    </w:pPr>
+    <w:rPr>
+      <w:b/>
+      <w:bCs/>
+      <w:smallCaps/>
+      <w:color w:val="0f4761" w:themeColor="accent1" w:themeShade="BF"/>
+      <w:spacing w:val="5"/>
+    </w:rPr>
+  </w:style>
+  <w:style w:type="character" w:styleId="170">
+    <w:name w:val="Subtle Emphasis"/>
+    <w:basedOn w:val="975"/>
+    <w:uiPriority w:val="19"/>
+    <w:qFormat/>
+    <w:pPr>
+      <w:pBdr/>
+      <w:spacing/>
+      <w:ind/>
+    </w:pPr>
+    <w:rPr>
+      <w:i/>
+      <w:iCs/>
+      <w:color w:val="404040" w:themeColor="text1" w:themeTint="BF"/>
+    </w:rPr>
+  </w:style>
+  <w:style w:type="character" w:styleId="171">
+    <w:name w:val="Emphasis"/>
+    <w:basedOn w:val="975"/>
+    <w:uiPriority w:val="20"/>
+    <w:qFormat/>
+    <w:pPr>
+      <w:pBdr/>
+      <w:spacing/>
+      <w:ind/>
+    </w:pPr>
+    <w:rPr>
+      <w:i/>
+      <w:iCs/>
+    </w:rPr>
+  </w:style>
+  <w:style w:type="character" w:styleId="172">
+    <w:name w:val="Strong"/>
+    <w:basedOn w:val="975"/>
+    <w:uiPriority w:val="22"/>
+    <w:qFormat/>
+    <w:pPr>
+      <w:pBdr/>
+      <w:spacing/>
+      <w:ind/>
+    </w:pPr>
+    <w:rPr>
+      <w:b/>
+      <w:bCs/>
+    </w:rPr>
+  </w:style>
+  <w:style w:type="character" w:styleId="173">
+    <w:name w:val="Subtle Reference"/>
+    <w:basedOn w:val="975"/>
+    <w:uiPriority w:val="31"/>
+    <w:qFormat/>
+    <w:pPr>
+      <w:pBdr/>
+      <w:spacing/>
+      <w:ind/>
+    </w:pPr>
+    <w:rPr>
+      <w:smallCaps/>
+      <w:color w:val="5a5a5a" w:themeColor="text1" w:themeTint="A5"/>
+    </w:rPr>
+  </w:style>
+  <w:style w:type="character" w:styleId="174">
+    <w:name w:val="Book Title"/>
+    <w:basedOn w:val="975"/>
+    <w:uiPriority w:val="33"/>
+    <w:qFormat/>
+    <w:pPr>
+      <w:pBdr/>
+      <w:spacing/>
+      <w:ind/>
+    </w:pPr>
+    <w:rPr>
+      <w:b/>
+      <w:bCs/>
+      <w:i/>
+      <w:iCs/>
+      <w:spacing w:val="5"/>
+    </w:rPr>
+  </w:style>
+  <w:style w:type="character" w:styleId="187">
+    <w:name w:val="FollowedHyperlink"/>
+    <w:basedOn w:val="975"/>
+    <w:uiPriority w:val="99"/>
+    <w:semiHidden/>
+    <w:unhideWhenUsed/>
+    <w:pPr>
+      <w:pBdr/>
+      <w:spacing/>
+      <w:ind/>
+    </w:pPr>
+    <w:rPr>
+      <w:color w:val="954f72" w:themeColor="followedHyperlink"/>
+      <w:u w:val="single"/>
+    </w:rPr>
+  </w:style>
+  <w:style w:type="paragraph" w:styleId="794">
     <w:name w:val="Heading 1"/>
-    <w:basedOn w:val="735"/>
-    <w:next w:val="893"/>
-    <w:link w:val="718"/>
+    <w:basedOn w:val="812"/>
+    <w:next w:val="970"/>
+    <w:link w:val="795"/>
     <w:uiPriority w:val="9"/>
     <w:qFormat/>
     <w:pPr>
@@ -2096,9 +2237,9 @@
       <w:szCs w:val="72"/>
     </w:rPr>
   </w:style>
-  <w:style w:type="character" w:styleId="718">
+  <w:style w:type="character" w:styleId="795">
     <w:name w:val="Heading 1 Char"/>
-    <w:link w:val="717"/>
+    <w:link w:val="794"/>
     <w:uiPriority w:val="9"/>
     <w:pPr>
       <w:pBdr/>
@@ -2112,11 +2253,11 @@
       <w:szCs w:val="72"/>
     </w:rPr>
   </w:style>
-  <w:style w:type="paragraph" w:styleId="719">
+  <w:style w:type="paragraph" w:styleId="796">
     <w:name w:val="Heading 2"/>
-    <w:basedOn w:val="893"/>
-    <w:next w:val="893"/>
-    <w:link w:val="720"/>
+    <w:basedOn w:val="970"/>
+    <w:next w:val="970"/>
+    <w:link w:val="797"/>
     <w:uiPriority w:val="9"/>
     <w:unhideWhenUsed/>
     <w:qFormat/>
@@ -2137,9 +2278,9 @@
       <w:u w:val="single"/>
     </w:rPr>
   </w:style>
-  <w:style w:type="character" w:styleId="720">
+  <w:style w:type="character" w:styleId="797">
     <w:name w:val="Heading 2 Char"/>
-    <w:link w:val="719"/>
+    <w:link w:val="796"/>
     <w:uiPriority w:val="9"/>
     <w:pPr>
       <w:pBdr/>
@@ -2152,11 +2293,11 @@
       <w:u w:val="single"/>
     </w:rPr>
   </w:style>
-  <w:style w:type="paragraph" w:styleId="721">
+  <w:style w:type="paragraph" w:styleId="798">
     <w:name w:val="Heading 3"/>
-    <w:basedOn w:val="893"/>
-    <w:next w:val="893"/>
-    <w:link w:val="722"/>
+    <w:basedOn w:val="970"/>
+    <w:next w:val="970"/>
+    <w:link w:val="799"/>
     <w:uiPriority w:val="9"/>
     <w:unhideWhenUsed/>
     <w:qFormat/>
@@ -2174,9 +2315,9 @@
       <w:szCs w:val="30"/>
     </w:rPr>
   </w:style>
-  <w:style w:type="character" w:styleId="722">
+  <w:style w:type="character" w:styleId="799">
     <w:name w:val="Heading 3 Char"/>
-    <w:link w:val="721"/>
+    <w:link w:val="798"/>
     <w:uiPriority w:val="9"/>
     <w:pPr>
       <w:pBdr/>
@@ -2189,11 +2330,11 @@
       <w:szCs w:val="30"/>
     </w:rPr>
   </w:style>
-  <w:style w:type="paragraph" w:styleId="723">
+  <w:style w:type="paragraph" w:styleId="800">
     <w:name w:val="Heading 4"/>
-    <w:basedOn w:val="893"/>
-    <w:next w:val="893"/>
-    <w:link w:val="724"/>
+    <w:basedOn w:val="970"/>
+    <w:next w:val="970"/>
+    <w:link w:val="801"/>
     <w:uiPriority w:val="9"/>
     <w:unhideWhenUsed/>
     <w:qFormat/>
@@ -2213,9 +2354,9 @@
       <w:szCs w:val="26"/>
     </w:rPr>
   </w:style>
-  <w:style w:type="character" w:styleId="724">
+  <w:style w:type="character" w:styleId="801">
     <w:name w:val="Heading 4 Char"/>
-    <w:link w:val="723"/>
+    <w:link w:val="800"/>
     <w:uiPriority w:val="9"/>
     <w:pPr>
       <w:pBdr/>
@@ -2230,11 +2371,11 @@
       <w:szCs w:val="26"/>
     </w:rPr>
   </w:style>
-  <w:style w:type="paragraph" w:styleId="725">
+  <w:style w:type="paragraph" w:styleId="802">
     <w:name w:val="Heading 5"/>
-    <w:basedOn w:val="893"/>
-    <w:next w:val="893"/>
-    <w:link w:val="726"/>
+    <w:basedOn w:val="970"/>
+    <w:next w:val="970"/>
+    <w:link w:val="803"/>
     <w:uiPriority w:val="9"/>
     <w:unhideWhenUsed/>
     <w:qFormat/>
@@ -2254,9 +2395,9 @@
       <w:szCs w:val="24"/>
     </w:rPr>
   </w:style>
-  <w:style w:type="character" w:styleId="726">
+  <w:style w:type="character" w:styleId="803">
     <w:name w:val="Heading 5 Char"/>
-    <w:link w:val="725"/>
+    <w:link w:val="802"/>
     <w:uiPriority w:val="9"/>
     <w:pPr>
       <w:pBdr/>
@@ -2271,11 +2412,11 @@
       <w:szCs w:val="24"/>
     </w:rPr>
   </w:style>
-  <w:style w:type="paragraph" w:styleId="727">
+  <w:style w:type="paragraph" w:styleId="804">
     <w:name w:val="Heading 6"/>
-    <w:basedOn w:val="893"/>
-    <w:next w:val="893"/>
-    <w:link w:val="728"/>
+    <w:basedOn w:val="970"/>
+    <w:next w:val="970"/>
+    <w:link w:val="805"/>
     <w:uiPriority w:val="9"/>
     <w:unhideWhenUsed/>
     <w:qFormat/>
@@ -2295,9 +2436,9 @@
       <w:szCs w:val="22"/>
     </w:rPr>
   </w:style>
-  <w:style w:type="character" w:styleId="728">
+  <w:style w:type="character" w:styleId="805">
     <w:name w:val="Heading 6 Char"/>
-    <w:link w:val="727"/>
+    <w:link w:val="804"/>
     <w:uiPriority w:val="9"/>
     <w:pPr>
       <w:pBdr/>
@@ -2312,11 +2453,11 @@
       <w:szCs w:val="22"/>
     </w:rPr>
   </w:style>
-  <w:style w:type="paragraph" w:styleId="729">
+  <w:style w:type="paragraph" w:styleId="806">
     <w:name w:val="Heading 7"/>
-    <w:basedOn w:val="893"/>
-    <w:next w:val="893"/>
-    <w:link w:val="730"/>
+    <w:basedOn w:val="970"/>
+    <w:next w:val="970"/>
+    <w:link w:val="807"/>
     <w:uiPriority w:val="9"/>
     <w:unhideWhenUsed/>
     <w:qFormat/>
@@ -2338,9 +2479,9 @@
       <w:szCs w:val="22"/>
     </w:rPr>
   </w:style>
-  <w:style w:type="character" w:styleId="730">
+  <w:style w:type="character" w:styleId="807">
     <w:name w:val="Heading 7 Char"/>
-    <w:link w:val="729"/>
+    <w:link w:val="806"/>
     <w:uiPriority w:val="9"/>
     <w:pPr>
       <w:pBdr/>
@@ -2357,11 +2498,11 @@
       <w:szCs w:val="22"/>
     </w:rPr>
   </w:style>
-  <w:style w:type="paragraph" w:styleId="731">
+  <w:style w:type="paragraph" w:styleId="808">
     <w:name w:val="Heading 8"/>
-    <w:basedOn w:val="893"/>
-    <w:next w:val="893"/>
-    <w:link w:val="732"/>
+    <w:basedOn w:val="970"/>
+    <w:next w:val="970"/>
+    <w:link w:val="809"/>
     <w:uiPriority w:val="9"/>
     <w:unhideWhenUsed/>
     <w:qFormat/>
@@ -2381,9 +2522,9 @@
       <w:szCs w:val="22"/>
     </w:rPr>
   </w:style>
-  <w:style w:type="character" w:styleId="732">
+  <w:style w:type="character" w:styleId="809">
     <w:name w:val="Heading 8 Char"/>
-    <w:link w:val="731"/>
+    <w:link w:val="808"/>
     <w:uiPriority w:val="9"/>
     <w:pPr>
       <w:pBdr/>
@@ -2398,11 +2539,11 @@
       <w:szCs w:val="22"/>
     </w:rPr>
   </w:style>
-  <w:style w:type="paragraph" w:styleId="733">
+  <w:style w:type="paragraph" w:styleId="810">
     <w:name w:val="Heading 9"/>
-    <w:basedOn w:val="893"/>
-    <w:next w:val="893"/>
-    <w:link w:val="734"/>
+    <w:basedOn w:val="970"/>
+    <w:next w:val="970"/>
+    <w:link w:val="811"/>
     <w:uiPriority w:val="9"/>
     <w:unhideWhenUsed/>
     <w:qFormat/>
@@ -2422,9 +2563,9 @@
       <w:szCs w:val="21"/>
     </w:rPr>
   </w:style>
-  <w:style w:type="character" w:styleId="734">
+  <w:style w:type="character" w:styleId="811">
     <w:name w:val="Heading 9 Char"/>
-    <w:link w:val="733"/>
+    <w:link w:val="810"/>
     <w:uiPriority w:val="9"/>
     <w:pPr>
       <w:pBdr/>
@@ -2439,11 +2580,11 @@
       <w:szCs w:val="21"/>
     </w:rPr>
   </w:style>
-  <w:style w:type="paragraph" w:styleId="735">
+  <w:style w:type="paragraph" w:styleId="812">
     <w:name w:val="Title"/>
-    <w:basedOn w:val="893"/>
-    <w:next w:val="893"/>
-    <w:link w:val="736"/>
+    <w:basedOn w:val="970"/>
+    <w:next w:val="970"/>
+    <w:link w:val="813"/>
     <w:uiPriority w:val="10"/>
     <w:qFormat/>
     <w:pPr>
@@ -2457,9 +2598,9 @@
       <w:szCs w:val="48"/>
     </w:rPr>
   </w:style>
-  <w:style w:type="character" w:styleId="736">
+  <w:style w:type="character" w:styleId="813">
     <w:name w:val="Title Char"/>
-    <w:link w:val="735"/>
+    <w:link w:val="812"/>
     <w:uiPriority w:val="10"/>
     <w:pPr>
       <w:pBdr/>
@@ -2471,11 +2612,11 @@
       <w:szCs w:val="48"/>
     </w:rPr>
   </w:style>
-  <w:style w:type="paragraph" w:styleId="737">
+  <w:style w:type="paragraph" w:styleId="814">
     <w:name w:val="Subtitle"/>
-    <w:basedOn w:val="893"/>
-    <w:next w:val="893"/>
-    <w:link w:val="738"/>
+    <w:basedOn w:val="970"/>
+    <w:next w:val="970"/>
+    <w:link w:val="815"/>
     <w:uiPriority w:val="11"/>
     <w:qFormat/>
     <w:pPr>
@@ -2488,9 +2629,9 @@
       <w:szCs w:val="24"/>
     </w:rPr>
   </w:style>
-  <w:style w:type="character" w:styleId="738">
+  <w:style w:type="character" w:styleId="815">
     <w:name w:val="Subtitle Char"/>
-    <w:link w:val="737"/>
+    <w:link w:val="814"/>
     <w:uiPriority w:val="11"/>
     <w:pPr>
       <w:pBdr/>
@@ -2502,11 +2643,11 @@
       <w:szCs w:val="24"/>
     </w:rPr>
   </w:style>
-  <w:style w:type="paragraph" w:styleId="739">
+  <w:style w:type="paragraph" w:styleId="816">
     <w:name w:val="Quote"/>
-    <w:basedOn w:val="893"/>
-    <w:next w:val="893"/>
-    <w:link w:val="740"/>
+    <w:basedOn w:val="970"/>
+    <w:next w:val="970"/>
+    <w:link w:val="817"/>
     <w:uiPriority w:val="29"/>
     <w:qFormat/>
     <w:pPr>
@@ -2518,9 +2659,9 @@
       <w:i/>
     </w:rPr>
   </w:style>
-  <w:style w:type="character" w:styleId="740">
+  <w:style w:type="character" w:styleId="817">
     <w:name w:val="Quote Char"/>
-    <w:link w:val="739"/>
+    <w:link w:val="816"/>
     <w:uiPriority w:val="29"/>
     <w:pPr>
       <w:pBdr/>
@@ -2531,11 +2672,11 @@
       <w:i/>
     </w:rPr>
   </w:style>
-  <w:style w:type="paragraph" w:styleId="741">
+  <w:style w:type="paragraph" w:styleId="818">
     <w:name w:val="Intense Quote"/>
-    <w:basedOn w:val="893"/>
-    <w:next w:val="893"/>
-    <w:link w:val="742"/>
+    <w:basedOn w:val="970"/>
+    <w:next w:val="970"/>
+    <w:link w:val="819"/>
     <w:uiPriority w:val="30"/>
     <w:qFormat/>
     <w:pPr>
@@ -2554,9 +2695,9 @@
       <w:i/>
     </w:rPr>
   </w:style>
-  <w:style w:type="character" w:styleId="742">
+  <w:style w:type="character" w:styleId="819">
     <w:name w:val="Intense Quote Char"/>
-    <w:link w:val="741"/>
+    <w:link w:val="818"/>
     <w:uiPriority w:val="30"/>
     <w:pPr>
       <w:pBdr/>
@@ -2567,10 +2708,10 @@
       <w:i/>
     </w:rPr>
   </w:style>
-  <w:style w:type="paragraph" w:styleId="743">
+  <w:style w:type="paragraph" w:styleId="820">
     <w:name w:val="Header"/>
-    <w:basedOn w:val="893"/>
-    <w:link w:val="744"/>
+    <w:basedOn w:val="970"/>
+    <w:link w:val="821"/>
     <w:uiPriority w:val="99"/>
     <w:unhideWhenUsed/>
     <w:pPr>
@@ -2583,9 +2724,9 @@
       <w:ind/>
     </w:pPr>
   </w:style>
-  <w:style w:type="character" w:styleId="744">
+  <w:style w:type="character" w:styleId="821">
     <w:name w:val="Header Char"/>
-    <w:link w:val="743"/>
+    <w:link w:val="820"/>
     <w:uiPriority w:val="99"/>
     <w:pPr>
       <w:pBdr/>
@@ -2593,10 +2734,10 @@
       <w:ind/>
     </w:pPr>
   </w:style>
-  <w:style w:type="paragraph" w:styleId="745">
+  <w:style w:type="paragraph" w:styleId="822">
     <w:name w:val="Footer"/>
-    <w:basedOn w:val="893"/>
-    <w:link w:val="748"/>
+    <w:basedOn w:val="970"/>
+    <w:link w:val="825"/>
     <w:uiPriority w:val="99"/>
     <w:unhideWhenUsed/>
     <w:pPr>
@@ -2609,9 +2750,9 @@
       <w:ind/>
     </w:pPr>
   </w:style>
-  <w:style w:type="character" w:styleId="746">
+  <w:style w:type="character" w:styleId="823">
     <w:name w:val="Footer Char"/>
-    <w:link w:val="745"/>
+    <w:link w:val="822"/>
     <w:uiPriority w:val="99"/>
     <w:pPr>
       <w:pBdr/>
@@ -2619,10 +2760,10 @@
       <w:ind/>
     </w:pPr>
   </w:style>
-  <w:style w:type="paragraph" w:styleId="747">
+  <w:style w:type="paragraph" w:styleId="824">
     <w:name w:val="Caption"/>
-    <w:basedOn w:val="893"/>
-    <w:next w:val="893"/>
+    <w:basedOn w:val="970"/>
+    <w:next w:val="970"/>
     <w:uiPriority w:val="35"/>
     <w:semiHidden/>
     <w:unhideWhenUsed/>
@@ -2640,10 +2781,10 @@
       <w:szCs w:val="18"/>
     </w:rPr>
   </w:style>
-  <w:style w:type="character" w:styleId="748">
+  <w:style w:type="character" w:styleId="825">
     <w:name w:val="Caption Char"/>
-    <w:basedOn w:val="747"/>
-    <w:link w:val="745"/>
+    <w:basedOn w:val="824"/>
+    <w:link w:val="822"/>
     <w:uiPriority w:val="99"/>
     <w:pPr>
       <w:pBdr/>
@@ -2651,9 +2792,9 @@
       <w:ind/>
     </w:pPr>
   </w:style>
-  <w:style w:type="table" w:styleId="749">
+  <w:style w:type="table" w:styleId="826">
     <w:name w:val="Table Grid"/>
-    <w:basedOn w:val="894"/>
+    <w:basedOn w:val="971"/>
     <w:uiPriority w:val="59"/>
     <w:pPr>
       <w:pBdr/>
@@ -2850,9 +2991,9 @@
       </w:tcPr>
     </w:tblStylePr>
   </w:style>
-  <w:style w:type="table" w:styleId="750">
+  <w:style w:type="table" w:styleId="827">
     <w:name w:val="Table Grid Light"/>
-    <w:basedOn w:val="894"/>
+    <w:basedOn w:val="971"/>
     <w:uiPriority w:val="59"/>
     <w:pPr>
       <w:pBdr/>
@@ -3049,9 +3190,9 @@
       </w:tcPr>
     </w:tblStylePr>
   </w:style>
-  <w:style w:type="table" w:styleId="751">
+  <w:style w:type="table" w:styleId="828">
     <w:name w:val="Plain Table 1"/>
-    <w:basedOn w:val="894"/>
+    <w:basedOn w:val="971"/>
     <w:uiPriority w:val="59"/>
     <w:pPr>
       <w:pBdr/>
@@ -3274,9 +3415,9 @@
       </w:tcPr>
     </w:tblStylePr>
   </w:style>
-  <w:style w:type="table" w:styleId="752">
+  <w:style w:type="table" w:styleId="829">
     <w:name w:val="Plain Table 2"/>
-    <w:basedOn w:val="894"/>
+    <w:basedOn w:val="971"/>
     <w:uiPriority w:val="59"/>
     <w:pPr>
       <w:pBdr/>
@@ -3507,9 +3648,9 @@
       </w:tcPr>
     </w:tblStylePr>
   </w:style>
-  <w:style w:type="table" w:styleId="753">
+  <w:style w:type="table" w:styleId="830">
     <w:name w:val="Plain Table 3"/>
-    <w:basedOn w:val="894"/>
+    <w:basedOn w:val="971"/>
     <w:uiPriority w:val="99"/>
     <w:pPr>
       <w:pBdr/>
@@ -3737,9 +3878,9 @@
       </w:tcPr>
     </w:tblStylePr>
   </w:style>
-  <w:style w:type="table" w:styleId="754">
+  <w:style w:type="table" w:styleId="831">
     <w:name w:val="Plain Table 4"/>
-    <w:basedOn w:val="894"/>
+    <w:basedOn w:val="971"/>
     <w:uiPriority w:val="99"/>
     <w:pPr>
       <w:pBdr/>
@@ -3953,9 +4094,9 @@
       </w:tcPr>
     </w:tblStylePr>
   </w:style>
-  <w:style w:type="table" w:styleId="755">
+  <w:style w:type="table" w:styleId="832">
     <w:name w:val="Plain Table 5"/>
-    <w:basedOn w:val="894"/>
+    <w:basedOn w:val="971"/>
     <w:uiPriority w:val="99"/>
     <w:pPr>
       <w:pBdr/>
@@ -4186,9 +4327,9 @@
       </w:tcPr>
     </w:tblStylePr>
   </w:style>
-  <w:style w:type="table" w:styleId="756">
+  <w:style w:type="table" w:styleId="833">
     <w:name w:val="Grid Table 1 Light"/>
-    <w:basedOn w:val="894"/>
+    <w:basedOn w:val="971"/>
     <w:uiPriority w:val="99"/>
     <w:pPr>
       <w:pBdr/>
@@ -4409,9 +4550,9 @@
       </w:tcPr>
     </w:tblStylePr>
   </w:style>
-  <w:style w:type="table" w:styleId="757">
+  <w:style w:type="table" w:styleId="834">
     <w:name w:val="Grid Table 1 Light - Accent 1"/>
-    <w:basedOn w:val="894"/>
+    <w:basedOn w:val="971"/>
     <w:uiPriority w:val="99"/>
     <w:pPr>
       <w:pBdr/>
@@ -4632,9 +4773,9 @@
       </w:tcPr>
     </w:tblStylePr>
   </w:style>
-  <w:style w:type="table" w:styleId="758">
+  <w:style w:type="table" w:styleId="835">
     <w:name w:val="Grid Table 1 Light - Accent 2"/>
-    <w:basedOn w:val="894"/>
+    <w:basedOn w:val="971"/>
     <w:uiPriority w:val="99"/>
     <w:pPr>
       <w:pBdr/>
@@ -4855,9 +4996,9 @@
       </w:tcPr>
     </w:tblStylePr>
   </w:style>
-  <w:style w:type="table" w:styleId="759">
+  <w:style w:type="table" w:styleId="836">
     <w:name w:val="Grid Table 1 Light - Accent 3"/>
-    <w:basedOn w:val="894"/>
+    <w:basedOn w:val="971"/>
     <w:uiPriority w:val="99"/>
     <w:pPr>
       <w:pBdr/>
@@ -5078,9 +5219,9 @@
       </w:tcPr>
     </w:tblStylePr>
   </w:style>
-  <w:style w:type="table" w:styleId="760">
+  <w:style w:type="table" w:styleId="837">
     <w:name w:val="Grid Table 1 Light - Accent 4"/>
-    <w:basedOn w:val="894"/>
+    <w:basedOn w:val="971"/>
     <w:uiPriority w:val="99"/>
     <w:pPr>
       <w:pBdr/>
@@ -5301,9 +5442,9 @@
       </w:tcPr>
     </w:tblStylePr>
   </w:style>
-  <w:style w:type="table" w:styleId="761">
+  <w:style w:type="table" w:styleId="838">
     <w:name w:val="Grid Table 1 Light - Accent 5"/>
-    <w:basedOn w:val="894"/>
+    <w:basedOn w:val="971"/>
     <w:uiPriority w:val="99"/>
     <w:pPr>
       <w:pBdr/>
@@ -5524,9 +5665,9 @@
       </w:tcPr>
     </w:tblStylePr>
   </w:style>
-  <w:style w:type="table" w:styleId="762">
+  <w:style w:type="table" w:styleId="839">
     <w:name w:val="Grid Table 1 Light - Accent 6"/>
-    <w:basedOn w:val="894"/>
+    <w:basedOn w:val="971"/>
     <w:uiPriority w:val="99"/>
     <w:pPr>
       <w:pBdr/>
@@ -5747,9 +5888,9 @@
       </w:tcPr>
     </w:tblStylePr>
   </w:style>
-  <w:style w:type="table" w:styleId="763">
+  <w:style w:type="table" w:styleId="840">
     <w:name w:val="Grid Table 2"/>
-    <w:basedOn w:val="894"/>
+    <w:basedOn w:val="971"/>
     <w:uiPriority w:val="99"/>
     <w:pPr>
       <w:pBdr/>
@@ -5979,9 +6120,9 @@
       </w:tcPr>
     </w:tblStylePr>
   </w:style>
-  <w:style w:type="table" w:styleId="764">
+  <w:style w:type="table" w:styleId="841">
     <w:name w:val="Grid Table 2 - Accent 1"/>
-    <w:basedOn w:val="894"/>
+    <w:basedOn w:val="971"/>
     <w:uiPriority w:val="99"/>
     <w:pPr>
       <w:pBdr/>
@@ -6211,9 +6352,9 @@
       </w:tcPr>
     </w:tblStylePr>
   </w:style>
-  <w:style w:type="table" w:styleId="765">
+  <w:style w:type="table" w:styleId="842">
     <w:name w:val="Grid Table 2 - Accent 2"/>
-    <w:basedOn w:val="894"/>
+    <w:basedOn w:val="971"/>
     <w:uiPriority w:val="99"/>
     <w:pPr>
       <w:pBdr/>
@@ -6443,9 +6584,9 @@
       </w:tcPr>
     </w:tblStylePr>
   </w:style>
-  <w:style w:type="table" w:styleId="766">
+  <w:style w:type="table" w:styleId="843">
     <w:name w:val="Grid Table 2 - Accent 3"/>
-    <w:basedOn w:val="894"/>
+    <w:basedOn w:val="971"/>
     <w:uiPriority w:val="99"/>
     <w:pPr>
       <w:pBdr/>
@@ -6675,9 +6816,9 @@
       </w:tcPr>
     </w:tblStylePr>
   </w:style>
-  <w:style w:type="table" w:styleId="767">
+  <w:style w:type="table" w:styleId="844">
     <w:name w:val="Grid Table 2 - Accent 4"/>
-    <w:basedOn w:val="894"/>
+    <w:basedOn w:val="971"/>
     <w:uiPriority w:val="99"/>
     <w:pPr>
       <w:pBdr/>
@@ -6907,9 +7048,9 @@
       </w:tcPr>
     </w:tblStylePr>
   </w:style>
-  <w:style w:type="table" w:styleId="768">
+  <w:style w:type="table" w:styleId="845">
     <w:name w:val="Grid Table 2 - Accent 5"/>
-    <w:basedOn w:val="894"/>
+    <w:basedOn w:val="971"/>
     <w:uiPriority w:val="99"/>
     <w:pPr>
       <w:pBdr/>
@@ -7139,9 +7280,9 @@
       </w:tcPr>
     </w:tblStylePr>
   </w:style>
-  <w:style w:type="table" w:styleId="769">
+  <w:style w:type="table" w:styleId="846">
     <w:name w:val="Grid Table 2 - Accent 6"/>
-    <w:basedOn w:val="894"/>
+    <w:basedOn w:val="971"/>
     <w:uiPriority w:val="99"/>
     <w:pPr>
       <w:pBdr/>
@@ -7371,9 +7512,9 @@
       </w:tcPr>
     </w:tblStylePr>
   </w:style>
-  <w:style w:type="table" w:styleId="770">
+  <w:style w:type="table" w:styleId="847">
     <w:name w:val="Grid Table 3"/>
-    <w:basedOn w:val="894"/>
+    <w:basedOn w:val="971"/>
     <w:uiPriority w:val="99"/>
     <w:pPr>
       <w:pBdr/>
@@ -7616,9 +7757,9 @@
       </w:tcPr>
     </w:tblStylePr>
   </w:style>
-  <w:style w:type="table" w:styleId="771">
+  <w:style w:type="table" w:styleId="848">
     <w:name w:val="Grid Table 3 - Accent 1"/>
-    <w:basedOn w:val="894"/>
+    <w:basedOn w:val="971"/>
     <w:uiPriority w:val="99"/>
     <w:pPr>
       <w:pBdr/>
@@ -7861,9 +8002,9 @@
       </w:tcPr>
     </w:tblStylePr>
   </w:style>
-  <w:style w:type="table" w:styleId="772">
+  <w:style w:type="table" w:styleId="849">
     <w:name w:val="Grid Table 3 - Accent 2"/>
-    <w:basedOn w:val="894"/>
+    <w:basedOn w:val="971"/>
     <w:uiPriority w:val="99"/>
     <w:pPr>
       <w:pBdr/>
@@ -8106,9 +8247,9 @@
       </w:tcPr>
     </w:tblStylePr>
   </w:style>
-  <w:style w:type="table" w:styleId="773">
+  <w:style w:type="table" w:styleId="850">
     <w:name w:val="Grid Table 3 - Accent 3"/>
-    <w:basedOn w:val="894"/>
+    <w:basedOn w:val="971"/>
     <w:uiPriority w:val="99"/>
     <w:pPr>
       <w:pBdr/>
@@ -8351,9 +8492,9 @@
       </w:tcPr>
     </w:tblStylePr>
   </w:style>
-  <w:style w:type="table" w:styleId="774">
+  <w:style w:type="table" w:styleId="851">
     <w:name w:val="Grid Table 3 - Accent 4"/>
-    <w:basedOn w:val="894"/>
+    <w:basedOn w:val="971"/>
     <w:uiPriority w:val="99"/>
     <w:pPr>
       <w:pBdr/>
@@ -8596,9 +8737,9 @@
       </w:tcPr>
     </w:tblStylePr>
   </w:style>
-  <w:style w:type="table" w:styleId="775">
+  <w:style w:type="table" w:styleId="852">
     <w:name w:val="Grid Table 3 - Accent 5"/>
-    <w:basedOn w:val="894"/>
+    <w:basedOn w:val="971"/>
     <w:uiPriority w:val="99"/>
     <w:pPr>
       <w:pBdr/>
@@ -8841,9 +8982,9 @@
       </w:tcPr>
     </w:tblStylePr>
   </w:style>
-  <w:style w:type="table" w:styleId="776">
+  <w:style w:type="table" w:styleId="853">
     <w:name w:val="Grid Table 3 - Accent 6"/>
-    <w:basedOn w:val="894"/>
+    <w:basedOn w:val="971"/>
     <w:uiPriority w:val="99"/>
     <w:pPr>
       <w:pBdr/>
@@ -9086,9 +9227,9 @@
       </w:tcPr>
     </w:tblStylePr>
   </w:style>
-  <w:style w:type="table" w:styleId="777">
+  <w:style w:type="table" w:styleId="854">
     <w:name w:val="Grid Table 4"/>
-    <w:basedOn w:val="894"/>
+    <w:basedOn w:val="971"/>
     <w:uiPriority w:val="59"/>
     <w:pPr>
       <w:pBdr/>
@@ -9319,9 +9460,9 @@
       </w:tcPr>
     </w:tblStylePr>
   </w:style>
-  <w:style w:type="table" w:styleId="778">
+  <w:style w:type="table" w:styleId="855">
     <w:name w:val="Grid Table 4 - Accent 1"/>
-    <w:basedOn w:val="894"/>
+    <w:basedOn w:val="971"/>
     <w:uiPriority w:val="59"/>
     <w:pPr>
       <w:pBdr/>
@@ -9552,9 +9693,9 @@
       </w:tcPr>
     </w:tblStylePr>
   </w:style>
-  <w:style w:type="table" w:styleId="779">
+  <w:style w:type="table" w:styleId="856">
     <w:name w:val="Grid Table 4 - Accent 2"/>
-    <w:basedOn w:val="894"/>
+    <w:basedOn w:val="971"/>
     <w:uiPriority w:val="59"/>
     <w:pPr>
       <w:pBdr/>
@@ -9785,9 +9926,9 @@
       </w:tcPr>
     </w:tblStylePr>
   </w:style>
-  <w:style w:type="table" w:styleId="780">
+  <w:style w:type="table" w:styleId="857">
     <w:name w:val="Grid Table 4 - Accent 3"/>
-    <w:basedOn w:val="894"/>
+    <w:basedOn w:val="971"/>
     <w:uiPriority w:val="59"/>
     <w:pPr>
       <w:pBdr/>
@@ -10018,9 +10159,9 @@
       </w:tcPr>
     </w:tblStylePr>
   </w:style>
-  <w:style w:type="table" w:styleId="781">
+  <w:style w:type="table" w:styleId="858">
     <w:name w:val="Grid Table 4 - Accent 4"/>
-    <w:basedOn w:val="894"/>
+    <w:basedOn w:val="971"/>
     <w:uiPriority w:val="59"/>
     <w:pPr>
       <w:pBdr/>
@@ -10251,9 +10392,9 @@
       </w:tcPr>
     </w:tblStylePr>
   </w:style>
-  <w:style w:type="table" w:styleId="782">
+  <w:style w:type="table" w:styleId="859">
     <w:name w:val="Grid Table 4 - Accent 5"/>
-    <w:basedOn w:val="894"/>
+    <w:basedOn w:val="971"/>
     <w:uiPriority w:val="59"/>
     <w:pPr>
       <w:pBdr/>
@@ -10484,9 +10625,9 @@
       </w:tcPr>
     </w:tblStylePr>
   </w:style>
-  <w:style w:type="table" w:styleId="783">
+  <w:style w:type="table" w:styleId="860">
     <w:name w:val="Grid Table 4 - Accent 6"/>
-    <w:basedOn w:val="894"/>
+    <w:basedOn w:val="971"/>
     <w:uiPriority w:val="59"/>
     <w:pPr>
       <w:pBdr/>
@@ -10717,9 +10858,9 @@
       </w:tcPr>
     </w:tblStylePr>
   </w:style>
-  <w:style w:type="table" w:styleId="784">
+  <w:style w:type="table" w:styleId="861">
     <w:name w:val="Grid Table 5 Dark"/>
-    <w:basedOn w:val="894"/>
+    <w:basedOn w:val="971"/>
     <w:uiPriority w:val="99"/>
     <w:pPr>
       <w:pBdr/>
@@ -10945,9 +11086,9 @@
       </w:tcPr>
     </w:tblStylePr>
   </w:style>
-  <w:style w:type="table" w:styleId="785">
+  <w:style w:type="table" w:styleId="862">
     <w:name w:val="Grid Table 5 Dark- Accent 1"/>
-    <w:basedOn w:val="894"/>
+    <w:basedOn w:val="971"/>
     <w:uiPriority w:val="99"/>
     <w:pPr>
       <w:pBdr/>
@@ -11173,9 +11314,9 @@
       </w:tcPr>
     </w:tblStylePr>
   </w:style>
-  <w:style w:type="table" w:styleId="786">
+  <w:style w:type="table" w:styleId="863">
     <w:name w:val="Grid Table 5 Dark - Accent 2"/>
-    <w:basedOn w:val="894"/>
+    <w:basedOn w:val="971"/>
     <w:uiPriority w:val="99"/>
     <w:pPr>
       <w:pBdr/>
@@ -11401,9 +11542,9 @@
       </w:tcPr>
     </w:tblStylePr>
   </w:style>
-  <w:style w:type="table" w:styleId="787">
+  <w:style w:type="table" w:styleId="864">
     <w:name w:val="Grid Table 5 Dark - Accent 3"/>
-    <w:basedOn w:val="894"/>
+    <w:basedOn w:val="971"/>
     <w:uiPriority w:val="99"/>
     <w:pPr>
       <w:pBdr/>
@@ -11629,9 +11770,9 @@
       </w:tcPr>
     </w:tblStylePr>
   </w:style>
-  <w:style w:type="table" w:styleId="788">
+  <w:style w:type="table" w:styleId="865">
     <w:name w:val="Grid Table 5 Dark- Accent 4"/>
-    <w:basedOn w:val="894"/>
+    <w:basedOn w:val="971"/>
     <w:uiPriority w:val="99"/>
     <w:pPr>
       <w:pBdr/>
@@ -11857,9 +11998,9 @@
       </w:tcPr>
     </w:tblStylePr>
   </w:style>
-  <w:style w:type="table" w:styleId="789">
+  <w:style w:type="table" w:styleId="866">
     <w:name w:val="Grid Table 5 Dark - Accent 5"/>
-    <w:basedOn w:val="894"/>
+    <w:basedOn w:val="971"/>
     <w:uiPriority w:val="99"/>
     <w:pPr>
       <w:pBdr/>
@@ -12085,9 +12226,9 @@
       </w:tcPr>
     </w:tblStylePr>
   </w:style>
-  <w:style w:type="table" w:styleId="790">
+  <w:style w:type="table" w:styleId="867">
     <w:name w:val="Grid Table 5 Dark - Accent 6"/>
-    <w:basedOn w:val="894"/>
+    <w:basedOn w:val="971"/>
     <w:uiPriority w:val="99"/>
     <w:pPr>
       <w:pBdr/>
@@ -12313,9 +12454,9 @@
       </w:tcPr>
     </w:tblStylePr>
   </w:style>
-  <w:style w:type="table" w:styleId="791">
+  <w:style w:type="table" w:styleId="868">
     <w:name w:val="Grid Table 6 Colorful"/>
-    <w:basedOn w:val="894"/>
+    <w:basedOn w:val="971"/>
     <w:uiPriority w:val="99"/>
     <w:pPr>
       <w:pBdr/>
@@ -12543,9 +12684,9 @@
       </w:tcPr>
     </w:tblStylePr>
   </w:style>
-  <w:style w:type="table" w:styleId="792">
+  <w:style w:type="table" w:styleId="869">
     <w:name w:val="Grid Table 6 Colorful - Accent 1"/>
-    <w:basedOn w:val="894"/>
+    <w:basedOn w:val="971"/>
     <w:uiPriority w:val="99"/>
     <w:pPr>
       <w:pBdr/>
@@ -12773,9 +12914,9 @@
       </w:tcPr>
     </w:tblStylePr>
   </w:style>
-  <w:style w:type="table" w:styleId="793">
+  <w:style w:type="table" w:styleId="870">
     <w:name w:val="Grid Table 6 Colorful - Accent 2"/>
-    <w:basedOn w:val="894"/>
+    <w:basedOn w:val="971"/>
     <w:uiPriority w:val="99"/>
     <w:pPr>
       <w:pBdr/>
@@ -13003,9 +13144,9 @@
       </w:tcPr>
     </w:tblStylePr>
   </w:style>
-  <w:style w:type="table" w:styleId="794">
+  <w:style w:type="table" w:styleId="871">
     <w:name w:val="Grid Table 6 Colorful - Accent 3"/>
-    <w:basedOn w:val="894"/>
+    <w:basedOn w:val="971"/>
     <w:uiPriority w:val="99"/>
     <w:pPr>
       <w:pBdr/>
@@ -13233,9 +13374,9 @@
       </w:tcPr>
     </w:tblStylePr>
   </w:style>
-  <w:style w:type="table" w:styleId="795">
+  <w:style w:type="table" w:styleId="872">
     <w:name w:val="Grid Table 6 Colorful - Accent 4"/>
-    <w:basedOn w:val="894"/>
+    <w:basedOn w:val="971"/>
     <w:uiPriority w:val="99"/>
     <w:pPr>
       <w:pBdr/>
@@ -13463,9 +13604,9 @@
       </w:tcPr>
     </w:tblStylePr>
   </w:style>
-  <w:style w:type="table" w:styleId="796">
+  <w:style w:type="table" w:styleId="873">
     <w:name w:val="Grid Table 6 Colorful - Accent 5"/>
-    <w:basedOn w:val="894"/>
+    <w:basedOn w:val="971"/>
     <w:uiPriority w:val="99"/>
     <w:pPr>
       <w:pBdr/>
@@ -13693,9 +13834,9 @@
       </w:tcPr>
     </w:tblStylePr>
   </w:style>
-  <w:style w:type="table" w:styleId="797">
+  <w:style w:type="table" w:styleId="874">
     <w:name w:val="Grid Table 6 Colorful - Accent 6"/>
-    <w:basedOn w:val="894"/>
+    <w:basedOn w:val="971"/>
     <w:uiPriority w:val="99"/>
     <w:pPr>
       <w:pBdr/>
@@ -13923,9 +14064,9 @@
       </w:tcPr>
     </w:tblStylePr>
   </w:style>
-  <w:style w:type="table" w:styleId="798">
+  <w:style w:type="table" w:styleId="875">
     <w:name w:val="Grid Table 7 Colorful"/>
-    <w:basedOn w:val="894"/>
+    <w:basedOn w:val="971"/>
     <w:uiPriority w:val="99"/>
     <w:pPr>
       <w:pBdr/>
@@ -14177,9 +14318,9 @@
       </w:tcPr>
     </w:tblStylePr>
   </w:style>
-  <w:style w:type="table" w:styleId="799">
+  <w:style w:type="table" w:styleId="876">
     <w:name w:val="Grid Table 7 Colorful - Accent 1"/>
-    <w:basedOn w:val="894"/>
+    <w:basedOn w:val="971"/>
     <w:uiPriority w:val="99"/>
     <w:pPr>
       <w:pBdr/>
@@ -14431,9 +14572,9 @@
       </w:tcPr>
     </w:tblStylePr>
   </w:style>
-  <w:style w:type="table" w:styleId="800">
+  <w:style w:type="table" w:styleId="877">
     <w:name w:val="Grid Table 7 Colorful - Accent 2"/>
-    <w:basedOn w:val="894"/>
+    <w:basedOn w:val="971"/>
     <w:uiPriority w:val="99"/>
     <w:pPr>
       <w:pBdr/>
@@ -14685,9 +14826,9 @@
       </w:tcPr>
     </w:tblStylePr>
   </w:style>
-  <w:style w:type="table" w:styleId="801">
+  <w:style w:type="table" w:styleId="878">
     <w:name w:val="Grid Table 7 Colorful - Accent 3"/>
-    <w:basedOn w:val="894"/>
+    <w:basedOn w:val="971"/>
     <w:uiPriority w:val="99"/>
     <w:pPr>
       <w:pBdr/>
@@ -14939,9 +15080,9 @@
       </w:tcPr>
     </w:tblStylePr>
   </w:style>
-  <w:style w:type="table" w:styleId="802">
+  <w:style w:type="table" w:styleId="879">
     <w:name w:val="Grid Table 7 Colorful - Accent 4"/>
-    <w:basedOn w:val="894"/>
+    <w:basedOn w:val="971"/>
     <w:uiPriority w:val="99"/>
     <w:pPr>
       <w:pBdr/>
@@ -15193,9 +15334,9 @@
       </w:tcPr>
     </w:tblStylePr>
   </w:style>
-  <w:style w:type="table" w:styleId="803">
+  <w:style w:type="table" w:styleId="880">
     <w:name w:val="Grid Table 7 Colorful - Accent 5"/>
-    <w:basedOn w:val="894"/>
+    <w:basedOn w:val="971"/>
     <w:uiPriority w:val="99"/>
     <w:pPr>
       <w:pBdr/>
@@ -15447,9 +15588,9 @@
       </w:tcPr>
     </w:tblStylePr>
   </w:style>
-  <w:style w:type="table" w:styleId="804">
+  <w:style w:type="table" w:styleId="881">
     <w:name w:val="Grid Table 7 Colorful - Accent 6"/>
-    <w:basedOn w:val="894"/>
+    <w:basedOn w:val="971"/>
     <w:uiPriority w:val="99"/>
     <w:pPr>
       <w:pBdr/>
@@ -15701,9 +15842,9 @@
       </w:tcPr>
     </w:tblStylePr>
   </w:style>
-  <w:style w:type="table" w:styleId="805">
+  <w:style w:type="table" w:styleId="882">
     <w:name w:val="List Table 1 Light"/>
-    <w:basedOn w:val="894"/>
+    <w:basedOn w:val="971"/>
     <w:uiPriority w:val="99"/>
     <w:pPr>
       <w:pBdr/>
@@ -15917,9 +16058,9 @@
       </w:tcPr>
     </w:tblStylePr>
   </w:style>
-  <w:style w:type="table" w:styleId="806">
+  <w:style w:type="table" w:styleId="883">
     <w:name w:val="List Table 1 Light - Accent 1"/>
-    <w:basedOn w:val="894"/>
+    <w:basedOn w:val="971"/>
     <w:uiPriority w:val="99"/>
     <w:pPr>
       <w:pBdr/>
@@ -16133,9 +16274,9 @@
       </w:tcPr>
     </w:tblStylePr>
   </w:style>
-  <w:style w:type="table" w:styleId="807">
+  <w:style w:type="table" w:styleId="884">
     <w:name w:val="List Table 1 Light - Accent 2"/>
-    <w:basedOn w:val="894"/>
+    <w:basedOn w:val="971"/>
     <w:uiPriority w:val="99"/>
     <w:pPr>
       <w:pBdr/>
@@ -16349,9 +16490,9 @@
       </w:tcPr>
     </w:tblStylePr>
   </w:style>
-  <w:style w:type="table" w:styleId="808">
+  <w:style w:type="table" w:styleId="885">
     <w:name w:val="List Table 1 Light - Accent 3"/>
-    <w:basedOn w:val="894"/>
+    <w:basedOn w:val="971"/>
     <w:uiPriority w:val="99"/>
     <w:pPr>
       <w:pBdr/>
@@ -16565,9 +16706,9 @@
       </w:tcPr>
     </w:tblStylePr>
   </w:style>
-  <w:style w:type="table" w:styleId="809">
+  <w:style w:type="table" w:styleId="886">
     <w:name w:val="List Table 1 Light - Accent 4"/>
-    <w:basedOn w:val="894"/>
+    <w:basedOn w:val="971"/>
     <w:uiPriority w:val="99"/>
     <w:pPr>
       <w:pBdr/>
@@ -16781,9 +16922,9 @@
       </w:tcPr>
     </w:tblStylePr>
   </w:style>
-  <w:style w:type="table" w:styleId="810">
+  <w:style w:type="table" w:styleId="887">
     <w:name w:val="List Table 1 Light - Accent 5"/>
-    <w:basedOn w:val="894"/>
+    <w:basedOn w:val="971"/>
     <w:uiPriority w:val="99"/>
     <w:pPr>
       <w:pBdr/>
@@ -16997,9 +17138,9 @@
       </w:tcPr>
     </w:tblStylePr>
   </w:style>
-  <w:style w:type="table" w:styleId="811">
+  <w:style w:type="table" w:styleId="888">
     <w:name w:val="List Table 1 Light - Accent 6"/>
-    <w:basedOn w:val="894"/>
+    <w:basedOn w:val="971"/>
     <w:uiPriority w:val="99"/>
     <w:pPr>
       <w:pBdr/>
@@ -17213,9 +17354,9 @@
       </w:tcPr>
     </w:tblStylePr>
   </w:style>
-  <w:style w:type="table" w:styleId="812">
+  <w:style w:type="table" w:styleId="889">
     <w:name w:val="List Table 2"/>
-    <w:basedOn w:val="894"/>
+    <w:basedOn w:val="971"/>
     <w:uiPriority w:val="99"/>
     <w:pPr>
       <w:pBdr/>
@@ -17451,9 +17592,9 @@
       </w:tcPr>
     </w:tblStylePr>
   </w:style>
-  <w:style w:type="table" w:styleId="813">
+  <w:style w:type="table" w:styleId="890">
     <w:name w:val="List Table 2 - Accent 1"/>
-    <w:basedOn w:val="894"/>
+    <w:basedOn w:val="971"/>
     <w:uiPriority w:val="99"/>
     <w:pPr>
       <w:pBdr/>
@@ -17689,9 +17830,9 @@
       </w:tcPr>
     </w:tblStylePr>
   </w:style>
-  <w:style w:type="table" w:styleId="814">
+  <w:style w:type="table" w:styleId="891">
     <w:name w:val="List Table 2 - Accent 2"/>
-    <w:basedOn w:val="894"/>
+    <w:basedOn w:val="971"/>
     <w:uiPriority w:val="99"/>
     <w:pPr>
       <w:pBdr/>
@@ -17927,9 +18068,9 @@
       </w:tcPr>
     </w:tblStylePr>
   </w:style>
-  <w:style w:type="table" w:styleId="815">
+  <w:style w:type="table" w:styleId="892">
     <w:name w:val="List Table 2 - Accent 3"/>
-    <w:basedOn w:val="894"/>
+    <w:basedOn w:val="971"/>
     <w:uiPriority w:val="99"/>
     <w:pPr>
       <w:pBdr/>
@@ -18165,9 +18306,9 @@
       </w:tcPr>
     </w:tblStylePr>
   </w:style>
-  <w:style w:type="table" w:styleId="816">
+  <w:style w:type="table" w:styleId="893">
     <w:name w:val="List Table 2 - Accent 4"/>
-    <w:basedOn w:val="894"/>
+    <w:basedOn w:val="971"/>
     <w:uiPriority w:val="99"/>
     <w:pPr>
       <w:pBdr/>
@@ -18403,9 +18544,9 @@
       </w:tcPr>
     </w:tblStylePr>
   </w:style>
-  <w:style w:type="table" w:styleId="817">
+  <w:style w:type="table" w:styleId="894">
     <w:name w:val="List Table 2 - Accent 5"/>
-    <w:basedOn w:val="894"/>
+    <w:basedOn w:val="971"/>
     <w:uiPriority w:val="99"/>
     <w:pPr>
       <w:pBdr/>
@@ -18641,9 +18782,9 @@
       </w:tcPr>
     </w:tblStylePr>
   </w:style>
-  <w:style w:type="table" w:styleId="818">
+  <w:style w:type="table" w:styleId="895">
     <w:name w:val="List Table 2 - Accent 6"/>
-    <w:basedOn w:val="894"/>
+    <w:basedOn w:val="971"/>
     <w:uiPriority w:val="99"/>
     <w:pPr>
       <w:pBdr/>
@@ -18879,9 +19020,9 @@
       </w:tcPr>
     </w:tblStylePr>
   </w:style>
-  <w:style w:type="table" w:styleId="819">
+  <w:style w:type="table" w:styleId="896">
     <w:name w:val="List Table 3"/>
-    <w:basedOn w:val="894"/>
+    <w:basedOn w:val="971"/>
     <w:uiPriority w:val="99"/>
     <w:pPr>
       <w:pBdr/>
@@ -19107,9 +19248,9 @@
       </w:tcPr>
     </w:tblStylePr>
   </w:style>
-  <w:style w:type="table" w:styleId="820">
+  <w:style w:type="table" w:styleId="897">
     <w:name w:val="List Table 3 - Accent 1"/>
-    <w:basedOn w:val="894"/>
+    <w:basedOn w:val="971"/>
     <w:uiPriority w:val="99"/>
     <w:pPr>
       <w:pBdr/>
@@ -19335,9 +19476,9 @@
       </w:tcPr>
     </w:tblStylePr>
   </w:style>
-  <w:style w:type="table" w:styleId="821">
+  <w:style w:type="table" w:styleId="898">
     <w:name w:val="List Table 3 - Accent 2"/>
-    <w:basedOn w:val="894"/>
+    <w:basedOn w:val="971"/>
     <w:uiPriority w:val="99"/>
     <w:pPr>
       <w:pBdr/>
@@ -19563,9 +19704,9 @@
       </w:tcPr>
     </w:tblStylePr>
   </w:style>
-  <w:style w:type="table" w:styleId="822">
+  <w:style w:type="table" w:styleId="899">
     <w:name w:val="List Table 3 - Accent 3"/>
-    <w:basedOn w:val="894"/>
+    <w:basedOn w:val="971"/>
     <w:uiPriority w:val="99"/>
     <w:pPr>
       <w:pBdr/>
@@ -19791,9 +19932,9 @@
       </w:tcPr>
     </w:tblStylePr>
   </w:style>
-  <w:style w:type="table" w:styleId="823">
+  <w:style w:type="table" w:styleId="900">
     <w:name w:val="List Table 3 - Accent 4"/>
-    <w:basedOn w:val="894"/>
+    <w:basedOn w:val="971"/>
     <w:uiPriority w:val="99"/>
     <w:pPr>
       <w:pBdr/>
@@ -20019,9 +20160,9 @@
       </w:tcPr>
     </w:tblStylePr>
   </w:style>
-  <w:style w:type="table" w:styleId="824">
+  <w:style w:type="table" w:styleId="901">
     <w:name w:val="List Table 3 - Accent 5"/>
-    <w:basedOn w:val="894"/>
+    <w:basedOn w:val="971"/>
     <w:uiPriority w:val="99"/>
     <w:pPr>
       <w:pBdr/>
@@ -20247,9 +20388,9 @@
       </w:tcPr>
     </w:tblStylePr>
   </w:style>
-  <w:style w:type="table" w:styleId="825">
+  <w:style w:type="table" w:styleId="902">
     <w:name w:val="List Table 3 - Accent 6"/>
-    <w:basedOn w:val="894"/>
+    <w:basedOn w:val="971"/>
     <w:uiPriority w:val="99"/>
     <w:pPr>
       <w:pBdr/>
@@ -20475,9 +20616,9 @@
       </w:tcPr>
     </w:tblStylePr>
   </w:style>
-  <w:style w:type="table" w:styleId="826">
+  <w:style w:type="table" w:styleId="903">
     <w:name w:val="List Table 4"/>
-    <w:basedOn w:val="894"/>
+    <w:basedOn w:val="971"/>
     <w:uiPriority w:val="99"/>
     <w:pPr>
       <w:pBdr/>
@@ -20700,9 +20841,9 @@
       </w:tcPr>
     </w:tblStylePr>
   </w:style>
-  <w:style w:type="table" w:styleId="827">
+  <w:style w:type="table" w:styleId="904">
     <w:name w:val="List Table 4 - Accent 1"/>
-    <w:basedOn w:val="894"/>
+    <w:basedOn w:val="971"/>
     <w:uiPriority w:val="99"/>
     <w:pPr>
       <w:pBdr/>
@@ -20925,9 +21066,9 @@
       </w:tcPr>
     </w:tblStylePr>
   </w:style>
-  <w:style w:type="table" w:styleId="828">
+  <w:style w:type="table" w:styleId="905">
     <w:name w:val="List Table 4 - Accent 2"/>
-    <w:basedOn w:val="894"/>
+    <w:basedOn w:val="971"/>
     <w:uiPriority w:val="99"/>
     <w:pPr>
       <w:pBdr/>
@@ -21150,9 +21291,9 @@
       </w:tcPr>
     </w:tblStylePr>
   </w:style>
-  <w:style w:type="table" w:styleId="829">
+  <w:style w:type="table" w:styleId="906">
     <w:name w:val="List Table 4 - Accent 3"/>
-    <w:basedOn w:val="894"/>
+    <w:basedOn w:val="971"/>
     <w:uiPriority w:val="99"/>
     <w:pPr>
       <w:pBdr/>
@@ -21375,9 +21516,9 @@
       </w:tcPr>
     </w:tblStylePr>
   </w:style>
-  <w:style w:type="table" w:styleId="830">
+  <w:style w:type="table" w:styleId="907">
     <w:name w:val="List Table 4 - Accent 4"/>
-    <w:basedOn w:val="894"/>
+    <w:basedOn w:val="971"/>
     <w:uiPriority w:val="99"/>
     <w:pPr>
       <w:pBdr/>
@@ -21600,9 +21741,9 @@
       </w:tcPr>
     </w:tblStylePr>
   </w:style>
-  <w:style w:type="table" w:styleId="831">
+  <w:style w:type="table" w:styleId="908">
     <w:name w:val="List Table 4 - Accent 5"/>
-    <w:basedOn w:val="894"/>
+    <w:basedOn w:val="971"/>
     <w:uiPriority w:val="99"/>
     <w:pPr>
       <w:pBdr/>
@@ -21825,9 +21966,9 @@
       </w:tcPr>
     </w:tblStylePr>
   </w:style>
-  <w:style w:type="table" w:styleId="832">
+  <w:style w:type="table" w:styleId="909">
     <w:name w:val="List Table 4 - Accent 6"/>
-    <w:basedOn w:val="894"/>
+    <w:basedOn w:val="971"/>
     <w:uiPriority w:val="99"/>
     <w:pPr>
       <w:pBdr/>
@@ -22050,9 +22191,9 @@
       </w:tcPr>
     </w:tblStylePr>
   </w:style>
-  <w:style w:type="table" w:styleId="833">
+  <w:style w:type="table" w:styleId="910">
     <w:name w:val="List Table 5 Dark"/>
-    <w:basedOn w:val="894"/>
+    <w:basedOn w:val="971"/>
     <w:uiPriority w:val="99"/>
     <w:pPr>
       <w:pBdr/>
@@ -22292,9 +22433,9 @@
       </w:tcPr>
     </w:tblStylePr>
   </w:style>
-  <w:style w:type="table" w:styleId="834">
+  <w:style w:type="table" w:styleId="911">
     <w:name w:val="List Table 5 Dark - Accent 1"/>
-    <w:basedOn w:val="894"/>
+    <w:basedOn w:val="971"/>
     <w:uiPriority w:val="99"/>
     <w:pPr>
       <w:pBdr/>
@@ -22534,9 +22675,9 @@
       </w:tcPr>
     </w:tblStylePr>
   </w:style>
-  <w:style w:type="table" w:styleId="835">
+  <w:style w:type="table" w:styleId="912">
     <w:name w:val="List Table 5 Dark - Accent 2"/>
-    <w:basedOn w:val="894"/>
+    <w:basedOn w:val="971"/>
     <w:uiPriority w:val="99"/>
     <w:pPr>
       <w:pBdr/>
@@ -22776,9 +22917,9 @@
       </w:tcPr>
     </w:tblStylePr>
   </w:style>
-  <w:style w:type="table" w:styleId="836">
+  <w:style w:type="table" w:styleId="913">
     <w:name w:val="List Table 5 Dark - Accent 3"/>
-    <w:basedOn w:val="894"/>
+    <w:basedOn w:val="971"/>
     <w:uiPriority w:val="99"/>
     <w:pPr>
       <w:pBdr/>
@@ -23018,9 +23159,9 @@
       </w:tcPr>
     </w:tblStylePr>
   </w:style>
-  <w:style w:type="table" w:styleId="837">
+  <w:style w:type="table" w:styleId="914">
     <w:name w:val="List Table 5 Dark - Accent 4"/>
-    <w:basedOn w:val="894"/>
+    <w:basedOn w:val="971"/>
     <w:uiPriority w:val="99"/>
     <w:pPr>
       <w:pBdr/>
@@ -23260,9 +23401,9 @@
       </w:tcPr>
     </w:tblStylePr>
   </w:style>
-  <w:style w:type="table" w:styleId="838">
+  <w:style w:type="table" w:styleId="915">
     <w:name w:val="List Table 5 Dark - Accent 5"/>
-    <w:basedOn w:val="894"/>
+    <w:basedOn w:val="971"/>
     <w:uiPriority w:val="99"/>
     <w:pPr>
       <w:pBdr/>
@@ -23502,9 +23643,9 @@
       </w:tcPr>
     </w:tblStylePr>
   </w:style>
-  <w:style w:type="table" w:styleId="839">
+  <w:style w:type="table" w:styleId="916">
     <w:name w:val="List Table 5 Dark - Accent 6"/>
-    <w:basedOn w:val="894"/>
+    <w:basedOn w:val="971"/>
     <w:uiPriority w:val="99"/>
     <w:pPr>
       <w:pBdr/>
@@ -23744,9 +23885,9 @@
       </w:tcPr>
     </w:tblStylePr>
   </w:style>
-  <w:style w:type="table" w:styleId="840">
+  <w:style w:type="table" w:styleId="917">
     <w:name w:val="List Table 6 Colorful"/>
-    <w:basedOn w:val="894"/>
+    <w:basedOn w:val="971"/>
     <w:uiPriority w:val="99"/>
     <w:pPr>
       <w:pBdr/>
@@ -23967,9 +24108,9 @@
       </w:tcPr>
     </w:tblStylePr>
   </w:style>
-  <w:style w:type="table" w:styleId="841">
+  <w:style w:type="table" w:styleId="918">
     <w:name w:val="List Table 6 Colorful - Accent 1"/>
-    <w:basedOn w:val="894"/>
+    <w:basedOn w:val="971"/>
     <w:uiPriority w:val="99"/>
     <w:pPr>
       <w:pBdr/>
@@ -24190,9 +24331,9 @@
       </w:tcPr>
     </w:tblStylePr>
   </w:style>
-  <w:style w:type="table" w:styleId="842">
+  <w:style w:type="table" w:styleId="919">
     <w:name w:val="List Table 6 Colorful - Accent 2"/>
-    <w:basedOn w:val="894"/>
+    <w:basedOn w:val="971"/>
     <w:uiPriority w:val="99"/>
     <w:pPr>
       <w:pBdr/>
@@ -24413,9 +24554,9 @@
       </w:tcPr>
     </w:tblStylePr>
   </w:style>
-  <w:style w:type="table" w:styleId="843">
+  <w:style w:type="table" w:styleId="920">
     <w:name w:val="List Table 6 Colorful - Accent 3"/>
-    <w:basedOn w:val="894"/>
+    <w:basedOn w:val="971"/>
     <w:uiPriority w:val="99"/>
     <w:pPr>
       <w:pBdr/>
@@ -24636,9 +24777,9 @@
       </w:tcPr>
     </w:tblStylePr>
   </w:style>
-  <w:style w:type="table" w:styleId="844">
+  <w:style w:type="table" w:styleId="921">
     <w:name w:val="List Table 6 Colorful - Accent 4"/>
-    <w:basedOn w:val="894"/>
+    <w:basedOn w:val="971"/>
     <w:uiPriority w:val="99"/>
     <w:pPr>
       <w:pBdr/>
@@ -24859,9 +25000,9 @@
       </w:tcPr>
     </w:tblStylePr>
   </w:style>
-  <w:style w:type="table" w:styleId="845">
+  <w:style w:type="table" w:styleId="922">
     <w:name w:val="List Table 6 Colorful - Accent 5"/>
-    <w:basedOn w:val="894"/>
+    <w:basedOn w:val="971"/>
     <w:uiPriority w:val="99"/>
     <w:pPr>
       <w:pBdr/>
@@ -25082,9 +25223,9 @@
       </w:tcPr>
     </w:tblStylePr>
   </w:style>
-  <w:style w:type="table" w:styleId="846">
+  <w:style w:type="table" w:styleId="923">
     <w:name w:val="List Table 6 Colorful - Accent 6"/>
-    <w:basedOn w:val="894"/>
+    <w:basedOn w:val="971"/>
     <w:uiPriority w:val="99"/>
     <w:pPr>
       <w:pBdr/>
@@ -25305,9 +25446,9 @@
       </w:tcPr>
     </w:tblStylePr>
   </w:style>
-  <w:style w:type="table" w:styleId="847">
+  <w:style w:type="table" w:styleId="924">
     <w:name w:val="List Table 7 Colorful"/>
-    <w:basedOn w:val="894"/>
+    <w:basedOn w:val="971"/>
     <w:uiPriority w:val="99"/>
     <w:pPr>
       <w:pBdr/>
@@ -25561,9 +25702,9 @@
       </w:tcPr>
     </w:tblStylePr>
   </w:style>
-  <w:style w:type="table" w:styleId="848">
+  <w:style w:type="table" w:styleId="925">
     <w:name w:val="List Table 7 Colorful - Accent 1"/>
-    <w:basedOn w:val="894"/>
+    <w:basedOn w:val="971"/>
     <w:uiPriority w:val="99"/>
     <w:pPr>
       <w:pBdr/>
@@ -25817,9 +25958,9 @@
       </w:tcPr>
     </w:tblStylePr>
   </w:style>
-  <w:style w:type="table" w:styleId="849">
+  <w:style w:type="table" w:styleId="926">
     <w:name w:val="List Table 7 Colorful - Accent 2"/>
-    <w:basedOn w:val="894"/>
+    <w:basedOn w:val="971"/>
     <w:uiPriority w:val="99"/>
     <w:pPr>
       <w:pBdr/>
@@ -26073,9 +26214,9 @@
       </w:tcPr>
     </w:tblStylePr>
   </w:style>
-  <w:style w:type="table" w:styleId="850">
+  <w:style w:type="table" w:styleId="927">
     <w:name w:val="List Table 7 Colorful - Accent 3"/>
-    <w:basedOn w:val="894"/>
+    <w:basedOn w:val="971"/>
     <w:uiPriority w:val="99"/>
     <w:pPr>
       <w:pBdr/>
@@ -26329,9 +26470,9 @@
       </w:tcPr>
     </w:tblStylePr>
   </w:style>
-  <w:style w:type="table" w:styleId="851">
+  <w:style w:type="table" w:styleId="928">
     <w:name w:val="List Table 7 Colorful - Accent 4"/>
-    <w:basedOn w:val="894"/>
+    <w:basedOn w:val="971"/>
     <w:uiPriority w:val="99"/>
     <w:pPr>
       <w:pBdr/>
@@ -26585,9 +26726,9 @@
       </w:tcPr>
     </w:tblStylePr>
   </w:style>
-  <w:style w:type="table" w:styleId="852">
+  <w:style w:type="table" w:styleId="929">
     <w:name w:val="List Table 7 Colorful - Accent 5"/>
-    <w:basedOn w:val="894"/>
+    <w:basedOn w:val="971"/>
     <w:uiPriority w:val="99"/>
     <w:pPr>
       <w:pBdr/>
@@ -26841,9 +26982,9 @@
       </w:tcPr>
     </w:tblStylePr>
   </w:style>
-  <w:style w:type="table" w:styleId="853">
+  <w:style w:type="table" w:styleId="930">
     <w:name w:val="List Table 7 Colorful - Accent 6"/>
-    <w:basedOn w:val="894"/>
+    <w:basedOn w:val="971"/>
     <w:uiPriority w:val="99"/>
     <w:pPr>
       <w:pBdr/>
@@ -27097,9 +27238,9 @@
       </w:tcPr>
     </w:tblStylePr>
   </w:style>
-  <w:style w:type="table" w:styleId="854">
+  <w:style w:type="table" w:styleId="931">
     <w:name w:val="Lined - Accent"/>
-    <w:basedOn w:val="894"/>
+    <w:basedOn w:val="971"/>
     <w:uiPriority w:val="99"/>
     <w:pPr>
       <w:pBdr/>
@@ -27334,9 +27475,9 @@
       </w:tcPr>
     </w:tblStylePr>
   </w:style>
-  <w:style w:type="table" w:styleId="855">
+  <w:style w:type="table" w:styleId="932">
     <w:name w:val="Lined - Accent 1"/>
-    <w:basedOn w:val="894"/>
+    <w:basedOn w:val="971"/>
     <w:uiPriority w:val="99"/>
     <w:pPr>
       <w:pBdr/>
@@ -27571,9 +27712,9 @@
       </w:tcPr>
     </w:tblStylePr>
   </w:style>
-  <w:style w:type="table" w:styleId="856">
+  <w:style w:type="table" w:styleId="933">
     <w:name w:val="Lined - Accent 2"/>
-    <w:basedOn w:val="894"/>
+    <w:basedOn w:val="971"/>
     <w:uiPriority w:val="99"/>
     <w:pPr>
       <w:pBdr/>
@@ -27808,9 +27949,9 @@
       </w:tcPr>
     </w:tblStylePr>
   </w:style>
-  <w:style w:type="table" w:styleId="857">
+  <w:style w:type="table" w:styleId="934">
     <w:name w:val="Lined - Accent 3"/>
-    <w:basedOn w:val="894"/>
+    <w:basedOn w:val="971"/>
     <w:uiPriority w:val="99"/>
     <w:pPr>
       <w:pBdr/>
@@ -28045,9 +28186,9 @@
       </w:tcPr>
     </w:tblStylePr>
   </w:style>
-  <w:style w:type="table" w:styleId="858">
+  <w:style w:type="table" w:styleId="935">
     <w:name w:val="Lined - Accent 4"/>
-    <w:basedOn w:val="894"/>
+    <w:basedOn w:val="971"/>
     <w:uiPriority w:val="99"/>
     <w:pPr>
       <w:pBdr/>
@@ -28282,9 +28423,9 @@
       </w:tcPr>
     </w:tblStylePr>
   </w:style>
-  <w:style w:type="table" w:styleId="859">
+  <w:style w:type="table" w:styleId="936">
     <w:name w:val="Lined - Accent 5"/>
-    <w:basedOn w:val="894"/>
+    <w:basedOn w:val="971"/>
     <w:uiPriority w:val="99"/>
     <w:pPr>
       <w:pBdr/>
@@ -28519,9 +28660,9 @@
       </w:tcPr>
     </w:tblStylePr>
   </w:style>
-  <w:style w:type="table" w:styleId="860">
+  <w:style w:type="table" w:styleId="937">
     <w:name w:val="Lined - Accent 6"/>
-    <w:basedOn w:val="894"/>
+    <w:basedOn w:val="971"/>
     <w:uiPriority w:val="99"/>
     <w:pPr>
       <w:pBdr/>
@@ -28756,9 +28897,9 @@
       </w:tcPr>
     </w:tblStylePr>
   </w:style>
-  <w:style w:type="table" w:styleId="861">
+  <w:style w:type="table" w:styleId="938">
     <w:name w:val="Bordered &amp; Lined - Accent"/>
-    <w:basedOn w:val="894"/>
+    <w:basedOn w:val="971"/>
     <w:uiPriority w:val="99"/>
     <w:pPr>
       <w:pBdr/>
@@ -29000,9 +29141,9 @@
       </w:tcPr>
     </w:tblStylePr>
   </w:style>
-  <w:style w:type="table" w:styleId="862">
+  <w:style w:type="table" w:styleId="939">
     <w:name w:val="Bordered &amp; Lined - Accent 1"/>
-    <w:basedOn w:val="894"/>
+    <w:basedOn w:val="971"/>
     <w:uiPriority w:val="99"/>
     <w:pPr>
       <w:pBdr/>
@@ -29244,9 +29385,9 @@
       </w:tcPr>
     </w:tblStylePr>
   </w:style>
-  <w:style w:type="table" w:styleId="863">
+  <w:style w:type="table" w:styleId="940">
     <w:name w:val="Bordered &amp; Lined - Accent 2"/>
-    <w:basedOn w:val="894"/>
+    <w:basedOn w:val="971"/>
     <w:uiPriority w:val="99"/>
     <w:pPr>
       <w:pBdr/>
@@ -29488,9 +29629,9 @@
       </w:tcPr>
     </w:tblStylePr>
   </w:style>
-  <w:style w:type="table" w:styleId="864">
+  <w:style w:type="table" w:styleId="941">
     <w:name w:val="Bordered &amp; Lined - Accent 3"/>
-    <w:basedOn w:val="894"/>
+    <w:basedOn w:val="971"/>
     <w:uiPriority w:val="99"/>
     <w:pPr>
       <w:pBdr/>
@@ -29732,9 +29873,9 @@
       </w:tcPr>
     </w:tblStylePr>
   </w:style>
-  <w:style w:type="table" w:styleId="865">
+  <w:style w:type="table" w:styleId="942">
     <w:name w:val="Bordered &amp; Lined - Accent 4"/>
-    <w:basedOn w:val="894"/>
+    <w:basedOn w:val="971"/>
     <w:uiPriority w:val="99"/>
     <w:pPr>
       <w:pBdr/>
@@ -29976,9 +30117,9 @@
       </w:tcPr>
     </w:tblStylePr>
   </w:style>
-  <w:style w:type="table" w:styleId="866">
+  <w:style w:type="table" w:styleId="943">
     <w:name w:val="Bordered &amp; Lined - Accent 5"/>
-    <w:basedOn w:val="894"/>
+    <w:basedOn w:val="971"/>
     <w:uiPriority w:val="99"/>
     <w:pPr>
       <w:pBdr/>
@@ -30220,9 +30361,9 @@
       </w:tcPr>
     </w:tblStylePr>
   </w:style>
-  <w:style w:type="table" w:styleId="867">
+  <w:style w:type="table" w:styleId="944">
     <w:name w:val="Bordered &amp; Lined - Accent 6"/>
-    <w:basedOn w:val="894"/>
+    <w:basedOn w:val="971"/>
     <w:uiPriority w:val="99"/>
     <w:pPr>
       <w:pBdr/>
@@ -30464,9 +30605,9 @@
       </w:tcPr>
     </w:tblStylePr>
   </w:style>
-  <w:style w:type="table" w:styleId="868">
+  <w:style w:type="table" w:styleId="945">
     <w:name w:val="Bordered"/>
-    <w:basedOn w:val="894"/>
+    <w:basedOn w:val="971"/>
     <w:uiPriority w:val="99"/>
     <w:pPr>
       <w:pBdr/>
@@ -30695,9 +30836,9 @@
       </w:tcPr>
     </w:tblStylePr>
   </w:style>
-  <w:style w:type="table" w:styleId="869">
+  <w:style w:type="table" w:styleId="946">
     <w:name w:val="Bordered - Accent 1"/>
-    <w:basedOn w:val="894"/>
+    <w:basedOn w:val="971"/>
     <w:uiPriority w:val="99"/>
     <w:pPr>
       <w:pBdr/>
@@ -30926,9 +31067,9 @@
       </w:tcPr>
     </w:tblStylePr>
   </w:style>
-  <w:style w:type="table" w:styleId="870">
+  <w:style w:type="table" w:styleId="947">
     <w:name w:val="Bordered - Accent 2"/>
-    <w:basedOn w:val="894"/>
+    <w:basedOn w:val="971"/>
     <w:uiPriority w:val="99"/>
     <w:pPr>
       <w:pBdr/>
@@ -31157,9 +31298,9 @@
       </w:tcPr>
     </w:tblStylePr>
   </w:style>
-  <w:style w:type="table" w:styleId="871">
+  <w:style w:type="table" w:styleId="948">
     <w:name w:val="Bordered - Accent 3"/>
-    <w:basedOn w:val="894"/>
+    <w:basedOn w:val="971"/>
     <w:uiPriority w:val="99"/>
     <w:pPr>
       <w:pBdr/>
@@ -31388,9 +31529,9 @@
       </w:tcPr>
     </w:tblStylePr>
   </w:style>
-  <w:style w:type="table" w:styleId="872">
+  <w:style w:type="table" w:styleId="949">
     <w:name w:val="Bordered - Accent 4"/>
-    <w:basedOn w:val="894"/>
+    <w:basedOn w:val="971"/>
     <w:uiPriority w:val="99"/>
     <w:pPr>
       <w:pBdr/>
@@ -31619,9 +31760,9 @@
       </w:tcPr>
     </w:tblStylePr>
   </w:style>
-  <w:style w:type="table" w:styleId="873">
+  <w:style w:type="table" w:styleId="950">
     <w:name w:val="Bordered - Accent 5"/>
-    <w:basedOn w:val="894"/>
+    <w:basedOn w:val="971"/>
     <w:uiPriority w:val="99"/>
     <w:pPr>
       <w:pBdr/>
@@ -31850,9 +31991,9 @@
       </w:tcPr>
     </w:tblStylePr>
   </w:style>
-  <w:style w:type="table" w:styleId="874">
+  <w:style w:type="table" w:styleId="951">
     <w:name w:val="Bordered - Accent 6"/>
-    <w:basedOn w:val="894"/>
+    <w:basedOn w:val="971"/>
     <w:uiPriority w:val="99"/>
     <w:pPr>
       <w:pBdr/>
@@ -32081,7 +32222,7 @@
       </w:tcPr>
     </w:tblStylePr>
   </w:style>
-  <w:style w:type="character" w:styleId="875">
+  <w:style w:type="character" w:styleId="952">
     <w:name w:val="Hyperlink"/>
     <w:uiPriority w:val="99"/>
     <w:unhideWhenUsed/>
@@ -32095,10 +32236,10 @@
       <w:u w:val="single"/>
     </w:rPr>
   </w:style>
-  <w:style w:type="paragraph" w:styleId="876">
+  <w:style w:type="paragraph" w:styleId="953">
     <w:name w:val="footnote text"/>
-    <w:basedOn w:val="893"/>
-    <w:link w:val="877"/>
+    <w:basedOn w:val="970"/>
+    <w:link w:val="954"/>
     <w:uiPriority w:val="99"/>
     <w:semiHidden/>
     <w:unhideWhenUsed/>
@@ -32111,9 +32252,9 @@
       <w:sz w:val="18"/>
     </w:rPr>
   </w:style>
-  <w:style w:type="character" w:styleId="877">
+  <w:style w:type="character" w:styleId="954">
     <w:name w:val="Footnote Text Char"/>
-    <w:link w:val="876"/>
+    <w:link w:val="953"/>
     <w:uiPriority w:val="99"/>
     <w:pPr>
       <w:pBdr/>
@@ -32124,7 +32265,7 @@
       <w:sz w:val="18"/>
     </w:rPr>
   </w:style>
-  <w:style w:type="character" w:styleId="878">
+  <w:style w:type="character" w:styleId="955">
     <w:name w:val="footnote reference"/>
     <w:uiPriority w:val="99"/>
     <w:unhideWhenUsed/>
@@ -32137,10 +32278,10 @@
       <w:vertAlign w:val="superscript"/>
     </w:rPr>
   </w:style>
-  <w:style w:type="paragraph" w:styleId="879">
+  <w:style w:type="paragraph" w:styleId="956">
     <w:name w:val="endnote text"/>
-    <w:basedOn w:val="893"/>
-    <w:link w:val="880"/>
+    <w:basedOn w:val="970"/>
+    <w:link w:val="957"/>
     <w:uiPriority w:val="99"/>
     <w:semiHidden/>
     <w:unhideWhenUsed/>
@@ -32153,9 +32294,9 @@
       <w:sz w:val="20"/>
     </w:rPr>
   </w:style>
-  <w:style w:type="character" w:styleId="880">
+  <w:style w:type="character" w:styleId="957">
     <w:name w:val="Endnote Text Char"/>
-    <w:link w:val="879"/>
+    <w:link w:val="956"/>
     <w:uiPriority w:val="99"/>
     <w:pPr>
       <w:pBdr/>
@@ -32166,7 +32307,7 @@
       <w:sz w:val="20"/>
     </w:rPr>
   </w:style>
-  <w:style w:type="character" w:styleId="881">
+  <w:style w:type="character" w:styleId="958">
     <w:name w:val="endnote reference"/>
     <w:uiPriority w:val="99"/>
     <w:semiHidden/>
@@ -32180,10 +32321,10 @@
       <w:vertAlign w:val="superscript"/>
     </w:rPr>
   </w:style>
-  <w:style w:type="paragraph" w:styleId="882">
+  <w:style w:type="paragraph" w:styleId="959">
     <w:name w:val="toc 1"/>
-    <w:basedOn w:val="893"/>
-    <w:next w:val="893"/>
+    <w:basedOn w:val="970"/>
+    <w:next w:val="970"/>
     <w:uiPriority w:val="39"/>
     <w:unhideWhenUsed/>
     <w:pPr>
@@ -32192,10 +32333,10 @@
       <w:ind w:right="0" w:firstLine="0" w:left="0"/>
     </w:pPr>
   </w:style>
-  <w:style w:type="paragraph" w:styleId="883">
+  <w:style w:type="paragraph" w:styleId="960">
     <w:name w:val="toc 2"/>
-    <w:basedOn w:val="893"/>
-    <w:next w:val="893"/>
+    <w:basedOn w:val="970"/>
+    <w:next w:val="970"/>
     <w:uiPriority w:val="39"/>
     <w:unhideWhenUsed/>
     <w:pPr>
@@ -32204,10 +32345,10 @@
       <w:ind w:right="0" w:firstLine="0" w:left="283"/>
     </w:pPr>
   </w:style>
-  <w:style w:type="paragraph" w:styleId="884">
+  <w:style w:type="paragraph" w:styleId="961">
     <w:name w:val="toc 3"/>
-    <w:basedOn w:val="893"/>
-    <w:next w:val="893"/>
+    <w:basedOn w:val="970"/>
+    <w:next w:val="970"/>
     <w:uiPriority w:val="39"/>
     <w:unhideWhenUsed/>
     <w:pPr>
@@ -32216,10 +32357,10 @@
       <w:ind w:right="0" w:firstLine="0" w:left="567"/>
     </w:pPr>
   </w:style>
-  <w:style w:type="paragraph" w:styleId="885">
+  <w:style w:type="paragraph" w:styleId="962">
     <w:name w:val="toc 4"/>
-    <w:basedOn w:val="893"/>
-    <w:next w:val="893"/>
+    <w:basedOn w:val="970"/>
+    <w:next w:val="970"/>
     <w:uiPriority w:val="39"/>
     <w:unhideWhenUsed/>
     <w:pPr>
@@ -32228,10 +32369,10 @@
       <w:ind w:right="0" w:firstLine="0" w:left="850"/>
     </w:pPr>
   </w:style>
-  <w:style w:type="paragraph" w:styleId="886">
+  <w:style w:type="paragraph" w:styleId="963">
     <w:name w:val="toc 5"/>
-    <w:basedOn w:val="893"/>
-    <w:next w:val="893"/>
+    <w:basedOn w:val="970"/>
+    <w:next w:val="970"/>
     <w:uiPriority w:val="39"/>
     <w:unhideWhenUsed/>
     <w:pPr>
@@ -32240,10 +32381,10 @@
       <w:ind w:right="0" w:firstLine="0" w:left="1134"/>
     </w:pPr>
   </w:style>
-  <w:style w:type="paragraph" w:styleId="887">
+  <w:style w:type="paragraph" w:styleId="964">
     <w:name w:val="toc 6"/>
-    <w:basedOn w:val="893"/>
-    <w:next w:val="893"/>
+    <w:basedOn w:val="970"/>
+    <w:next w:val="970"/>
     <w:uiPriority w:val="39"/>
     <w:unhideWhenUsed/>
     <w:pPr>
@@ -32252,10 +32393,10 @@
       <w:ind w:right="0" w:firstLine="0" w:left="1417"/>
     </w:pPr>
   </w:style>
-  <w:style w:type="paragraph" w:styleId="888">
+  <w:style w:type="paragraph" w:styleId="965">
     <w:name w:val="toc 7"/>
-    <w:basedOn w:val="893"/>
-    <w:next w:val="893"/>
+    <w:basedOn w:val="970"/>
+    <w:next w:val="970"/>
     <w:uiPriority w:val="39"/>
     <w:unhideWhenUsed/>
     <w:pPr>
@@ -32264,10 +32405,10 @@
       <w:ind w:right="0" w:firstLine="0" w:left="1701"/>
     </w:pPr>
   </w:style>
-  <w:style w:type="paragraph" w:styleId="889">
+  <w:style w:type="paragraph" w:styleId="966">
     <w:name w:val="toc 8"/>
-    <w:basedOn w:val="893"/>
-    <w:next w:val="893"/>
+    <w:basedOn w:val="970"/>
+    <w:next w:val="970"/>
     <w:uiPriority w:val="39"/>
     <w:unhideWhenUsed/>
     <w:pPr>
@@ -32276,10 +32417,10 @@
       <w:ind w:right="0" w:firstLine="0" w:left="1984"/>
     </w:pPr>
   </w:style>
-  <w:style w:type="paragraph" w:styleId="890">
+  <w:style w:type="paragraph" w:styleId="967">
     <w:name w:val="toc 9"/>
-    <w:basedOn w:val="893"/>
-    <w:next w:val="893"/>
+    <w:basedOn w:val="970"/>
+    <w:next w:val="970"/>
     <w:uiPriority w:val="39"/>
     <w:unhideWhenUsed/>
     <w:pPr>
@@ -32288,7 +32429,7 @@
       <w:ind w:right="0" w:firstLine="0" w:left="2268"/>
     </w:pPr>
   </w:style>
-  <w:style w:type="paragraph" w:styleId="891">
+  <w:style w:type="paragraph" w:styleId="968">
     <w:name w:val="TOC Heading"/>
     <w:uiPriority w:val="39"/>
     <w:unhideWhenUsed/>
@@ -32298,10 +32439,10 @@
       <w:ind/>
     </w:pPr>
   </w:style>
-  <w:style w:type="paragraph" w:styleId="892">
+  <w:style w:type="paragraph" w:styleId="969">
     <w:name w:val="table of figures"/>
-    <w:basedOn w:val="893"/>
-    <w:next w:val="893"/>
+    <w:basedOn w:val="970"/>
+    <w:next w:val="970"/>
     <w:uiPriority w:val="99"/>
     <w:unhideWhenUsed/>
     <w:pPr>
@@ -32310,7 +32451,7 @@
       <w:ind/>
     </w:pPr>
   </w:style>
-  <w:style w:type="paragraph" w:styleId="893" w:default="1">
+  <w:style w:type="paragraph" w:styleId="970" w:default="1">
     <w:name w:val="Normal"/>
     <w:qFormat/>
     <w:pPr>
@@ -32319,7 +32460,7 @@
       <w:ind/>
     </w:pPr>
   </w:style>
-  <w:style w:type="table" w:styleId="894" w:default="1">
+  <w:style w:type="table" w:styleId="971" w:default="1">
     <w:name w:val="Normal Table"/>
     <w:uiPriority w:val="99"/>
     <w:semiHidden/>
@@ -32512,7 +32653,7 @@
       </w:tcPr>
     </w:tblStylePr>
   </w:style>
-  <w:style w:type="numbering" w:styleId="895" w:default="1">
+  <w:style w:type="numbering" w:styleId="972" w:default="1">
     <w:name w:val="No List"/>
     <w:uiPriority w:val="99"/>
     <w:semiHidden/>
@@ -32523,9 +32664,9 @@
       <w:ind/>
     </w:pPr>
   </w:style>
-  <w:style w:type="paragraph" w:styleId="896">
+  <w:style w:type="paragraph" w:styleId="973">
     <w:name w:val="No Spacing"/>
-    <w:basedOn w:val="893"/>
+    <w:basedOn w:val="970"/>
     <w:uiPriority w:val="1"/>
     <w:qFormat/>
     <w:pPr>
@@ -32534,9 +32675,9 @@
       <w:ind/>
     </w:pPr>
   </w:style>
-  <w:style w:type="paragraph" w:styleId="897">
+  <w:style w:type="paragraph" w:styleId="974">
     <w:name w:val="List Paragraph"/>
-    <w:basedOn w:val="893"/>
+    <w:basedOn w:val="970"/>
     <w:uiPriority w:val="34"/>
     <w:qFormat/>
     <w:pPr>
@@ -32546,7 +32687,7 @@
       <w:contextualSpacing w:val="true"/>
     </w:pPr>
   </w:style>
-  <w:style w:type="character" w:styleId="898" w:default="1">
+  <w:style w:type="character" w:styleId="975" w:default="1">
     <w:name w:val="Default Paragraph Font"/>
     <w:uiPriority w:val="1"/>
     <w:semiHidden/>

</xml_diff>